<commit_message>
fixed part-1 StringUtilTest and its report
</commit_message>
<xml_diff>
--- a/Assignment-1-part 1-Report.docx
+++ b/Assignment-1-part 1-Report.docx
@@ -399,12 +399,14 @@
           <w:rFonts w:asciiTheme="majorBidi" w:hAnsiTheme="majorBidi" w:cstheme="majorBidi"/>
         </w:rPr>
       </w:pPr>
+      <w:proofErr w:type="spellStart"/>
       <w:r>
         <w:rPr>
           <w:rFonts w:asciiTheme="majorBidi" w:hAnsiTheme="majorBidi" w:cstheme="majorBidi"/>
         </w:rPr>
         <w:t>StringUtil</w:t>
       </w:r>
+      <w:proofErr w:type="spellEnd"/>
     </w:p>
     <w:p>
       <w:pPr>
@@ -416,12 +418,14 @@
           <w:rFonts w:asciiTheme="majorBidi" w:hAnsiTheme="majorBidi" w:cstheme="majorBidi"/>
         </w:rPr>
       </w:pPr>
+      <w:proofErr w:type="spellStart"/>
       <w:r>
         <w:rPr>
           <w:rFonts w:asciiTheme="majorBidi" w:hAnsiTheme="majorBidi" w:cstheme="majorBidi"/>
         </w:rPr>
         <w:t>Multiset_HashMapImpl</w:t>
       </w:r>
+      <w:proofErr w:type="spellEnd"/>
     </w:p>
     <w:p>
       <w:pPr>
@@ -634,58 +638,48 @@
     </w:p>
     <w:p>
       <w:pPr>
-        <w:numPr>
-          <w:ilvl w:val="0"/>
-          <w:numId w:val="4"/>
-        </w:numPr>
-        <w:rPr>
-          <w:rFonts w:asciiTheme="majorBidi" w:hAnsiTheme="majorBidi" w:cstheme="majorBidi"/>
-        </w:rPr>
-      </w:pPr>
-      <w:r>
-        <w:rPr>
-          <w:rFonts w:asciiTheme="majorBidi" w:hAnsiTheme="majorBidi" w:cstheme="majorBidi"/>
-        </w:rPr>
-        <w:t>Branch coverage (if/else conditions)</w:t>
-      </w:r>
-    </w:p>
-    <w:p>
-      <w:pPr>
-        <w:numPr>
-          <w:ilvl w:val="0"/>
-          <w:numId w:val="4"/>
-        </w:numPr>
-        <w:rPr>
-          <w:rFonts w:asciiTheme="majorBidi" w:hAnsiTheme="majorBidi" w:cstheme="majorBidi"/>
-        </w:rPr>
-      </w:pPr>
-      <w:r>
-        <w:rPr>
-          <w:rFonts w:asciiTheme="majorBidi" w:hAnsiTheme="majorBidi" w:cstheme="majorBidi"/>
-        </w:rPr>
-        <w:t>Edge case coverage</w:t>
-      </w:r>
-    </w:p>
-    <w:p>
-      <w:pPr>
-        <w:numPr>
-          <w:ilvl w:val="0"/>
-          <w:numId w:val="4"/>
-        </w:numPr>
-        <w:rPr>
-          <w:rFonts w:asciiTheme="majorBidi" w:hAnsiTheme="majorBidi" w:cstheme="majorBidi"/>
-        </w:rPr>
-      </w:pPr>
-      <w:r>
-        <w:rPr>
-          <w:rFonts w:asciiTheme="majorBidi" w:hAnsiTheme="majorBidi" w:cstheme="majorBidi"/>
-        </w:rPr>
-        <w:t>Functional correctness</w:t>
+        <w:ind w:left="720"/>
+        <w:rPr>
+          <w:rFonts w:asciiTheme="majorBidi" w:hAnsiTheme="majorBidi" w:cstheme="majorBidi"/>
+        </w:rPr>
+      </w:pPr>
+      <w:r>
+        <w:rPr>
+          <w:rFonts w:asciiTheme="majorBidi" w:hAnsiTheme="majorBidi" w:cstheme="majorBidi"/>
+          <w:b/>
+          <w:bCs/>
+        </w:rPr>
+        <w:t>Primary coverage:</w:t>
+      </w:r>
+      <w:r>
+        <w:rPr>
+          <w:rFonts w:asciiTheme="majorBidi" w:hAnsiTheme="majorBidi" w:cstheme="majorBidi"/>
+        </w:rPr>
+        <w:t xml:space="preserve"> Each Choice</w:t>
+      </w:r>
+      <w:r>
+        <w:rPr>
+          <w:rFonts w:asciiTheme="majorBidi" w:hAnsiTheme="majorBidi" w:cstheme="majorBidi"/>
+        </w:rPr>
+        <w:br/>
+      </w:r>
+      <w:r>
+        <w:rPr>
+          <w:rFonts w:asciiTheme="majorBidi" w:hAnsiTheme="majorBidi" w:cstheme="majorBidi"/>
+          <w:b/>
+          <w:bCs/>
+        </w:rPr>
+        <w:t>Plus:</w:t>
+      </w:r>
+      <w:r>
+        <w:rPr>
+          <w:rFonts w:asciiTheme="majorBidi" w:hAnsiTheme="majorBidi" w:cstheme="majorBidi"/>
+        </w:rPr>
+        <w:t xml:space="preserve"> Boundary Value Analysis</w:t>
       </w:r>
     </w:p>
     <w:p/>
     <w:p/>
-    <w:p/>
     <w:p>
       <w:pPr>
         <w:jc w:val="center"/>
@@ -701,24 +695,61 @@
           <w:b/>
           <w:bCs/>
         </w:rPr>
-        <w:t>Part A: StringUtil Test</w:t>
-      </w:r>
-    </w:p>
-    <w:p>
-      <w:pPr>
-        <w:rPr>
-          <w:rFonts w:asciiTheme="majorBidi" w:hAnsiTheme="majorBidi" w:cstheme="majorBidi"/>
-          <w:b/>
-          <w:bCs/>
-        </w:rPr>
-      </w:pPr>
-      <w:r>
-        <w:rPr>
-          <w:rFonts w:asciiTheme="majorBidi" w:hAnsiTheme="majorBidi" w:cstheme="majorBidi"/>
-          <w:b/>
-          <w:bCs/>
-        </w:rPr>
-        <w:t>1. Method: repeat(String s, int n)</w:t>
+        <w:lastRenderedPageBreak/>
+        <w:t xml:space="preserve">Part A: </w:t>
+      </w:r>
+      <w:proofErr w:type="spellStart"/>
+      <w:r>
+        <w:rPr>
+          <w:rFonts w:asciiTheme="majorBidi" w:hAnsiTheme="majorBidi" w:cstheme="majorBidi"/>
+          <w:b/>
+          <w:bCs/>
+        </w:rPr>
+        <w:t>StringUtil</w:t>
+      </w:r>
+      <w:proofErr w:type="spellEnd"/>
+      <w:r>
+        <w:rPr>
+          <w:rFonts w:asciiTheme="majorBidi" w:hAnsiTheme="majorBidi" w:cstheme="majorBidi"/>
+          <w:b/>
+          <w:bCs/>
+        </w:rPr>
+        <w:t xml:space="preserve"> Test</w:t>
+      </w:r>
+    </w:p>
+    <w:p>
+      <w:pPr>
+        <w:rPr>
+          <w:rFonts w:asciiTheme="majorBidi" w:hAnsiTheme="majorBidi" w:cstheme="majorBidi"/>
+          <w:b/>
+          <w:bCs/>
+        </w:rPr>
+      </w:pPr>
+      <w:r>
+        <w:rPr>
+          <w:rFonts w:asciiTheme="majorBidi" w:hAnsiTheme="majorBidi" w:cstheme="majorBidi"/>
+          <w:b/>
+          <w:bCs/>
+        </w:rPr>
+        <w:t xml:space="preserve">1. Method: </w:t>
+      </w:r>
+      <w:proofErr w:type="gramStart"/>
+      <w:r>
+        <w:rPr>
+          <w:rFonts w:asciiTheme="majorBidi" w:hAnsiTheme="majorBidi" w:cstheme="majorBidi"/>
+          <w:b/>
+          <w:bCs/>
+        </w:rPr>
+        <w:t>repeat(</w:t>
+      </w:r>
+      <w:proofErr w:type="gramEnd"/>
+      <w:r>
+        <w:rPr>
+          <w:rFonts w:asciiTheme="majorBidi" w:hAnsiTheme="majorBidi" w:cstheme="majorBidi"/>
+          <w:b/>
+          <w:bCs/>
+        </w:rPr>
+        <w:t>String s, int n)</w:t>
       </w:r>
     </w:p>
     <w:p>
@@ -769,7 +800,19 @@
         <w:rPr>
           <w:rFonts w:asciiTheme="majorBidi" w:hAnsiTheme="majorBidi" w:cstheme="majorBidi"/>
         </w:rPr>
-        <w:t>n: n &lt;= 0, n = 1, n &gt; 1</w:t>
+        <w:t>n: n &lt; 0,</w:t>
+      </w:r>
+      <w:r>
+        <w:rPr>
+          <w:rFonts w:asciiTheme="majorBidi" w:hAnsiTheme="majorBidi" w:cstheme="majorBidi"/>
+        </w:rPr>
+        <w:t xml:space="preserve"> n = 0,</w:t>
+      </w:r>
+      <w:r>
+        <w:rPr>
+          <w:rFonts w:asciiTheme="majorBidi" w:hAnsiTheme="majorBidi" w:cstheme="majorBidi"/>
+        </w:rPr>
+        <w:t xml:space="preserve"> n = 1, n &gt; 1</w:t>
       </w:r>
     </w:p>
     <w:p>
@@ -805,15 +848,29 @@
         </w:rPr>
         <w:t>n = -1, 0, 1</w:t>
       </w:r>
-    </w:p>
-    <w:p>
-      <w:pPr>
-        <w:rPr>
-          <w:rFonts w:asciiTheme="majorBidi" w:hAnsiTheme="majorBidi" w:cstheme="majorBidi"/>
-          <w:b/>
-          <w:bCs/>
-        </w:rPr>
-      </w:pPr>
+      <w:r>
+        <w:rPr>
+          <w:rFonts w:asciiTheme="majorBidi" w:hAnsiTheme="majorBidi" w:cstheme="majorBidi"/>
+        </w:rPr>
+        <w:t>, 2</w:t>
+      </w:r>
+    </w:p>
+    <w:p>
+      <w:pPr>
+        <w:rPr>
+          <w:rFonts w:asciiTheme="majorBidi" w:hAnsiTheme="majorBidi" w:cstheme="majorBidi"/>
+          <w:b/>
+          <w:bCs/>
+        </w:rPr>
+      </w:pPr>
+      <w:r>
+        <w:rPr>
+          <w:rFonts w:asciiTheme="majorBidi" w:hAnsiTheme="majorBidi" w:cstheme="majorBidi"/>
+          <w:b/>
+          <w:bCs/>
+        </w:rPr>
+        <w:t xml:space="preserve">Each Choice: </w:t>
+      </w:r>
       <w:r>
         <w:rPr>
           <w:rFonts w:asciiTheme="majorBidi" w:hAnsiTheme="majorBidi" w:cstheme="majorBidi"/>
@@ -821,6 +878,50 @@
           <w:bCs/>
         </w:rPr>
         <w:t>Test Cases</w:t>
+      </w:r>
+      <w:r>
+        <w:rPr>
+          <w:rFonts w:asciiTheme="majorBidi" w:hAnsiTheme="majorBidi" w:cstheme="majorBidi"/>
+          <w:b/>
+          <w:bCs/>
+        </w:rPr>
+        <w:t xml:space="preserve"> </w:t>
+      </w:r>
+      <w:proofErr w:type="gramStart"/>
+      <w:r>
+        <w:rPr>
+          <w:rFonts w:asciiTheme="majorBidi" w:hAnsiTheme="majorBidi" w:cstheme="majorBidi"/>
+          <w:b/>
+          <w:bCs/>
+        </w:rPr>
+        <w:t>( 4</w:t>
+      </w:r>
+      <w:proofErr w:type="gramEnd"/>
+      <w:r>
+        <w:rPr>
+          <w:rFonts w:asciiTheme="majorBidi" w:hAnsiTheme="majorBidi" w:cstheme="majorBidi"/>
+          <w:b/>
+          <w:bCs/>
+        </w:rPr>
+        <w:t xml:space="preserve"> test + 2 </w:t>
+      </w:r>
+      <w:proofErr w:type="gramStart"/>
+      <w:r>
+        <w:rPr>
+          <w:rFonts w:asciiTheme="majorBidi" w:hAnsiTheme="majorBidi" w:cstheme="majorBidi"/>
+          <w:b/>
+          <w:bCs/>
+        </w:rPr>
+        <w:t>boundary</w:t>
+      </w:r>
+      <w:proofErr w:type="gramEnd"/>
+      <w:r>
+        <w:rPr>
+          <w:rFonts w:asciiTheme="majorBidi" w:hAnsiTheme="majorBidi" w:cstheme="majorBidi"/>
+          <w:b/>
+          <w:bCs/>
+        </w:rPr>
+        <w:t>)</w:t>
       </w:r>
     </w:p>
     <w:p>
@@ -878,7 +979,21 @@
         <w:rPr>
           <w:rFonts w:asciiTheme="majorBidi" w:hAnsiTheme="majorBidi" w:cstheme="majorBidi"/>
         </w:rPr>
-        <w:t>s = "abc", n = 0</w:t>
+        <w:t>s = "</w:t>
+      </w:r>
+      <w:proofErr w:type="spellStart"/>
+      <w:r>
+        <w:rPr>
+          <w:rFonts w:asciiTheme="majorBidi" w:hAnsiTheme="majorBidi" w:cstheme="majorBidi"/>
+        </w:rPr>
+        <w:t>abc</w:t>
+      </w:r>
+      <w:proofErr w:type="spellEnd"/>
+      <w:r>
+        <w:rPr>
+          <w:rFonts w:asciiTheme="majorBidi" w:hAnsiTheme="majorBidi" w:cstheme="majorBidi"/>
+        </w:rPr>
+        <w:t>", n = 0</w:t>
       </w:r>
       <w:r>
         <w:rPr>
@@ -891,6 +1006,12 @@
           <w:rFonts w:asciiTheme="majorBidi" w:hAnsiTheme="majorBidi" w:cstheme="majorBidi"/>
         </w:rPr>
         <w:t>null</w:t>
+      </w:r>
+      <w:r>
+        <w:rPr>
+          <w:rFonts w:asciiTheme="majorBidi" w:hAnsiTheme="majorBidi" w:cstheme="majorBidi"/>
+        </w:rPr>
+        <w:t xml:space="preserve"> (boundary)</w:t>
       </w:r>
     </w:p>
     <w:p>
@@ -913,7 +1034,21 @@
         <w:rPr>
           <w:rFonts w:asciiTheme="majorBidi" w:hAnsiTheme="majorBidi" w:cstheme="majorBidi"/>
         </w:rPr>
-        <w:t>s = "abc", n = -1</w:t>
+        <w:t>s = "</w:t>
+      </w:r>
+      <w:proofErr w:type="spellStart"/>
+      <w:r>
+        <w:rPr>
+          <w:rFonts w:asciiTheme="majorBidi" w:hAnsiTheme="majorBidi" w:cstheme="majorBidi"/>
+        </w:rPr>
+        <w:t>abc</w:t>
+      </w:r>
+      <w:proofErr w:type="spellEnd"/>
+      <w:r>
+        <w:rPr>
+          <w:rFonts w:asciiTheme="majorBidi" w:hAnsiTheme="majorBidi" w:cstheme="majorBidi"/>
+        </w:rPr>
+        <w:t>", n = -1</w:t>
       </w:r>
       <w:r>
         <w:rPr>
@@ -926,6 +1061,12 @@
           <w:rFonts w:asciiTheme="majorBidi" w:hAnsiTheme="majorBidi" w:cstheme="majorBidi"/>
         </w:rPr>
         <w:t xml:space="preserve"> null</w:t>
+      </w:r>
+      <w:r>
+        <w:rPr>
+          <w:rFonts w:asciiTheme="majorBidi" w:hAnsiTheme="majorBidi" w:cstheme="majorBidi"/>
+        </w:rPr>
+        <w:t xml:space="preserve"> (boundary)</w:t>
       </w:r>
     </w:p>
     <w:p>
@@ -1030,7 +1171,27 @@
         <w:rPr>
           <w:rFonts w:asciiTheme="majorBidi" w:hAnsiTheme="majorBidi" w:cstheme="majorBidi"/>
         </w:rPr>
-        <w:t>"ababab"</w:t>
+        <w:t>"</w:t>
+      </w:r>
+      <w:proofErr w:type="spellStart"/>
+      <w:r>
+        <w:rPr>
+          <w:rFonts w:asciiTheme="majorBidi" w:hAnsiTheme="majorBidi" w:cstheme="majorBidi"/>
+        </w:rPr>
+        <w:t>ababab</w:t>
+      </w:r>
+      <w:proofErr w:type="spellEnd"/>
+      <w:r>
+        <w:rPr>
+          <w:rFonts w:asciiTheme="majorBidi" w:hAnsiTheme="majorBidi" w:cstheme="majorBidi"/>
+        </w:rPr>
+        <w:t>"</w:t>
+      </w:r>
+      <w:r>
+        <w:rPr>
+          <w:rFonts w:asciiTheme="majorBidi" w:hAnsiTheme="majorBidi" w:cstheme="majorBidi"/>
+        </w:rPr>
+        <w:t xml:space="preserve"> (normal case)</w:t>
       </w:r>
     </w:p>
     <w:p>
@@ -1062,7 +1223,35 @@
           <w:b/>
           <w:bCs/>
         </w:rPr>
-        <w:t>2. Method: formatLeft(String s, String mask)</w:t>
+        <w:t xml:space="preserve">2. Method: </w:t>
+      </w:r>
+      <w:proofErr w:type="spellStart"/>
+      <w:proofErr w:type="gramStart"/>
+      <w:r>
+        <w:rPr>
+          <w:rFonts w:asciiTheme="majorBidi" w:hAnsiTheme="majorBidi" w:cstheme="majorBidi"/>
+          <w:b/>
+          <w:bCs/>
+        </w:rPr>
+        <w:t>formatLeft</w:t>
+      </w:r>
+      <w:proofErr w:type="spellEnd"/>
+      <w:r>
+        <w:rPr>
+          <w:rFonts w:asciiTheme="majorBidi" w:hAnsiTheme="majorBidi" w:cstheme="majorBidi"/>
+          <w:b/>
+          <w:bCs/>
+        </w:rPr>
+        <w:t>(</w:t>
+      </w:r>
+      <w:proofErr w:type="gramEnd"/>
+      <w:r>
+        <w:rPr>
+          <w:rFonts w:asciiTheme="majorBidi" w:hAnsiTheme="majorBidi" w:cstheme="majorBidi"/>
+          <w:b/>
+          <w:bCs/>
+        </w:rPr>
+        <w:t>String s, String mask)</w:t>
       </w:r>
     </w:p>
     <w:p>
@@ -1096,7 +1285,19 @@
         <w:rPr>
           <w:rFonts w:asciiTheme="majorBidi" w:hAnsiTheme="majorBidi" w:cstheme="majorBidi"/>
         </w:rPr>
-        <w:t>s: null, shorter, equal, longer</w:t>
+        <w:t>s: null,</w:t>
+      </w:r>
+      <w:r>
+        <w:rPr>
+          <w:rFonts w:asciiTheme="majorBidi" w:hAnsiTheme="majorBidi" w:cstheme="majorBidi"/>
+        </w:rPr>
+        <w:t xml:space="preserve"> empty,</w:t>
+      </w:r>
+      <w:r>
+        <w:rPr>
+          <w:rFonts w:asciiTheme="majorBidi" w:hAnsiTheme="majorBidi" w:cstheme="majorBidi"/>
+        </w:rPr>
+        <w:t xml:space="preserve"> shorter, equal, longer</w:t>
       </w:r>
     </w:p>
     <w:p>
@@ -1113,7 +1314,13 @@
         <w:rPr>
           <w:rFonts w:asciiTheme="majorBidi" w:hAnsiTheme="majorBidi" w:cstheme="majorBidi"/>
         </w:rPr>
-        <w:t>mask: null, empty, normal</w:t>
+        <w:t xml:space="preserve">mask: null, empty, </w:t>
+      </w:r>
+      <w:r>
+        <w:rPr>
+          <w:rFonts w:asciiTheme="majorBidi" w:hAnsiTheme="majorBidi" w:cstheme="majorBidi"/>
+        </w:rPr>
+        <w:t>longer, equal, shorter</w:t>
       </w:r>
     </w:p>
     <w:p>
@@ -1143,12 +1350,32 @@
           <w:rFonts w:asciiTheme="majorBidi" w:hAnsiTheme="majorBidi" w:cstheme="majorBidi"/>
         </w:rPr>
       </w:pPr>
-      <w:r>
-        <w:rPr>
-          <w:rFonts w:asciiTheme="majorBidi" w:hAnsiTheme="majorBidi" w:cstheme="majorBidi"/>
-        </w:rPr>
-        <w:t>s.length = mask.length</w:t>
-      </w:r>
+      <w:proofErr w:type="spellStart"/>
+      <w:proofErr w:type="gramStart"/>
+      <w:r>
+        <w:rPr>
+          <w:rFonts w:asciiTheme="majorBidi" w:hAnsiTheme="majorBidi" w:cstheme="majorBidi"/>
+        </w:rPr>
+        <w:t>s.length</w:t>
+      </w:r>
+      <w:proofErr w:type="spellEnd"/>
+      <w:proofErr w:type="gramEnd"/>
+      <w:r>
+        <w:rPr>
+          <w:rFonts w:asciiTheme="majorBidi" w:hAnsiTheme="majorBidi" w:cstheme="majorBidi"/>
+        </w:rPr>
+        <w:t xml:space="preserve"> = </w:t>
+      </w:r>
+      <w:proofErr w:type="spellStart"/>
+      <w:proofErr w:type="gramStart"/>
+      <w:r>
+        <w:rPr>
+          <w:rFonts w:asciiTheme="majorBidi" w:hAnsiTheme="majorBidi" w:cstheme="majorBidi"/>
+        </w:rPr>
+        <w:t>mask.length</w:t>
+      </w:r>
+      <w:proofErr w:type="spellEnd"/>
+      <w:proofErr w:type="gramEnd"/>
     </w:p>
     <w:p>
       <w:pPr>
@@ -1160,28 +1387,96 @@
           <w:rFonts w:asciiTheme="majorBidi" w:hAnsiTheme="majorBidi" w:cstheme="majorBidi"/>
         </w:rPr>
       </w:pPr>
-      <w:r>
-        <w:rPr>
-          <w:rFonts w:asciiTheme="majorBidi" w:hAnsiTheme="majorBidi" w:cstheme="majorBidi"/>
-        </w:rPr>
-        <w:t>s.length = mask.length ± 1</w:t>
-      </w:r>
-    </w:p>
-    <w:p>
-      <w:pPr>
-        <w:rPr>
-          <w:rFonts w:asciiTheme="majorBidi" w:hAnsiTheme="majorBidi" w:cstheme="majorBidi"/>
-          <w:b/>
-          <w:bCs/>
-        </w:rPr>
-      </w:pPr>
-      <w:r>
-        <w:rPr>
-          <w:rFonts w:asciiTheme="majorBidi" w:hAnsiTheme="majorBidi" w:cstheme="majorBidi"/>
-          <w:b/>
-          <w:bCs/>
-        </w:rPr>
-        <w:t>Test Cases</w:t>
+      <w:proofErr w:type="spellStart"/>
+      <w:proofErr w:type="gramStart"/>
+      <w:r>
+        <w:rPr>
+          <w:rFonts w:asciiTheme="majorBidi" w:hAnsiTheme="majorBidi" w:cstheme="majorBidi"/>
+        </w:rPr>
+        <w:t>s.length</w:t>
+      </w:r>
+      <w:proofErr w:type="spellEnd"/>
+      <w:proofErr w:type="gramEnd"/>
+      <w:r>
+        <w:rPr>
+          <w:rFonts w:asciiTheme="majorBidi" w:hAnsiTheme="majorBidi" w:cstheme="majorBidi"/>
+        </w:rPr>
+        <w:t xml:space="preserve"> = </w:t>
+      </w:r>
+      <w:proofErr w:type="spellStart"/>
+      <w:proofErr w:type="gramStart"/>
+      <w:r>
+        <w:rPr>
+          <w:rFonts w:asciiTheme="majorBidi" w:hAnsiTheme="majorBidi" w:cstheme="majorBidi"/>
+        </w:rPr>
+        <w:t>mask.length</w:t>
+      </w:r>
+      <w:proofErr w:type="spellEnd"/>
+      <w:proofErr w:type="gramEnd"/>
+      <w:r>
+        <w:rPr>
+          <w:rFonts w:asciiTheme="majorBidi" w:hAnsiTheme="majorBidi" w:cstheme="majorBidi"/>
+        </w:rPr>
+        <w:t xml:space="preserve"> ± 1</w:t>
+      </w:r>
+    </w:p>
+    <w:p>
+      <w:pPr>
+        <w:rPr>
+          <w:rFonts w:asciiTheme="majorBidi" w:hAnsiTheme="majorBidi" w:cstheme="majorBidi"/>
+          <w:b/>
+          <w:bCs/>
+        </w:rPr>
+      </w:pPr>
+      <w:r>
+        <w:rPr>
+          <w:rFonts w:asciiTheme="majorBidi" w:hAnsiTheme="majorBidi" w:cstheme="majorBidi"/>
+          <w:b/>
+          <w:bCs/>
+        </w:rPr>
+        <w:t xml:space="preserve">Each Choice: Test Cases </w:t>
+      </w:r>
+      <w:proofErr w:type="gramStart"/>
+      <w:r>
+        <w:rPr>
+          <w:rFonts w:asciiTheme="majorBidi" w:hAnsiTheme="majorBidi" w:cstheme="majorBidi"/>
+          <w:b/>
+          <w:bCs/>
+        </w:rPr>
+        <w:t xml:space="preserve">( </w:t>
+      </w:r>
+      <w:r>
+        <w:rPr>
+          <w:rFonts w:asciiTheme="majorBidi" w:hAnsiTheme="majorBidi" w:cstheme="majorBidi"/>
+          <w:b/>
+          <w:bCs/>
+        </w:rPr>
+        <w:t>5</w:t>
+      </w:r>
+      <w:proofErr w:type="gramEnd"/>
+      <w:r>
+        <w:rPr>
+          <w:rFonts w:asciiTheme="majorBidi" w:hAnsiTheme="majorBidi" w:cstheme="majorBidi"/>
+          <w:b/>
+          <w:bCs/>
+        </w:rPr>
+        <w:t xml:space="preserve"> test + </w:t>
+      </w:r>
+      <w:r>
+        <w:rPr>
+          <w:rFonts w:asciiTheme="majorBidi" w:hAnsiTheme="majorBidi" w:cstheme="majorBidi"/>
+          <w:b/>
+          <w:bCs/>
+        </w:rPr>
+        <w:t>3</w:t>
+      </w:r>
+      <w:r>
+        <w:rPr>
+          <w:rFonts w:asciiTheme="majorBidi" w:hAnsiTheme="majorBidi" w:cstheme="majorBidi"/>
+          <w:b/>
+          <w:bCs/>
+        </w:rPr>
+        <w:t xml:space="preserve"> boundary)</w:t>
       </w:r>
     </w:p>
     <w:p>
@@ -1227,7 +1522,21 @@
         <w:rPr>
           <w:rFonts w:asciiTheme="majorBidi" w:hAnsiTheme="majorBidi" w:cstheme="majorBidi"/>
         </w:rPr>
-        <w:t>s = "abc", mask = null</w:t>
+        <w:t>s = "</w:t>
+      </w:r>
+      <w:proofErr w:type="spellStart"/>
+      <w:r>
+        <w:rPr>
+          <w:rFonts w:asciiTheme="majorBidi" w:hAnsiTheme="majorBidi" w:cstheme="majorBidi"/>
+        </w:rPr>
+        <w:t>abc</w:t>
+      </w:r>
+      <w:proofErr w:type="spellEnd"/>
+      <w:r>
+        <w:rPr>
+          <w:rFonts w:asciiTheme="majorBidi" w:hAnsiTheme="majorBidi" w:cstheme="majorBidi"/>
+        </w:rPr>
+        <w:t>", mask = null</w:t>
       </w:r>
       <w:r>
         <w:rPr>
@@ -1239,7 +1548,21 @@
         <w:rPr>
           <w:rFonts w:asciiTheme="majorBidi" w:hAnsiTheme="majorBidi" w:cstheme="majorBidi"/>
         </w:rPr>
-        <w:t xml:space="preserve"> "abc"</w:t>
+        <w:t xml:space="preserve"> "</w:t>
+      </w:r>
+      <w:proofErr w:type="spellStart"/>
+      <w:r>
+        <w:rPr>
+          <w:rFonts w:asciiTheme="majorBidi" w:hAnsiTheme="majorBidi" w:cstheme="majorBidi"/>
+        </w:rPr>
+        <w:t>abc</w:t>
+      </w:r>
+      <w:proofErr w:type="spellEnd"/>
+      <w:r>
+        <w:rPr>
+          <w:rFonts w:asciiTheme="majorBidi" w:hAnsiTheme="majorBidi" w:cstheme="majorBidi"/>
+        </w:rPr>
+        <w:t>"</w:t>
       </w:r>
     </w:p>
     <w:p>
@@ -1256,8 +1579,21 @@
         <w:rPr>
           <w:rFonts w:asciiTheme="majorBidi" w:hAnsiTheme="majorBidi" w:cstheme="majorBidi"/>
         </w:rPr>
-        <w:lastRenderedPageBreak/>
-        <w:t>s = "abc", mask = "123456"</w:t>
+        <w:t>s = "</w:t>
+      </w:r>
+      <w:proofErr w:type="spellStart"/>
+      <w:r>
+        <w:rPr>
+          <w:rFonts w:asciiTheme="majorBidi" w:hAnsiTheme="majorBidi" w:cstheme="majorBidi"/>
+        </w:rPr>
+        <w:t>abc</w:t>
+      </w:r>
+      <w:proofErr w:type="spellEnd"/>
+      <w:r>
+        <w:rPr>
+          <w:rFonts w:asciiTheme="majorBidi" w:hAnsiTheme="majorBidi" w:cstheme="majorBidi"/>
+        </w:rPr>
+        <w:t>", mask = "123456"</w:t>
       </w:r>
       <w:r>
         <w:rPr>
@@ -1286,7 +1622,21 @@
         <w:rPr>
           <w:rFonts w:asciiTheme="majorBidi" w:hAnsiTheme="majorBidi" w:cstheme="majorBidi"/>
         </w:rPr>
-        <w:t>s = "abcdef", mask = "123"</w:t>
+        <w:t>s = "</w:t>
+      </w:r>
+      <w:proofErr w:type="spellStart"/>
+      <w:r>
+        <w:rPr>
+          <w:rFonts w:asciiTheme="majorBidi" w:hAnsiTheme="majorBidi" w:cstheme="majorBidi"/>
+        </w:rPr>
+        <w:t>abcdef</w:t>
+      </w:r>
+      <w:proofErr w:type="spellEnd"/>
+      <w:r>
+        <w:rPr>
+          <w:rFonts w:asciiTheme="majorBidi" w:hAnsiTheme="majorBidi" w:cstheme="majorBidi"/>
+        </w:rPr>
+        <w:t>", mask = "123"</w:t>
       </w:r>
       <w:r>
         <w:rPr>
@@ -1298,7 +1648,21 @@
         <w:rPr>
           <w:rFonts w:asciiTheme="majorBidi" w:hAnsiTheme="majorBidi" w:cstheme="majorBidi"/>
         </w:rPr>
-        <w:t xml:space="preserve"> "abcdef"</w:t>
+        <w:t xml:space="preserve"> "</w:t>
+      </w:r>
+      <w:proofErr w:type="spellStart"/>
+      <w:r>
+        <w:rPr>
+          <w:rFonts w:asciiTheme="majorBidi" w:hAnsiTheme="majorBidi" w:cstheme="majorBidi"/>
+        </w:rPr>
+        <w:t>abcdef</w:t>
+      </w:r>
+      <w:proofErr w:type="spellEnd"/>
+      <w:r>
+        <w:rPr>
+          <w:rFonts w:asciiTheme="majorBidi" w:hAnsiTheme="majorBidi" w:cstheme="majorBidi"/>
+        </w:rPr>
+        <w:t>"</w:t>
       </w:r>
     </w:p>
     <w:p>
@@ -1315,6 +1679,7 @@
         <w:rPr>
           <w:rFonts w:asciiTheme="majorBidi" w:hAnsiTheme="majorBidi" w:cstheme="majorBidi"/>
         </w:rPr>
+        <w:lastRenderedPageBreak/>
         <w:t>s = "", mask = "123"</w:t>
       </w:r>
       <w:r>
@@ -1328,6 +1693,193 @@
           <w:rFonts w:asciiTheme="majorBidi" w:hAnsiTheme="majorBidi" w:cstheme="majorBidi"/>
         </w:rPr>
         <w:t xml:space="preserve"> "123"</w:t>
+      </w:r>
+    </w:p>
+    <w:p>
+      <w:pPr>
+        <w:numPr>
+          <w:ilvl w:val="0"/>
+          <w:numId w:val="10"/>
+        </w:numPr>
+        <w:rPr>
+          <w:rFonts w:asciiTheme="majorBidi" w:hAnsiTheme="majorBidi" w:cstheme="majorBidi"/>
+        </w:rPr>
+      </w:pPr>
+      <w:r>
+        <w:rPr>
+          <w:rFonts w:asciiTheme="majorBidi" w:hAnsiTheme="majorBidi" w:cstheme="majorBidi"/>
+        </w:rPr>
+        <w:t>s = "</w:t>
+      </w:r>
+      <w:proofErr w:type="spellStart"/>
+      <w:r>
+        <w:rPr>
+          <w:rFonts w:asciiTheme="majorBidi" w:hAnsiTheme="majorBidi" w:cstheme="majorBidi"/>
+        </w:rPr>
+        <w:t>abc</w:t>
+      </w:r>
+      <w:proofErr w:type="spellEnd"/>
+      <w:r>
+        <w:rPr>
+          <w:rFonts w:asciiTheme="majorBidi" w:hAnsiTheme="majorBidi" w:cstheme="majorBidi"/>
+        </w:rPr>
+        <w:t>", mask = "123"</w:t>
+      </w:r>
+      <w:r>
+        <w:rPr>
+          <w:rFonts w:asciiTheme="majorBidi" w:hAnsiTheme="majorBidi" w:cstheme="majorBidi"/>
+        </w:rPr>
+        <w:t>, return:</w:t>
+      </w:r>
+      <w:r>
+        <w:rPr>
+          <w:rFonts w:asciiTheme="majorBidi" w:hAnsiTheme="majorBidi" w:cstheme="majorBidi"/>
+        </w:rPr>
+        <w:t xml:space="preserve"> "</w:t>
+      </w:r>
+      <w:proofErr w:type="spellStart"/>
+      <w:r>
+        <w:rPr>
+          <w:rFonts w:asciiTheme="majorBidi" w:hAnsiTheme="majorBidi" w:cstheme="majorBidi"/>
+        </w:rPr>
+        <w:t>abc</w:t>
+      </w:r>
+      <w:proofErr w:type="spellEnd"/>
+      <w:r>
+        <w:rPr>
+          <w:rFonts w:asciiTheme="majorBidi" w:hAnsiTheme="majorBidi" w:cstheme="majorBidi"/>
+        </w:rPr>
+        <w:t>"</w:t>
+      </w:r>
+      <w:r>
+        <w:rPr>
+          <w:rFonts w:asciiTheme="majorBidi" w:hAnsiTheme="majorBidi" w:cstheme="majorBidi"/>
+        </w:rPr>
+        <w:t xml:space="preserve"> (boundary)</w:t>
+      </w:r>
+    </w:p>
+    <w:p>
+      <w:pPr>
+        <w:numPr>
+          <w:ilvl w:val="0"/>
+          <w:numId w:val="10"/>
+        </w:numPr>
+        <w:rPr>
+          <w:rFonts w:asciiTheme="majorBidi" w:hAnsiTheme="majorBidi" w:cstheme="majorBidi"/>
+        </w:rPr>
+      </w:pPr>
+      <w:r>
+        <w:rPr>
+          <w:rFonts w:asciiTheme="majorBidi" w:hAnsiTheme="majorBidi" w:cstheme="majorBidi"/>
+        </w:rPr>
+        <w:t>s = "</w:t>
+      </w:r>
+      <w:r>
+        <w:rPr>
+          <w:rFonts w:asciiTheme="majorBidi" w:hAnsiTheme="majorBidi" w:cstheme="majorBidi"/>
+        </w:rPr>
+        <w:t>a</w:t>
+      </w:r>
+      <w:r>
+        <w:rPr>
+          <w:rFonts w:asciiTheme="majorBidi" w:hAnsiTheme="majorBidi" w:cstheme="majorBidi"/>
+        </w:rPr>
+        <w:t>", mask = "12"</w:t>
+      </w:r>
+      <w:r>
+        <w:rPr>
+          <w:rFonts w:asciiTheme="majorBidi" w:hAnsiTheme="majorBidi" w:cstheme="majorBidi"/>
+        </w:rPr>
+        <w:t>, return:</w:t>
+      </w:r>
+      <w:r>
+        <w:rPr>
+          <w:rFonts w:asciiTheme="majorBidi" w:hAnsiTheme="majorBidi" w:cstheme="majorBidi"/>
+        </w:rPr>
+        <w:t xml:space="preserve"> "</w:t>
+      </w:r>
+      <w:r>
+        <w:rPr>
+          <w:rFonts w:asciiTheme="majorBidi" w:hAnsiTheme="majorBidi" w:cstheme="majorBidi"/>
+        </w:rPr>
+        <w:t>a</w:t>
+      </w:r>
+      <w:r>
+        <w:rPr>
+          <w:rFonts w:asciiTheme="majorBidi" w:hAnsiTheme="majorBidi" w:cstheme="majorBidi"/>
+        </w:rPr>
+        <w:t>2</w:t>
+      </w:r>
+      <w:r>
+        <w:rPr>
+          <w:rFonts w:asciiTheme="majorBidi" w:hAnsiTheme="majorBidi" w:cstheme="majorBidi"/>
+        </w:rPr>
+        <w:t>"</w:t>
+      </w:r>
+      <w:r>
+        <w:rPr>
+          <w:rFonts w:asciiTheme="majorBidi" w:hAnsiTheme="majorBidi" w:cstheme="majorBidi"/>
+        </w:rPr>
+        <w:t xml:space="preserve"> (boundary)</w:t>
+      </w:r>
+    </w:p>
+    <w:p>
+      <w:pPr>
+        <w:numPr>
+          <w:ilvl w:val="0"/>
+          <w:numId w:val="10"/>
+        </w:numPr>
+        <w:rPr>
+          <w:rFonts w:asciiTheme="majorBidi" w:hAnsiTheme="majorBidi" w:cstheme="majorBidi"/>
+        </w:rPr>
+      </w:pPr>
+      <w:r>
+        <w:rPr>
+          <w:rFonts w:asciiTheme="majorBidi" w:hAnsiTheme="majorBidi" w:cstheme="majorBidi"/>
+        </w:rPr>
+        <w:t>s = "</w:t>
+      </w:r>
+      <w:r>
+        <w:rPr>
+          <w:rFonts w:asciiTheme="majorBidi" w:hAnsiTheme="majorBidi" w:cstheme="majorBidi"/>
+        </w:rPr>
+        <w:t>ab</w:t>
+      </w:r>
+      <w:r>
+        <w:rPr>
+          <w:rFonts w:asciiTheme="majorBidi" w:hAnsiTheme="majorBidi" w:cstheme="majorBidi"/>
+        </w:rPr>
+        <w:t>", mask = "1"</w:t>
+      </w:r>
+      <w:r>
+        <w:rPr>
+          <w:rFonts w:asciiTheme="majorBidi" w:hAnsiTheme="majorBidi" w:cstheme="majorBidi"/>
+        </w:rPr>
+        <w:t>, return:</w:t>
+      </w:r>
+      <w:r>
+        <w:rPr>
+          <w:rFonts w:asciiTheme="majorBidi" w:hAnsiTheme="majorBidi" w:cstheme="majorBidi"/>
+        </w:rPr>
+        <w:t xml:space="preserve"> "</w:t>
+      </w:r>
+      <w:r>
+        <w:rPr>
+          <w:rFonts w:asciiTheme="majorBidi" w:hAnsiTheme="majorBidi" w:cstheme="majorBidi"/>
+        </w:rPr>
+        <w:t>ab</w:t>
+      </w:r>
+      <w:r>
+        <w:rPr>
+          <w:rFonts w:asciiTheme="majorBidi" w:hAnsiTheme="majorBidi" w:cstheme="majorBidi"/>
+        </w:rPr>
+        <w:t>"</w:t>
+      </w:r>
+      <w:r>
+        <w:rPr>
+          <w:rFonts w:asciiTheme="majorBidi" w:hAnsiTheme="majorBidi" w:cstheme="majorBidi"/>
+        </w:rPr>
+        <w:t xml:space="preserve"> (boundary)</w:t>
       </w:r>
     </w:p>
     <w:p>
@@ -1359,20 +1911,62 @@
           <w:b/>
           <w:bCs/>
         </w:rPr>
-        <w:t>3. Method: formatRight(String s, String mask)</w:t>
-      </w:r>
-    </w:p>
-    <w:p>
-      <w:pPr>
-        <w:rPr>
-          <w:rFonts w:asciiTheme="majorBidi" w:hAnsiTheme="majorBidi" w:cstheme="majorBidi"/>
-        </w:rPr>
-      </w:pPr>
-      <w:r>
-        <w:rPr>
-          <w:rFonts w:asciiTheme="majorBidi" w:hAnsiTheme="majorBidi" w:cstheme="majorBidi"/>
-        </w:rPr>
-        <w:t xml:space="preserve">Partitions &amp; Boundary Values Same as formatLeft </w:t>
+        <w:t xml:space="preserve">3. Method: </w:t>
+      </w:r>
+      <w:proofErr w:type="spellStart"/>
+      <w:proofErr w:type="gramStart"/>
+      <w:r>
+        <w:rPr>
+          <w:rFonts w:asciiTheme="majorBidi" w:hAnsiTheme="majorBidi" w:cstheme="majorBidi"/>
+          <w:b/>
+          <w:bCs/>
+        </w:rPr>
+        <w:t>formatRight</w:t>
+      </w:r>
+      <w:proofErr w:type="spellEnd"/>
+      <w:r>
+        <w:rPr>
+          <w:rFonts w:asciiTheme="majorBidi" w:hAnsiTheme="majorBidi" w:cstheme="majorBidi"/>
+          <w:b/>
+          <w:bCs/>
+        </w:rPr>
+        <w:t>(</w:t>
+      </w:r>
+      <w:proofErr w:type="gramEnd"/>
+      <w:r>
+        <w:rPr>
+          <w:rFonts w:asciiTheme="majorBidi" w:hAnsiTheme="majorBidi" w:cstheme="majorBidi"/>
+          <w:b/>
+          <w:bCs/>
+        </w:rPr>
+        <w:t>String s, String mask)</w:t>
+      </w:r>
+    </w:p>
+    <w:p>
+      <w:pPr>
+        <w:rPr>
+          <w:rFonts w:asciiTheme="majorBidi" w:hAnsiTheme="majorBidi" w:cstheme="majorBidi"/>
+        </w:rPr>
+      </w:pPr>
+      <w:r>
+        <w:rPr>
+          <w:rFonts w:asciiTheme="majorBidi" w:hAnsiTheme="majorBidi" w:cstheme="majorBidi"/>
+        </w:rPr>
+        <w:t xml:space="preserve">Partitions &amp; Boundary Values Same as </w:t>
+      </w:r>
+      <w:proofErr w:type="spellStart"/>
+      <w:r>
+        <w:rPr>
+          <w:rFonts w:asciiTheme="majorBidi" w:hAnsiTheme="majorBidi" w:cstheme="majorBidi"/>
+        </w:rPr>
+        <w:t>formatLeft</w:t>
+      </w:r>
+      <w:proofErr w:type="spellEnd"/>
+      <w:r>
+        <w:rPr>
+          <w:rFonts w:asciiTheme="majorBidi" w:hAnsiTheme="majorBidi" w:cstheme="majorBidi"/>
+        </w:rPr>
+        <w:t xml:space="preserve"> </w:t>
       </w:r>
     </w:p>
     <w:p>
@@ -1423,7 +2017,35 @@
         <w:rPr>
           <w:rFonts w:asciiTheme="majorBidi" w:hAnsiTheme="majorBidi" w:cstheme="majorBidi"/>
         </w:rPr>
-        <w:t>s = "abc", mask = null → "abc"</w:t>
+        <w:t>s = "</w:t>
+      </w:r>
+      <w:proofErr w:type="spellStart"/>
+      <w:r>
+        <w:rPr>
+          <w:rFonts w:asciiTheme="majorBidi" w:hAnsiTheme="majorBidi" w:cstheme="majorBidi"/>
+        </w:rPr>
+        <w:t>abc</w:t>
+      </w:r>
+      <w:proofErr w:type="spellEnd"/>
+      <w:r>
+        <w:rPr>
+          <w:rFonts w:asciiTheme="majorBidi" w:hAnsiTheme="majorBidi" w:cstheme="majorBidi"/>
+        </w:rPr>
+        <w:t>", mask = null → "</w:t>
+      </w:r>
+      <w:proofErr w:type="spellStart"/>
+      <w:r>
+        <w:rPr>
+          <w:rFonts w:asciiTheme="majorBidi" w:hAnsiTheme="majorBidi" w:cstheme="majorBidi"/>
+        </w:rPr>
+        <w:t>abc</w:t>
+      </w:r>
+      <w:proofErr w:type="spellEnd"/>
+      <w:r>
+        <w:rPr>
+          <w:rFonts w:asciiTheme="majorBidi" w:hAnsiTheme="majorBidi" w:cstheme="majorBidi"/>
+        </w:rPr>
+        <w:t>"</w:t>
       </w:r>
     </w:p>
     <w:p>
@@ -1440,7 +2062,21 @@
         <w:rPr>
           <w:rFonts w:asciiTheme="majorBidi" w:hAnsiTheme="majorBidi" w:cstheme="majorBidi"/>
         </w:rPr>
-        <w:t>s = "abc", mask = "123456" → "123abc"</w:t>
+        <w:t>s = "</w:t>
+      </w:r>
+      <w:proofErr w:type="spellStart"/>
+      <w:r>
+        <w:rPr>
+          <w:rFonts w:asciiTheme="majorBidi" w:hAnsiTheme="majorBidi" w:cstheme="majorBidi"/>
+        </w:rPr>
+        <w:t>abc</w:t>
+      </w:r>
+      <w:proofErr w:type="spellEnd"/>
+      <w:r>
+        <w:rPr>
+          <w:rFonts w:asciiTheme="majorBidi" w:hAnsiTheme="majorBidi" w:cstheme="majorBidi"/>
+        </w:rPr>
+        <w:t>", mask = "123456" → "123abc"</w:t>
       </w:r>
     </w:p>
     <w:p>
@@ -1457,7 +2093,35 @@
         <w:rPr>
           <w:rFonts w:asciiTheme="majorBidi" w:hAnsiTheme="majorBidi" w:cstheme="majorBidi"/>
         </w:rPr>
-        <w:t>s = "abcdef", mask = "123" → "abcdef"</w:t>
+        <w:t>s = "</w:t>
+      </w:r>
+      <w:proofErr w:type="spellStart"/>
+      <w:r>
+        <w:rPr>
+          <w:rFonts w:asciiTheme="majorBidi" w:hAnsiTheme="majorBidi" w:cstheme="majorBidi"/>
+        </w:rPr>
+        <w:t>abcdef</w:t>
+      </w:r>
+      <w:proofErr w:type="spellEnd"/>
+      <w:r>
+        <w:rPr>
+          <w:rFonts w:asciiTheme="majorBidi" w:hAnsiTheme="majorBidi" w:cstheme="majorBidi"/>
+        </w:rPr>
+        <w:t>", mask = "123" → "</w:t>
+      </w:r>
+      <w:proofErr w:type="spellStart"/>
+      <w:r>
+        <w:rPr>
+          <w:rFonts w:asciiTheme="majorBidi" w:hAnsiTheme="majorBidi" w:cstheme="majorBidi"/>
+        </w:rPr>
+        <w:t>abcdef</w:t>
+      </w:r>
+      <w:proofErr w:type="spellEnd"/>
+      <w:r>
+        <w:rPr>
+          <w:rFonts w:asciiTheme="majorBidi" w:hAnsiTheme="majorBidi" w:cstheme="majorBidi"/>
+        </w:rPr>
+        <w:t>"</w:t>
       </w:r>
     </w:p>
     <w:p>
@@ -1479,6 +2143,187 @@
     </w:p>
     <w:p>
       <w:pPr>
+        <w:numPr>
+          <w:ilvl w:val="0"/>
+          <w:numId w:val="11"/>
+        </w:numPr>
+        <w:rPr>
+          <w:rFonts w:asciiTheme="majorBidi" w:hAnsiTheme="majorBidi" w:cstheme="majorBidi"/>
+        </w:rPr>
+      </w:pPr>
+      <w:r>
+        <w:rPr>
+          <w:rFonts w:asciiTheme="majorBidi" w:hAnsiTheme="majorBidi" w:cstheme="majorBidi"/>
+        </w:rPr>
+        <w:t>s = "</w:t>
+      </w:r>
+      <w:proofErr w:type="spellStart"/>
+      <w:r>
+        <w:rPr>
+          <w:rFonts w:asciiTheme="majorBidi" w:hAnsiTheme="majorBidi" w:cstheme="majorBidi"/>
+        </w:rPr>
+        <w:t>abc</w:t>
+      </w:r>
+      <w:proofErr w:type="spellEnd"/>
+      <w:r>
+        <w:rPr>
+          <w:rFonts w:asciiTheme="majorBidi" w:hAnsiTheme="majorBidi" w:cstheme="majorBidi"/>
+        </w:rPr>
+        <w:t>", mask = "123"</w:t>
+      </w:r>
+      <w:r>
+        <w:rPr>
+          <w:rFonts w:asciiTheme="majorBidi" w:hAnsiTheme="majorBidi" w:cstheme="majorBidi"/>
+        </w:rPr>
+        <w:t>, return:</w:t>
+      </w:r>
+      <w:r>
+        <w:rPr>
+          <w:rFonts w:asciiTheme="majorBidi" w:hAnsiTheme="majorBidi" w:cstheme="majorBidi"/>
+        </w:rPr>
+        <w:t xml:space="preserve"> "</w:t>
+      </w:r>
+      <w:proofErr w:type="spellStart"/>
+      <w:r>
+        <w:rPr>
+          <w:rFonts w:asciiTheme="majorBidi" w:hAnsiTheme="majorBidi" w:cstheme="majorBidi"/>
+        </w:rPr>
+        <w:t>abc</w:t>
+      </w:r>
+      <w:proofErr w:type="spellEnd"/>
+      <w:r>
+        <w:rPr>
+          <w:rFonts w:asciiTheme="majorBidi" w:hAnsiTheme="majorBidi" w:cstheme="majorBidi"/>
+        </w:rPr>
+        <w:t>"</w:t>
+      </w:r>
+      <w:r>
+        <w:rPr>
+          <w:rFonts w:asciiTheme="majorBidi" w:hAnsiTheme="majorBidi" w:cstheme="majorBidi"/>
+        </w:rPr>
+        <w:t xml:space="preserve"> (boundary)</w:t>
+      </w:r>
+    </w:p>
+    <w:p>
+      <w:pPr>
+        <w:numPr>
+          <w:ilvl w:val="0"/>
+          <w:numId w:val="11"/>
+        </w:numPr>
+        <w:rPr>
+          <w:rFonts w:asciiTheme="majorBidi" w:hAnsiTheme="majorBidi" w:cstheme="majorBidi"/>
+        </w:rPr>
+      </w:pPr>
+      <w:r>
+        <w:rPr>
+          <w:rFonts w:asciiTheme="majorBidi" w:hAnsiTheme="majorBidi" w:cstheme="majorBidi"/>
+        </w:rPr>
+        <w:t>s = "</w:t>
+      </w:r>
+      <w:r>
+        <w:rPr>
+          <w:rFonts w:asciiTheme="majorBidi" w:hAnsiTheme="majorBidi" w:cstheme="majorBidi"/>
+        </w:rPr>
+        <w:t>a</w:t>
+      </w:r>
+      <w:r>
+        <w:rPr>
+          <w:rFonts w:asciiTheme="majorBidi" w:hAnsiTheme="majorBidi" w:cstheme="majorBidi"/>
+        </w:rPr>
+        <w:t>", mask = "12"</w:t>
+      </w:r>
+      <w:r>
+        <w:rPr>
+          <w:rFonts w:asciiTheme="majorBidi" w:hAnsiTheme="majorBidi" w:cstheme="majorBidi"/>
+        </w:rPr>
+        <w:t>, return:</w:t>
+      </w:r>
+      <w:r>
+        <w:rPr>
+          <w:rFonts w:asciiTheme="majorBidi" w:hAnsiTheme="majorBidi" w:cstheme="majorBidi"/>
+        </w:rPr>
+        <w:t xml:space="preserve"> "</w:t>
+      </w:r>
+      <w:r>
+        <w:rPr>
+          <w:rFonts w:asciiTheme="majorBidi" w:hAnsiTheme="majorBidi" w:cstheme="majorBidi"/>
+        </w:rPr>
+        <w:t>1a</w:t>
+      </w:r>
+      <w:r>
+        <w:rPr>
+          <w:rFonts w:asciiTheme="majorBidi" w:hAnsiTheme="majorBidi" w:cstheme="majorBidi"/>
+        </w:rPr>
+        <w:t>"</w:t>
+      </w:r>
+      <w:r>
+        <w:rPr>
+          <w:rFonts w:asciiTheme="majorBidi" w:hAnsiTheme="majorBidi" w:cstheme="majorBidi"/>
+        </w:rPr>
+        <w:t xml:space="preserve"> (boundary)</w:t>
+      </w:r>
+    </w:p>
+    <w:p>
+      <w:pPr>
+        <w:numPr>
+          <w:ilvl w:val="0"/>
+          <w:numId w:val="11"/>
+        </w:numPr>
+        <w:rPr>
+          <w:rFonts w:asciiTheme="majorBidi" w:hAnsiTheme="majorBidi" w:cstheme="majorBidi"/>
+        </w:rPr>
+      </w:pPr>
+      <w:r>
+        <w:rPr>
+          <w:rFonts w:asciiTheme="majorBidi" w:hAnsiTheme="majorBidi" w:cstheme="majorBidi"/>
+        </w:rPr>
+        <w:t>s = "</w:t>
+      </w:r>
+      <w:r>
+        <w:rPr>
+          <w:rFonts w:asciiTheme="majorBidi" w:hAnsiTheme="majorBidi" w:cstheme="majorBidi"/>
+        </w:rPr>
+        <w:t>ab</w:t>
+      </w:r>
+      <w:r>
+        <w:rPr>
+          <w:rFonts w:asciiTheme="majorBidi" w:hAnsiTheme="majorBidi" w:cstheme="majorBidi"/>
+        </w:rPr>
+        <w:t>", mask = "1"</w:t>
+      </w:r>
+      <w:r>
+        <w:rPr>
+          <w:rFonts w:asciiTheme="majorBidi" w:hAnsiTheme="majorBidi" w:cstheme="majorBidi"/>
+        </w:rPr>
+        <w:t>, return:</w:t>
+      </w:r>
+      <w:r>
+        <w:rPr>
+          <w:rFonts w:asciiTheme="majorBidi" w:hAnsiTheme="majorBidi" w:cstheme="majorBidi"/>
+        </w:rPr>
+        <w:t xml:space="preserve"> "</w:t>
+      </w:r>
+      <w:r>
+        <w:rPr>
+          <w:rFonts w:asciiTheme="majorBidi" w:hAnsiTheme="majorBidi" w:cstheme="majorBidi"/>
+        </w:rPr>
+        <w:t>ab</w:t>
+      </w:r>
+      <w:r>
+        <w:rPr>
+          <w:rFonts w:asciiTheme="majorBidi" w:hAnsiTheme="majorBidi" w:cstheme="majorBidi"/>
+        </w:rPr>
+        <w:t>"</w:t>
+      </w:r>
+      <w:r>
+        <w:rPr>
+          <w:rFonts w:asciiTheme="majorBidi" w:hAnsiTheme="majorBidi" w:cstheme="majorBidi"/>
+        </w:rPr>
+        <w:t xml:space="preserve"> (boundary)</w:t>
+      </w:r>
+    </w:p>
+    <w:p>
+      <w:pPr>
         <w:rPr>
           <w:rFonts w:asciiTheme="majorBidi" w:hAnsiTheme="majorBidi" w:cstheme="majorBidi"/>
         </w:rPr>
@@ -1507,24 +2352,60 @@
           <w:b/>
           <w:bCs/>
         </w:rPr>
-        <w:t>Part B: Multiset_HashMapImpl Testing</w:t>
-      </w:r>
-    </w:p>
-    <w:p>
-      <w:pPr>
-        <w:rPr>
-          <w:rFonts w:asciiTheme="majorBidi" w:hAnsiTheme="majorBidi" w:cstheme="majorBidi"/>
-          <w:b/>
-          <w:bCs/>
-        </w:rPr>
-      </w:pPr>
-      <w:r>
-        <w:rPr>
-          <w:rFonts w:asciiTheme="majorBidi" w:hAnsiTheme="majorBidi" w:cstheme="majorBidi"/>
-          <w:b/>
-          <w:bCs/>
-        </w:rPr>
-        <w:t>1. Method: add(T entry)</w:t>
+        <w:t xml:space="preserve">Part B: </w:t>
+      </w:r>
+      <w:proofErr w:type="spellStart"/>
+      <w:r>
+        <w:rPr>
+          <w:rFonts w:asciiTheme="majorBidi" w:hAnsiTheme="majorBidi" w:cstheme="majorBidi"/>
+          <w:b/>
+          <w:bCs/>
+        </w:rPr>
+        <w:t>Multiset_HashMapImpl</w:t>
+      </w:r>
+      <w:proofErr w:type="spellEnd"/>
+      <w:r>
+        <w:rPr>
+          <w:rFonts w:asciiTheme="majorBidi" w:hAnsiTheme="majorBidi" w:cstheme="majorBidi"/>
+          <w:b/>
+          <w:bCs/>
+        </w:rPr>
+        <w:t xml:space="preserve"> Testing</w:t>
+      </w:r>
+    </w:p>
+    <w:p>
+      <w:pPr>
+        <w:rPr>
+          <w:rFonts w:asciiTheme="majorBidi" w:hAnsiTheme="majorBidi" w:cstheme="majorBidi"/>
+          <w:b/>
+          <w:bCs/>
+        </w:rPr>
+      </w:pPr>
+      <w:r>
+        <w:rPr>
+          <w:rFonts w:asciiTheme="majorBidi" w:hAnsiTheme="majorBidi" w:cstheme="majorBidi"/>
+          <w:b/>
+          <w:bCs/>
+        </w:rPr>
+        <w:t xml:space="preserve">1. Method: </w:t>
+      </w:r>
+      <w:proofErr w:type="gramStart"/>
+      <w:r>
+        <w:rPr>
+          <w:rFonts w:asciiTheme="majorBidi" w:hAnsiTheme="majorBidi" w:cstheme="majorBidi"/>
+          <w:b/>
+          <w:bCs/>
+        </w:rPr>
+        <w:t>add(</w:t>
+      </w:r>
+      <w:proofErr w:type="gramEnd"/>
+      <w:r>
+        <w:rPr>
+          <w:rFonts w:asciiTheme="majorBidi" w:hAnsiTheme="majorBidi" w:cstheme="majorBidi"/>
+          <w:b/>
+          <w:bCs/>
+        </w:rPr>
+        <w:t>T entry)</w:t>
       </w:r>
     </w:p>
     <w:p>
@@ -1680,23 +2561,60 @@
           <w:b/>
           <w:bCs/>
         </w:rPr>
-        <w:t>2. Method: add(T entry, int mult)</w:t>
-      </w:r>
-    </w:p>
-    <w:p>
-      <w:pPr>
-        <w:rPr>
-          <w:rFonts w:asciiTheme="majorBidi" w:hAnsiTheme="majorBidi" w:cstheme="majorBidi"/>
-          <w:b/>
-          <w:bCs/>
-        </w:rPr>
-      </w:pPr>
-      <w:r>
-        <w:rPr>
-          <w:rFonts w:asciiTheme="majorBidi" w:hAnsiTheme="majorBidi" w:cstheme="majorBidi"/>
-          <w:b/>
-          <w:bCs/>
-        </w:rPr>
+        <w:t xml:space="preserve">2. Method: </w:t>
+      </w:r>
+      <w:proofErr w:type="gramStart"/>
+      <w:r>
+        <w:rPr>
+          <w:rFonts w:asciiTheme="majorBidi" w:hAnsiTheme="majorBidi" w:cstheme="majorBidi"/>
+          <w:b/>
+          <w:bCs/>
+        </w:rPr>
+        <w:t>add(</w:t>
+      </w:r>
+      <w:proofErr w:type="gramEnd"/>
+      <w:r>
+        <w:rPr>
+          <w:rFonts w:asciiTheme="majorBidi" w:hAnsiTheme="majorBidi" w:cstheme="majorBidi"/>
+          <w:b/>
+          <w:bCs/>
+        </w:rPr>
+        <w:t xml:space="preserve">T entry, int </w:t>
+      </w:r>
+      <w:proofErr w:type="spellStart"/>
+      <w:r>
+        <w:rPr>
+          <w:rFonts w:asciiTheme="majorBidi" w:hAnsiTheme="majorBidi" w:cstheme="majorBidi"/>
+          <w:b/>
+          <w:bCs/>
+        </w:rPr>
+        <w:t>mult</w:t>
+      </w:r>
+      <w:proofErr w:type="spellEnd"/>
+      <w:r>
+        <w:rPr>
+          <w:rFonts w:asciiTheme="majorBidi" w:hAnsiTheme="majorBidi" w:cstheme="majorBidi"/>
+          <w:b/>
+          <w:bCs/>
+        </w:rPr>
+        <w:t>)</w:t>
+      </w:r>
+    </w:p>
+    <w:p>
+      <w:pPr>
+        <w:rPr>
+          <w:rFonts w:asciiTheme="majorBidi" w:hAnsiTheme="majorBidi" w:cstheme="majorBidi"/>
+          <w:b/>
+          <w:bCs/>
+        </w:rPr>
+      </w:pPr>
+      <w:r>
+        <w:rPr>
+          <w:rFonts w:asciiTheme="majorBidi" w:hAnsiTheme="majorBidi" w:cstheme="majorBidi"/>
+          <w:b/>
+          <w:bCs/>
+        </w:rPr>
+        <w:lastRenderedPageBreak/>
         <w:t>Partitions (ISP)</w:t>
       </w:r>
     </w:p>
@@ -1710,11 +2628,19 @@
           <w:rFonts w:asciiTheme="majorBidi" w:hAnsiTheme="majorBidi" w:cstheme="majorBidi"/>
         </w:rPr>
       </w:pPr>
-      <w:r>
-        <w:rPr>
-          <w:rFonts w:asciiTheme="majorBidi" w:hAnsiTheme="majorBidi" w:cstheme="majorBidi"/>
-        </w:rPr>
-        <w:t xml:space="preserve">mult &gt; 0 </w:t>
+      <w:proofErr w:type="spellStart"/>
+      <w:r>
+        <w:rPr>
+          <w:rFonts w:asciiTheme="majorBidi" w:hAnsiTheme="majorBidi" w:cstheme="majorBidi"/>
+        </w:rPr>
+        <w:t>mult</w:t>
+      </w:r>
+      <w:proofErr w:type="spellEnd"/>
+      <w:r>
+        <w:rPr>
+          <w:rFonts w:asciiTheme="majorBidi" w:hAnsiTheme="majorBidi" w:cstheme="majorBidi"/>
+        </w:rPr>
+        <w:t xml:space="preserve"> &gt; 0 </w:t>
       </w:r>
     </w:p>
     <w:p>
@@ -1727,11 +2653,19 @@
           <w:rFonts w:asciiTheme="majorBidi" w:hAnsiTheme="majorBidi" w:cstheme="majorBidi"/>
         </w:rPr>
       </w:pPr>
-      <w:r>
-        <w:rPr>
-          <w:rFonts w:asciiTheme="majorBidi" w:hAnsiTheme="majorBidi" w:cstheme="majorBidi"/>
-        </w:rPr>
-        <w:t xml:space="preserve">mult = 0 </w:t>
+      <w:proofErr w:type="spellStart"/>
+      <w:r>
+        <w:rPr>
+          <w:rFonts w:asciiTheme="majorBidi" w:hAnsiTheme="majorBidi" w:cstheme="majorBidi"/>
+        </w:rPr>
+        <w:t>mult</w:t>
+      </w:r>
+      <w:proofErr w:type="spellEnd"/>
+      <w:r>
+        <w:rPr>
+          <w:rFonts w:asciiTheme="majorBidi" w:hAnsiTheme="majorBidi" w:cstheme="majorBidi"/>
+        </w:rPr>
+        <w:t xml:space="preserve"> = 0 </w:t>
       </w:r>
     </w:p>
     <w:p>
@@ -1744,28 +2678,35 @@
           <w:rFonts w:asciiTheme="majorBidi" w:hAnsiTheme="majorBidi" w:cstheme="majorBidi"/>
         </w:rPr>
       </w:pPr>
-      <w:r>
-        <w:rPr>
-          <w:rFonts w:asciiTheme="majorBidi" w:hAnsiTheme="majorBidi" w:cstheme="majorBidi"/>
-        </w:rPr>
-        <w:t xml:space="preserve">mult &lt; 0 </w:t>
-      </w:r>
-    </w:p>
-    <w:p>
-      <w:pPr>
-        <w:rPr>
-          <w:rFonts w:asciiTheme="majorBidi" w:hAnsiTheme="majorBidi" w:cstheme="majorBidi"/>
-          <w:b/>
-          <w:bCs/>
-        </w:rPr>
-      </w:pPr>
-      <w:r>
-        <w:rPr>
-          <w:rFonts w:asciiTheme="majorBidi" w:hAnsiTheme="majorBidi" w:cstheme="majorBidi"/>
-          <w:b/>
-          <w:bCs/>
-        </w:rPr>
-        <w:lastRenderedPageBreak/>
+      <w:proofErr w:type="spellStart"/>
+      <w:r>
+        <w:rPr>
+          <w:rFonts w:asciiTheme="majorBidi" w:hAnsiTheme="majorBidi" w:cstheme="majorBidi"/>
+        </w:rPr>
+        <w:t>mult</w:t>
+      </w:r>
+      <w:proofErr w:type="spellEnd"/>
+      <w:r>
+        <w:rPr>
+          <w:rFonts w:asciiTheme="majorBidi" w:hAnsiTheme="majorBidi" w:cstheme="majorBidi"/>
+        </w:rPr>
+        <w:t xml:space="preserve"> &lt; 0 </w:t>
+      </w:r>
+    </w:p>
+    <w:p>
+      <w:pPr>
+        <w:rPr>
+          <w:rFonts w:asciiTheme="majorBidi" w:hAnsiTheme="majorBidi" w:cstheme="majorBidi"/>
+          <w:b/>
+          <w:bCs/>
+        </w:rPr>
+      </w:pPr>
+      <w:r>
+        <w:rPr>
+          <w:rFonts w:asciiTheme="majorBidi" w:hAnsiTheme="majorBidi" w:cstheme="majorBidi"/>
+          <w:b/>
+          <w:bCs/>
+        </w:rPr>
         <w:t>Boundary Values (BVA)</w:t>
       </w:r>
     </w:p>
@@ -1779,11 +2720,19 @@
           <w:rFonts w:asciiTheme="majorBidi" w:hAnsiTheme="majorBidi" w:cstheme="majorBidi"/>
         </w:rPr>
       </w:pPr>
-      <w:r>
-        <w:rPr>
-          <w:rFonts w:asciiTheme="majorBidi" w:hAnsiTheme="majorBidi" w:cstheme="majorBidi"/>
-        </w:rPr>
-        <w:t xml:space="preserve">mult = -1, 0, 1 </w:t>
+      <w:proofErr w:type="spellStart"/>
+      <w:r>
+        <w:rPr>
+          <w:rFonts w:asciiTheme="majorBidi" w:hAnsiTheme="majorBidi" w:cstheme="majorBidi"/>
+        </w:rPr>
+        <w:t>mult</w:t>
+      </w:r>
+      <w:proofErr w:type="spellEnd"/>
+      <w:r>
+        <w:rPr>
+          <w:rFonts w:asciiTheme="majorBidi" w:hAnsiTheme="majorBidi" w:cstheme="majorBidi"/>
+        </w:rPr>
+        <w:t xml:space="preserve"> = -1, 0, 1 </w:t>
       </w:r>
     </w:p>
     <w:p>
@@ -1846,7 +2795,21 @@
         <w:rPr>
           <w:rFonts w:asciiTheme="majorBidi" w:hAnsiTheme="majorBidi" w:cstheme="majorBidi"/>
         </w:rPr>
-        <w:t>Add with mult = 0</w:t>
+        <w:t xml:space="preserve">Add with </w:t>
+      </w:r>
+      <w:proofErr w:type="spellStart"/>
+      <w:r>
+        <w:rPr>
+          <w:rFonts w:asciiTheme="majorBidi" w:hAnsiTheme="majorBidi" w:cstheme="majorBidi"/>
+        </w:rPr>
+        <w:t>mult</w:t>
+      </w:r>
+      <w:proofErr w:type="spellEnd"/>
+      <w:r>
+        <w:rPr>
+          <w:rFonts w:asciiTheme="majorBidi" w:hAnsiTheme="majorBidi" w:cstheme="majorBidi"/>
+        </w:rPr>
+        <w:t xml:space="preserve"> = 0</w:t>
       </w:r>
       <w:r>
         <w:rPr>
@@ -1881,7 +2844,21 @@
         <w:rPr>
           <w:rFonts w:asciiTheme="majorBidi" w:hAnsiTheme="majorBidi" w:cstheme="majorBidi"/>
         </w:rPr>
-        <w:t xml:space="preserve">Add with mult &lt; 0 </w:t>
+        <w:t xml:space="preserve">Add with </w:t>
+      </w:r>
+      <w:proofErr w:type="spellStart"/>
+      <w:r>
+        <w:rPr>
+          <w:rFonts w:asciiTheme="majorBidi" w:hAnsiTheme="majorBidi" w:cstheme="majorBidi"/>
+        </w:rPr>
+        <w:t>mult</w:t>
+      </w:r>
+      <w:proofErr w:type="spellEnd"/>
+      <w:r>
+        <w:rPr>
+          <w:rFonts w:asciiTheme="majorBidi" w:hAnsiTheme="majorBidi" w:cstheme="majorBidi"/>
+        </w:rPr>
+        <w:t xml:space="preserve"> &lt; 0 </w:t>
       </w:r>
       <w:r>
         <w:rPr>
@@ -1967,37 +2944,91 @@
           <w:rFonts w:asciiTheme="majorBidi" w:hAnsiTheme="majorBidi" w:cstheme="majorBidi"/>
         </w:rPr>
       </w:pPr>
-      <w:r>
-        <w:rPr>
-          <w:rFonts w:asciiTheme="majorBidi" w:hAnsiTheme="majorBidi" w:cstheme="majorBidi"/>
-        </w:rPr>
-        <w:t>addAll(Multiset&lt;T&gt; other)</w:t>
-      </w:r>
-    </w:p>
-    <w:p>
-      <w:pPr>
-        <w:rPr>
-          <w:rFonts w:asciiTheme="majorBidi" w:hAnsiTheme="majorBidi" w:cstheme="majorBidi"/>
-        </w:rPr>
-      </w:pPr>
-      <w:r>
-        <w:rPr>
-          <w:rFonts w:asciiTheme="majorBidi" w:hAnsiTheme="majorBidi" w:cstheme="majorBidi"/>
-        </w:rPr>
-        <w:t>addAll(Collection&lt;T&gt; values)</w:t>
-      </w:r>
-    </w:p>
-    <w:p>
-      <w:pPr>
-        <w:rPr>
-          <w:rFonts w:asciiTheme="majorBidi" w:hAnsiTheme="majorBidi" w:cstheme="majorBidi"/>
-        </w:rPr>
-      </w:pPr>
-      <w:r>
-        <w:rPr>
-          <w:rFonts w:asciiTheme="majorBidi" w:hAnsiTheme="majorBidi" w:cstheme="majorBidi"/>
-        </w:rPr>
-        <w:t>addAll(T[] values)</w:t>
+      <w:proofErr w:type="spellStart"/>
+      <w:proofErr w:type="gramStart"/>
+      <w:r>
+        <w:rPr>
+          <w:rFonts w:asciiTheme="majorBidi" w:hAnsiTheme="majorBidi" w:cstheme="majorBidi"/>
+        </w:rPr>
+        <w:t>addAll</w:t>
+      </w:r>
+      <w:proofErr w:type="spellEnd"/>
+      <w:r>
+        <w:rPr>
+          <w:rFonts w:asciiTheme="majorBidi" w:hAnsiTheme="majorBidi" w:cstheme="majorBidi"/>
+        </w:rPr>
+        <w:t>(</w:t>
+      </w:r>
+      <w:proofErr w:type="gramEnd"/>
+      <w:r>
+        <w:rPr>
+          <w:rFonts w:asciiTheme="majorBidi" w:hAnsiTheme="majorBidi" w:cstheme="majorBidi"/>
+        </w:rPr>
+        <w:t>Multiset&lt;T&gt; other)</w:t>
+      </w:r>
+    </w:p>
+    <w:p>
+      <w:pPr>
+        <w:rPr>
+          <w:rFonts w:asciiTheme="majorBidi" w:hAnsiTheme="majorBidi" w:cstheme="majorBidi"/>
+        </w:rPr>
+      </w:pPr>
+      <w:proofErr w:type="spellStart"/>
+      <w:proofErr w:type="gramStart"/>
+      <w:r>
+        <w:rPr>
+          <w:rFonts w:asciiTheme="majorBidi" w:hAnsiTheme="majorBidi" w:cstheme="majorBidi"/>
+        </w:rPr>
+        <w:t>addAll</w:t>
+      </w:r>
+      <w:proofErr w:type="spellEnd"/>
+      <w:r>
+        <w:rPr>
+          <w:rFonts w:asciiTheme="majorBidi" w:hAnsiTheme="majorBidi" w:cstheme="majorBidi"/>
+        </w:rPr>
+        <w:t>(</w:t>
+      </w:r>
+      <w:proofErr w:type="gramEnd"/>
+      <w:r>
+        <w:rPr>
+          <w:rFonts w:asciiTheme="majorBidi" w:hAnsiTheme="majorBidi" w:cstheme="majorBidi"/>
+        </w:rPr>
+        <w:t>Collection&lt;T&gt; values)</w:t>
+      </w:r>
+    </w:p>
+    <w:p>
+      <w:pPr>
+        <w:rPr>
+          <w:rFonts w:asciiTheme="majorBidi" w:hAnsiTheme="majorBidi" w:cstheme="majorBidi"/>
+        </w:rPr>
+      </w:pPr>
+      <w:proofErr w:type="spellStart"/>
+      <w:r>
+        <w:rPr>
+          <w:rFonts w:asciiTheme="majorBidi" w:hAnsiTheme="majorBidi" w:cstheme="majorBidi"/>
+        </w:rPr>
+        <w:t>addAll</w:t>
+      </w:r>
+      <w:proofErr w:type="spellEnd"/>
+      <w:r>
+        <w:rPr>
+          <w:rFonts w:asciiTheme="majorBidi" w:hAnsiTheme="majorBidi" w:cstheme="majorBidi"/>
+        </w:rPr>
+        <w:t>(</w:t>
+      </w:r>
+      <w:proofErr w:type="gramStart"/>
+      <w:r>
+        <w:rPr>
+          <w:rFonts w:asciiTheme="majorBidi" w:hAnsiTheme="majorBidi" w:cstheme="majorBidi"/>
+        </w:rPr>
+        <w:t>T[</w:t>
+      </w:r>
+      <w:proofErr w:type="gramEnd"/>
+      <w:r>
+        <w:rPr>
+          <w:rFonts w:asciiTheme="majorBidi" w:hAnsiTheme="majorBidi" w:cstheme="majorBidi"/>
+        </w:rPr>
+        <w:t>] values)</w:t>
       </w:r>
     </w:p>
     <w:p>
@@ -2129,11 +3160,19 @@
           <w:rFonts w:asciiTheme="majorBidi" w:hAnsiTheme="majorBidi" w:cstheme="majorBidi"/>
         </w:rPr>
       </w:pPr>
-      <w:r>
-        <w:rPr>
-          <w:rFonts w:asciiTheme="majorBidi" w:hAnsiTheme="majorBidi" w:cstheme="majorBidi"/>
-        </w:rPr>
-        <w:t xml:space="preserve">AddAll with null → no change </w:t>
+      <w:proofErr w:type="spellStart"/>
+      <w:r>
+        <w:rPr>
+          <w:rFonts w:asciiTheme="majorBidi" w:hAnsiTheme="majorBidi" w:cstheme="majorBidi"/>
+        </w:rPr>
+        <w:t>AddAll</w:t>
+      </w:r>
+      <w:proofErr w:type="spellEnd"/>
+      <w:r>
+        <w:rPr>
+          <w:rFonts w:asciiTheme="majorBidi" w:hAnsiTheme="majorBidi" w:cstheme="majorBidi"/>
+        </w:rPr>
+        <w:t xml:space="preserve"> with null → no change </w:t>
       </w:r>
     </w:p>
     <w:p>
@@ -2146,11 +3185,19 @@
           <w:rFonts w:asciiTheme="majorBidi" w:hAnsiTheme="majorBidi" w:cstheme="majorBidi"/>
         </w:rPr>
       </w:pPr>
-      <w:r>
-        <w:rPr>
-          <w:rFonts w:asciiTheme="majorBidi" w:hAnsiTheme="majorBidi" w:cstheme="majorBidi"/>
-        </w:rPr>
-        <w:t xml:space="preserve">AddAll with empty → no change </w:t>
+      <w:proofErr w:type="spellStart"/>
+      <w:r>
+        <w:rPr>
+          <w:rFonts w:asciiTheme="majorBidi" w:hAnsiTheme="majorBidi" w:cstheme="majorBidi"/>
+        </w:rPr>
+        <w:t>AddAll</w:t>
+      </w:r>
+      <w:proofErr w:type="spellEnd"/>
+      <w:r>
+        <w:rPr>
+          <w:rFonts w:asciiTheme="majorBidi" w:hAnsiTheme="majorBidi" w:cstheme="majorBidi"/>
+        </w:rPr>
+        <w:t xml:space="preserve"> with empty → no change </w:t>
       </w:r>
     </w:p>
     <w:p>
@@ -2163,11 +3210,19 @@
           <w:rFonts w:asciiTheme="majorBidi" w:hAnsiTheme="majorBidi" w:cstheme="majorBidi"/>
         </w:rPr>
       </w:pPr>
-      <w:r>
-        <w:rPr>
-          <w:rFonts w:asciiTheme="majorBidi" w:hAnsiTheme="majorBidi" w:cstheme="majorBidi"/>
-        </w:rPr>
-        <w:t xml:space="preserve">AddAll with new elements → elements added correctly </w:t>
+      <w:proofErr w:type="spellStart"/>
+      <w:r>
+        <w:rPr>
+          <w:rFonts w:asciiTheme="majorBidi" w:hAnsiTheme="majorBidi" w:cstheme="majorBidi"/>
+        </w:rPr>
+        <w:t>AddAll</w:t>
+      </w:r>
+      <w:proofErr w:type="spellEnd"/>
+      <w:r>
+        <w:rPr>
+          <w:rFonts w:asciiTheme="majorBidi" w:hAnsiTheme="majorBidi" w:cstheme="majorBidi"/>
+        </w:rPr>
+        <w:t xml:space="preserve"> with new elements → elements added correctly </w:t>
       </w:r>
     </w:p>
     <w:p>
@@ -2180,11 +3235,19 @@
           <w:rFonts w:asciiTheme="majorBidi" w:hAnsiTheme="majorBidi" w:cstheme="majorBidi"/>
         </w:rPr>
       </w:pPr>
-      <w:r>
-        <w:rPr>
-          <w:rFonts w:asciiTheme="majorBidi" w:hAnsiTheme="majorBidi" w:cstheme="majorBidi"/>
-        </w:rPr>
-        <w:t xml:space="preserve">AddAll with duplicates → multiplicity counted correctly </w:t>
+      <w:proofErr w:type="spellStart"/>
+      <w:r>
+        <w:rPr>
+          <w:rFonts w:asciiTheme="majorBidi" w:hAnsiTheme="majorBidi" w:cstheme="majorBidi"/>
+        </w:rPr>
+        <w:t>AddAll</w:t>
+      </w:r>
+      <w:proofErr w:type="spellEnd"/>
+      <w:r>
+        <w:rPr>
+          <w:rFonts w:asciiTheme="majorBidi" w:hAnsiTheme="majorBidi" w:cstheme="majorBidi"/>
+        </w:rPr>
+        <w:t xml:space="preserve"> with duplicates → multiplicity counted correctly </w:t>
       </w:r>
     </w:p>
     <w:p>
@@ -2199,11 +3262,20 @@
           <w:bCs/>
         </w:rPr>
       </w:pPr>
-      <w:r>
-        <w:rPr>
-          <w:rFonts w:asciiTheme="majorBidi" w:hAnsiTheme="majorBidi" w:cstheme="majorBidi"/>
-        </w:rPr>
-        <w:t>AddAll with overlapping elements → multiplicities merged correct</w:t>
+      <w:proofErr w:type="spellStart"/>
+      <w:r>
+        <w:rPr>
+          <w:rFonts w:asciiTheme="majorBidi" w:hAnsiTheme="majorBidi" w:cstheme="majorBidi"/>
+        </w:rPr>
+        <w:lastRenderedPageBreak/>
+        <w:t>AddAll</w:t>
+      </w:r>
+      <w:proofErr w:type="spellEnd"/>
+      <w:r>
+        <w:rPr>
+          <w:rFonts w:asciiTheme="majorBidi" w:hAnsiTheme="majorBidi" w:cstheme="majorBidi"/>
+        </w:rPr>
+        <w:t xml:space="preserve"> with overlapping elements → multiplicities merged correct</w:t>
       </w:r>
       <w:r>
         <w:rPr>
@@ -2230,7 +3302,25 @@
           <w:b/>
           <w:bCs/>
         </w:rPr>
-        <w:t>4. Method: remove(Object key)</w:t>
+        <w:t xml:space="preserve">4. Method: </w:t>
+      </w:r>
+      <w:proofErr w:type="gramStart"/>
+      <w:r>
+        <w:rPr>
+          <w:rFonts w:asciiTheme="majorBidi" w:hAnsiTheme="majorBidi" w:cstheme="majorBidi"/>
+          <w:b/>
+          <w:bCs/>
+        </w:rPr>
+        <w:t>remove(</w:t>
+      </w:r>
+      <w:proofErr w:type="gramEnd"/>
+      <w:r>
+        <w:rPr>
+          <w:rFonts w:asciiTheme="majorBidi" w:hAnsiTheme="majorBidi" w:cstheme="majorBidi"/>
+          <w:b/>
+          <w:bCs/>
+        </w:rPr>
+        <w:t>Object key)</w:t>
       </w:r>
     </w:p>
     <w:p>
@@ -2264,7 +3354,6 @@
         <w:rPr>
           <w:rFonts w:asciiTheme="majorBidi" w:hAnsiTheme="majorBidi" w:cstheme="majorBidi"/>
         </w:rPr>
-        <w:lastRenderedPageBreak/>
         <w:t xml:space="preserve">Key does not exist </w:t>
       </w:r>
     </w:p>
@@ -2445,7 +3534,43 @@
           <w:b/>
           <w:bCs/>
         </w:rPr>
-        <w:t>5. Method: remove(T key, int mult)</w:t>
+        <w:t xml:space="preserve">5. Method: </w:t>
+      </w:r>
+      <w:proofErr w:type="gramStart"/>
+      <w:r>
+        <w:rPr>
+          <w:rFonts w:asciiTheme="majorBidi" w:hAnsiTheme="majorBidi" w:cstheme="majorBidi"/>
+          <w:b/>
+          <w:bCs/>
+        </w:rPr>
+        <w:t>remove(</w:t>
+      </w:r>
+      <w:proofErr w:type="gramEnd"/>
+      <w:r>
+        <w:rPr>
+          <w:rFonts w:asciiTheme="majorBidi" w:hAnsiTheme="majorBidi" w:cstheme="majorBidi"/>
+          <w:b/>
+          <w:bCs/>
+        </w:rPr>
+        <w:t xml:space="preserve">T key, int </w:t>
+      </w:r>
+      <w:proofErr w:type="spellStart"/>
+      <w:r>
+        <w:rPr>
+          <w:rFonts w:asciiTheme="majorBidi" w:hAnsiTheme="majorBidi" w:cstheme="majorBidi"/>
+          <w:b/>
+          <w:bCs/>
+        </w:rPr>
+        <w:t>mult</w:t>
+      </w:r>
+      <w:proofErr w:type="spellEnd"/>
+      <w:r>
+        <w:rPr>
+          <w:rFonts w:asciiTheme="majorBidi" w:hAnsiTheme="majorBidi" w:cstheme="majorBidi"/>
+          <w:b/>
+          <w:bCs/>
+        </w:rPr>
+        <w:t>)</w:t>
       </w:r>
     </w:p>
     <w:p>
@@ -2492,11 +3617,19 @@
           <w:rFonts w:asciiTheme="majorBidi" w:hAnsiTheme="majorBidi" w:cstheme="majorBidi"/>
         </w:rPr>
       </w:pPr>
-      <w:r>
-        <w:rPr>
-          <w:rFonts w:asciiTheme="majorBidi" w:hAnsiTheme="majorBidi" w:cstheme="majorBidi"/>
-        </w:rPr>
-        <w:t xml:space="preserve">mult &lt; count </w:t>
+      <w:proofErr w:type="spellStart"/>
+      <w:r>
+        <w:rPr>
+          <w:rFonts w:asciiTheme="majorBidi" w:hAnsiTheme="majorBidi" w:cstheme="majorBidi"/>
+        </w:rPr>
+        <w:t>mult</w:t>
+      </w:r>
+      <w:proofErr w:type="spellEnd"/>
+      <w:r>
+        <w:rPr>
+          <w:rFonts w:asciiTheme="majorBidi" w:hAnsiTheme="majorBidi" w:cstheme="majorBidi"/>
+        </w:rPr>
+        <w:t xml:space="preserve"> &lt; count </w:t>
       </w:r>
     </w:p>
     <w:p>
@@ -2509,11 +3642,19 @@
           <w:rFonts w:asciiTheme="majorBidi" w:hAnsiTheme="majorBidi" w:cstheme="majorBidi"/>
         </w:rPr>
       </w:pPr>
-      <w:r>
-        <w:rPr>
-          <w:rFonts w:asciiTheme="majorBidi" w:hAnsiTheme="majorBidi" w:cstheme="majorBidi"/>
-        </w:rPr>
-        <w:t xml:space="preserve">mult = count </w:t>
+      <w:proofErr w:type="spellStart"/>
+      <w:r>
+        <w:rPr>
+          <w:rFonts w:asciiTheme="majorBidi" w:hAnsiTheme="majorBidi" w:cstheme="majorBidi"/>
+        </w:rPr>
+        <w:t>mult</w:t>
+      </w:r>
+      <w:proofErr w:type="spellEnd"/>
+      <w:r>
+        <w:rPr>
+          <w:rFonts w:asciiTheme="majorBidi" w:hAnsiTheme="majorBidi" w:cstheme="majorBidi"/>
+        </w:rPr>
+        <w:t xml:space="preserve"> = count </w:t>
       </w:r>
     </w:p>
     <w:p>
@@ -2526,11 +3667,19 @@
           <w:rFonts w:asciiTheme="majorBidi" w:hAnsiTheme="majorBidi" w:cstheme="majorBidi"/>
         </w:rPr>
       </w:pPr>
-      <w:r>
-        <w:rPr>
-          <w:rFonts w:asciiTheme="majorBidi" w:hAnsiTheme="majorBidi" w:cstheme="majorBidi"/>
-        </w:rPr>
-        <w:t xml:space="preserve">mult &gt; count </w:t>
+      <w:proofErr w:type="spellStart"/>
+      <w:r>
+        <w:rPr>
+          <w:rFonts w:asciiTheme="majorBidi" w:hAnsiTheme="majorBidi" w:cstheme="majorBidi"/>
+        </w:rPr>
+        <w:t>mult</w:t>
+      </w:r>
+      <w:proofErr w:type="spellEnd"/>
+      <w:r>
+        <w:rPr>
+          <w:rFonts w:asciiTheme="majorBidi" w:hAnsiTheme="majorBidi" w:cstheme="majorBidi"/>
+        </w:rPr>
+        <w:t xml:space="preserve"> &gt; count </w:t>
       </w:r>
     </w:p>
     <w:p>
@@ -2560,11 +3709,19 @@
           <w:rFonts w:asciiTheme="majorBidi" w:hAnsiTheme="majorBidi" w:cstheme="majorBidi"/>
         </w:rPr>
       </w:pPr>
-      <w:r>
-        <w:rPr>
-          <w:rFonts w:asciiTheme="majorBidi" w:hAnsiTheme="majorBidi" w:cstheme="majorBidi"/>
-        </w:rPr>
-        <w:t>mult = 0, 1, count</w:t>
+      <w:proofErr w:type="spellStart"/>
+      <w:r>
+        <w:rPr>
+          <w:rFonts w:asciiTheme="majorBidi" w:hAnsiTheme="majorBidi" w:cstheme="majorBidi"/>
+        </w:rPr>
+        <w:t>mult</w:t>
+      </w:r>
+      <w:proofErr w:type="spellEnd"/>
+      <w:r>
+        <w:rPr>
+          <w:rFonts w:asciiTheme="majorBidi" w:hAnsiTheme="majorBidi" w:cstheme="majorBidi"/>
+        </w:rPr>
+        <w:t xml:space="preserve"> = 0, 1, count</w:t>
       </w:r>
       <w:r>
         <w:rPr>
@@ -2610,7 +3767,21 @@
         <w:rPr>
           <w:rFonts w:asciiTheme="majorBidi" w:hAnsiTheme="majorBidi" w:cstheme="majorBidi"/>
         </w:rPr>
-        <w:t xml:space="preserve">Key not exist </w:t>
+        <w:t xml:space="preserve">Key </w:t>
+      </w:r>
+      <w:proofErr w:type="gramStart"/>
+      <w:r>
+        <w:rPr>
+          <w:rFonts w:asciiTheme="majorBidi" w:hAnsiTheme="majorBidi" w:cstheme="majorBidi"/>
+        </w:rPr>
+        <w:t>not exist</w:t>
+      </w:r>
+      <w:proofErr w:type="gramEnd"/>
+      <w:r>
+        <w:rPr>
+          <w:rFonts w:asciiTheme="majorBidi" w:hAnsiTheme="majorBidi" w:cstheme="majorBidi"/>
+        </w:rPr>
+        <w:t xml:space="preserve"> </w:t>
       </w:r>
       <w:r>
         <w:rPr>
@@ -2635,11 +3806,19 @@
           <w:rFonts w:asciiTheme="majorBidi" w:hAnsiTheme="majorBidi" w:cstheme="majorBidi"/>
         </w:rPr>
       </w:pPr>
-      <w:r>
-        <w:rPr>
-          <w:rFonts w:asciiTheme="majorBidi" w:hAnsiTheme="majorBidi" w:cstheme="majorBidi"/>
-        </w:rPr>
-        <w:t xml:space="preserve">mult &lt; count </w:t>
+      <w:proofErr w:type="spellStart"/>
+      <w:r>
+        <w:rPr>
+          <w:rFonts w:asciiTheme="majorBidi" w:hAnsiTheme="majorBidi" w:cstheme="majorBidi"/>
+        </w:rPr>
+        <w:t>mult</w:t>
+      </w:r>
+      <w:proofErr w:type="spellEnd"/>
+      <w:r>
+        <w:rPr>
+          <w:rFonts w:asciiTheme="majorBidi" w:hAnsiTheme="majorBidi" w:cstheme="majorBidi"/>
+        </w:rPr>
+        <w:t xml:space="preserve"> &lt; count </w:t>
       </w:r>
       <w:r>
         <w:rPr>
@@ -2664,11 +3843,19 @@
           <w:rFonts w:asciiTheme="majorBidi" w:hAnsiTheme="majorBidi" w:cstheme="majorBidi"/>
         </w:rPr>
       </w:pPr>
-      <w:r>
-        <w:rPr>
-          <w:rFonts w:asciiTheme="majorBidi" w:hAnsiTheme="majorBidi" w:cstheme="majorBidi"/>
-        </w:rPr>
-        <w:t xml:space="preserve">mult = count </w:t>
+      <w:proofErr w:type="spellStart"/>
+      <w:r>
+        <w:rPr>
+          <w:rFonts w:asciiTheme="majorBidi" w:hAnsiTheme="majorBidi" w:cstheme="majorBidi"/>
+        </w:rPr>
+        <w:t>mult</w:t>
+      </w:r>
+      <w:proofErr w:type="spellEnd"/>
+      <w:r>
+        <w:rPr>
+          <w:rFonts w:asciiTheme="majorBidi" w:hAnsiTheme="majorBidi" w:cstheme="majorBidi"/>
+        </w:rPr>
+        <w:t xml:space="preserve"> = count </w:t>
       </w:r>
       <w:r>
         <w:rPr>
@@ -2693,11 +3880,19 @@
           <w:rFonts w:asciiTheme="majorBidi" w:hAnsiTheme="majorBidi" w:cstheme="majorBidi"/>
         </w:rPr>
       </w:pPr>
-      <w:r>
-        <w:rPr>
-          <w:rFonts w:asciiTheme="majorBidi" w:hAnsiTheme="majorBidi" w:cstheme="majorBidi"/>
-        </w:rPr>
-        <w:t>mult &gt; count</w:t>
+      <w:proofErr w:type="spellStart"/>
+      <w:r>
+        <w:rPr>
+          <w:rFonts w:asciiTheme="majorBidi" w:hAnsiTheme="majorBidi" w:cstheme="majorBidi"/>
+        </w:rPr>
+        <w:t>mult</w:t>
+      </w:r>
+      <w:proofErr w:type="spellEnd"/>
+      <w:r>
+        <w:rPr>
+          <w:rFonts w:asciiTheme="majorBidi" w:hAnsiTheme="majorBidi" w:cstheme="majorBidi"/>
+        </w:rPr>
+        <w:t xml:space="preserve"> &gt; count</w:t>
       </w:r>
       <w:r>
         <w:rPr>
@@ -2728,11 +3923,19 @@
           <w:rFonts w:asciiTheme="majorBidi" w:hAnsiTheme="majorBidi" w:cstheme="majorBidi"/>
         </w:rPr>
       </w:pPr>
-      <w:r>
-        <w:rPr>
-          <w:rFonts w:asciiTheme="majorBidi" w:hAnsiTheme="majorBidi" w:cstheme="majorBidi"/>
-        </w:rPr>
-        <w:t xml:space="preserve">mult = 0 </w:t>
+      <w:proofErr w:type="spellStart"/>
+      <w:r>
+        <w:rPr>
+          <w:rFonts w:asciiTheme="majorBidi" w:hAnsiTheme="majorBidi" w:cstheme="majorBidi"/>
+        </w:rPr>
+        <w:t>mult</w:t>
+      </w:r>
+      <w:proofErr w:type="spellEnd"/>
+      <w:r>
+        <w:rPr>
+          <w:rFonts w:asciiTheme="majorBidi" w:hAnsiTheme="majorBidi" w:cstheme="majorBidi"/>
+        </w:rPr>
+        <w:t xml:space="preserve"> = 0 </w:t>
       </w:r>
       <w:r>
         <w:rPr>
@@ -2780,7 +3983,36 @@
           <w:b/>
           <w:bCs/>
         </w:rPr>
-        <w:t>6. Method: removeAll(T key)</w:t>
+        <w:lastRenderedPageBreak/>
+        <w:t xml:space="preserve">6. Method: </w:t>
+      </w:r>
+      <w:proofErr w:type="spellStart"/>
+      <w:proofErr w:type="gramStart"/>
+      <w:r>
+        <w:rPr>
+          <w:rFonts w:asciiTheme="majorBidi" w:hAnsiTheme="majorBidi" w:cstheme="majorBidi"/>
+          <w:b/>
+          <w:bCs/>
+        </w:rPr>
+        <w:t>removeAll</w:t>
+      </w:r>
+      <w:proofErr w:type="spellEnd"/>
+      <w:r>
+        <w:rPr>
+          <w:rFonts w:asciiTheme="majorBidi" w:hAnsiTheme="majorBidi" w:cstheme="majorBidi"/>
+          <w:b/>
+          <w:bCs/>
+        </w:rPr>
+        <w:t>(</w:t>
+      </w:r>
+      <w:proofErr w:type="gramEnd"/>
+      <w:r>
+        <w:rPr>
+          <w:rFonts w:asciiTheme="majorBidi" w:hAnsiTheme="majorBidi" w:cstheme="majorBidi"/>
+          <w:b/>
+          <w:bCs/>
+        </w:rPr>
+        <w:t>T key)</w:t>
       </w:r>
     </w:p>
     <w:p>
@@ -2848,7 +4080,6 @@
           <w:b/>
           <w:bCs/>
         </w:rPr>
-        <w:lastRenderedPageBreak/>
         <w:t>Test Cases</w:t>
       </w:r>
     </w:p>
@@ -2883,7 +4114,21 @@
         <w:rPr>
           <w:rFonts w:asciiTheme="majorBidi" w:hAnsiTheme="majorBidi" w:cstheme="majorBidi"/>
         </w:rPr>
-        <w:t xml:space="preserve">Key not exist → returns 0 </w:t>
+        <w:t xml:space="preserve">Key </w:t>
+      </w:r>
+      <w:proofErr w:type="gramStart"/>
+      <w:r>
+        <w:rPr>
+          <w:rFonts w:asciiTheme="majorBidi" w:hAnsiTheme="majorBidi" w:cstheme="majorBidi"/>
+        </w:rPr>
+        <w:t>not exist</w:t>
+      </w:r>
+      <w:proofErr w:type="gramEnd"/>
+      <w:r>
+        <w:rPr>
+          <w:rFonts w:asciiTheme="majorBidi" w:hAnsiTheme="majorBidi" w:cstheme="majorBidi"/>
+        </w:rPr>
+        <w:t xml:space="preserve"> → returns 0 </w:t>
       </w:r>
     </w:p>
     <w:p>
@@ -2919,7 +4164,25 @@
           <w:b/>
           <w:bCs/>
         </w:rPr>
-        <w:t>7. Method: intersect(Multiset&lt;T&gt; other)</w:t>
+        <w:t xml:space="preserve">7. Method: </w:t>
+      </w:r>
+      <w:proofErr w:type="gramStart"/>
+      <w:r>
+        <w:rPr>
+          <w:rFonts w:asciiTheme="majorBidi" w:hAnsiTheme="majorBidi" w:cstheme="majorBidi"/>
+          <w:b/>
+          <w:bCs/>
+        </w:rPr>
+        <w:t>intersect(</w:t>
+      </w:r>
+      <w:proofErr w:type="gramEnd"/>
+      <w:r>
+        <w:rPr>
+          <w:rFonts w:asciiTheme="majorBidi" w:hAnsiTheme="majorBidi" w:cstheme="majorBidi"/>
+          <w:b/>
+          <w:bCs/>
+        </w:rPr>
+        <w:t>Multiset&lt;T&gt; other)</w:t>
       </w:r>
     </w:p>
     <w:p>
@@ -3108,7 +4371,21 @@
         <w:rPr>
           <w:rFonts w:asciiTheme="majorBidi" w:hAnsiTheme="majorBidi" w:cstheme="majorBidi"/>
         </w:rPr>
-        <w:t xml:space="preserve"> multiplicity = min(count1, count2) </w:t>
+        <w:t xml:space="preserve"> multiplicity = </w:t>
+      </w:r>
+      <w:proofErr w:type="gramStart"/>
+      <w:r>
+        <w:rPr>
+          <w:rFonts w:asciiTheme="majorBidi" w:hAnsiTheme="majorBidi" w:cstheme="majorBidi"/>
+        </w:rPr>
+        <w:t>min(</w:t>
+      </w:r>
+      <w:proofErr w:type="gramEnd"/>
+      <w:r>
+        <w:rPr>
+          <w:rFonts w:asciiTheme="majorBidi" w:hAnsiTheme="majorBidi" w:cstheme="majorBidi"/>
+        </w:rPr>
+        <w:t xml:space="preserve">count1, count2) </w:t>
       </w:r>
     </w:p>
     <w:p>
@@ -3173,7 +4450,35 @@
           <w:b/>
           <w:bCs/>
         </w:rPr>
-        <w:t>8. Method: totalCount()</w:t>
+        <w:t xml:space="preserve">8. Method: </w:t>
+      </w:r>
+      <w:proofErr w:type="spellStart"/>
+      <w:proofErr w:type="gramStart"/>
+      <w:r>
+        <w:rPr>
+          <w:rFonts w:asciiTheme="majorBidi" w:hAnsiTheme="majorBidi" w:cstheme="majorBidi"/>
+          <w:b/>
+          <w:bCs/>
+        </w:rPr>
+        <w:t>totalCount</w:t>
+      </w:r>
+      <w:proofErr w:type="spellEnd"/>
+      <w:r>
+        <w:rPr>
+          <w:rFonts w:asciiTheme="majorBidi" w:hAnsiTheme="majorBidi" w:cstheme="majorBidi"/>
+          <w:b/>
+          <w:bCs/>
+        </w:rPr>
+        <w:t>(</w:t>
+      </w:r>
+      <w:proofErr w:type="gramEnd"/>
+      <w:r>
+        <w:rPr>
+          <w:rFonts w:asciiTheme="majorBidi" w:hAnsiTheme="majorBidi" w:cstheme="majorBidi"/>
+          <w:b/>
+          <w:bCs/>
+        </w:rPr>
+        <w:t>)</w:t>
       </w:r>
     </w:p>
     <w:p>
@@ -3304,6 +4609,7 @@
         <w:rPr>
           <w:rFonts w:asciiTheme="majorBidi" w:hAnsiTheme="majorBidi" w:cstheme="majorBidi"/>
         </w:rPr>
+        <w:lastRenderedPageBreak/>
         <w:t xml:space="preserve">One element </w:t>
       </w:r>
       <w:r>
@@ -3381,24 +4687,51 @@
           <w:b/>
           <w:bCs/>
         </w:rPr>
-        <w:t>9. Method: toList()</w:t>
-      </w:r>
-    </w:p>
-    <w:p>
-      <w:pPr>
-        <w:rPr>
-          <w:rFonts w:asciiTheme="majorBidi" w:hAnsiTheme="majorBidi" w:cstheme="majorBidi"/>
-          <w:b/>
-          <w:bCs/>
-        </w:rPr>
-      </w:pPr>
-      <w:r>
-        <w:rPr>
-          <w:rFonts w:asciiTheme="majorBidi" w:hAnsiTheme="majorBidi" w:cstheme="majorBidi"/>
-          <w:b/>
-          <w:bCs/>
-        </w:rPr>
-        <w:lastRenderedPageBreak/>
+        <w:t xml:space="preserve">9. Method: </w:t>
+      </w:r>
+      <w:proofErr w:type="spellStart"/>
+      <w:proofErr w:type="gramStart"/>
+      <w:r>
+        <w:rPr>
+          <w:rFonts w:asciiTheme="majorBidi" w:hAnsiTheme="majorBidi" w:cstheme="majorBidi"/>
+          <w:b/>
+          <w:bCs/>
+        </w:rPr>
+        <w:t>toList</w:t>
+      </w:r>
+      <w:proofErr w:type="spellEnd"/>
+      <w:r>
+        <w:rPr>
+          <w:rFonts w:asciiTheme="majorBidi" w:hAnsiTheme="majorBidi" w:cstheme="majorBidi"/>
+          <w:b/>
+          <w:bCs/>
+        </w:rPr>
+        <w:t>(</w:t>
+      </w:r>
+      <w:proofErr w:type="gramEnd"/>
+      <w:r>
+        <w:rPr>
+          <w:rFonts w:asciiTheme="majorBidi" w:hAnsiTheme="majorBidi" w:cstheme="majorBidi"/>
+          <w:b/>
+          <w:bCs/>
+        </w:rPr>
+        <w:t>)</w:t>
+      </w:r>
+    </w:p>
+    <w:p>
+      <w:pPr>
+        <w:rPr>
+          <w:rFonts w:asciiTheme="majorBidi" w:hAnsiTheme="majorBidi" w:cstheme="majorBidi"/>
+          <w:b/>
+          <w:bCs/>
+        </w:rPr>
+      </w:pPr>
+      <w:r>
+        <w:rPr>
+          <w:rFonts w:asciiTheme="majorBidi" w:hAnsiTheme="majorBidi" w:cstheme="majorBidi"/>
+          <w:b/>
+          <w:bCs/>
+        </w:rPr>
         <w:t>Partitions (ISP)</w:t>
       </w:r>
     </w:p>
@@ -3433,7 +4766,21 @@
         <w:rPr>
           <w:rFonts w:asciiTheme="majorBidi" w:hAnsiTheme="majorBidi" w:cstheme="majorBidi"/>
         </w:rPr>
-        <w:t xml:space="preserve">Single element (mult = 1) </w:t>
+        <w:t>Single element (</w:t>
+      </w:r>
+      <w:proofErr w:type="spellStart"/>
+      <w:r>
+        <w:rPr>
+          <w:rFonts w:asciiTheme="majorBidi" w:hAnsiTheme="majorBidi" w:cstheme="majorBidi"/>
+        </w:rPr>
+        <w:t>mult</w:t>
+      </w:r>
+      <w:proofErr w:type="spellEnd"/>
+      <w:r>
+        <w:rPr>
+          <w:rFonts w:asciiTheme="majorBidi" w:hAnsiTheme="majorBidi" w:cstheme="majorBidi"/>
+        </w:rPr>
+        <w:t xml:space="preserve"> = 1) </w:t>
       </w:r>
     </w:p>
     <w:p>
@@ -3450,7 +4797,21 @@
         <w:rPr>
           <w:rFonts w:asciiTheme="majorBidi" w:hAnsiTheme="majorBidi" w:cstheme="majorBidi"/>
         </w:rPr>
-        <w:t xml:space="preserve">Single element (mult &gt; 1) </w:t>
+        <w:t>Single element (</w:t>
+      </w:r>
+      <w:proofErr w:type="spellStart"/>
+      <w:r>
+        <w:rPr>
+          <w:rFonts w:asciiTheme="majorBidi" w:hAnsiTheme="majorBidi" w:cstheme="majorBidi"/>
+        </w:rPr>
+        <w:t>mult</w:t>
+      </w:r>
+      <w:proofErr w:type="spellEnd"/>
+      <w:r>
+        <w:rPr>
+          <w:rFonts w:asciiTheme="majorBidi" w:hAnsiTheme="majorBidi" w:cstheme="majorBidi"/>
+        </w:rPr>
+        <w:t xml:space="preserve"> &gt; 1) </w:t>
       </w:r>
     </w:p>
     <w:p>
@@ -3670,7 +5031,35 @@
           <w:b/>
           <w:bCs/>
         </w:rPr>
-        <w:t>10. Method: toString()</w:t>
+        <w:t xml:space="preserve">10. Method: </w:t>
+      </w:r>
+      <w:proofErr w:type="spellStart"/>
+      <w:proofErr w:type="gramStart"/>
+      <w:r>
+        <w:rPr>
+          <w:rFonts w:asciiTheme="majorBidi" w:hAnsiTheme="majorBidi" w:cstheme="majorBidi"/>
+          <w:b/>
+          <w:bCs/>
+        </w:rPr>
+        <w:t>toString</w:t>
+      </w:r>
+      <w:proofErr w:type="spellEnd"/>
+      <w:r>
+        <w:rPr>
+          <w:rFonts w:asciiTheme="majorBidi" w:hAnsiTheme="majorBidi" w:cstheme="majorBidi"/>
+          <w:b/>
+          <w:bCs/>
+        </w:rPr>
+        <w:t>(</w:t>
+      </w:r>
+      <w:proofErr w:type="gramEnd"/>
+      <w:r>
+        <w:rPr>
+          <w:rFonts w:asciiTheme="majorBidi" w:hAnsiTheme="majorBidi" w:cstheme="majorBidi"/>
+          <w:b/>
+          <w:bCs/>
+        </w:rPr>
+        <w:t>)</w:t>
       </w:r>
     </w:p>
     <w:p>
@@ -3721,7 +5110,21 @@
         <w:rPr>
           <w:rFonts w:asciiTheme="majorBidi" w:hAnsiTheme="majorBidi" w:cstheme="majorBidi"/>
         </w:rPr>
-        <w:t xml:space="preserve">Single element (mult = 1) </w:t>
+        <w:t>Single element (</w:t>
+      </w:r>
+      <w:proofErr w:type="spellStart"/>
+      <w:r>
+        <w:rPr>
+          <w:rFonts w:asciiTheme="majorBidi" w:hAnsiTheme="majorBidi" w:cstheme="majorBidi"/>
+        </w:rPr>
+        <w:t>mult</w:t>
+      </w:r>
+      <w:proofErr w:type="spellEnd"/>
+      <w:r>
+        <w:rPr>
+          <w:rFonts w:asciiTheme="majorBidi" w:hAnsiTheme="majorBidi" w:cstheme="majorBidi"/>
+        </w:rPr>
+        <w:t xml:space="preserve"> = 1) </w:t>
       </w:r>
     </w:p>
     <w:p>
@@ -3738,7 +5141,21 @@
         <w:rPr>
           <w:rFonts w:asciiTheme="majorBidi" w:hAnsiTheme="majorBidi" w:cstheme="majorBidi"/>
         </w:rPr>
-        <w:t xml:space="preserve">Single element (mult &gt; 1) </w:t>
+        <w:t>Single element (</w:t>
+      </w:r>
+      <w:proofErr w:type="spellStart"/>
+      <w:r>
+        <w:rPr>
+          <w:rFonts w:asciiTheme="majorBidi" w:hAnsiTheme="majorBidi" w:cstheme="majorBidi"/>
+        </w:rPr>
+        <w:t>mult</w:t>
+      </w:r>
+      <w:proofErr w:type="spellEnd"/>
+      <w:r>
+        <w:rPr>
+          <w:rFonts w:asciiTheme="majorBidi" w:hAnsiTheme="majorBidi" w:cstheme="majorBidi"/>
+        </w:rPr>
+        <w:t xml:space="preserve"> &gt; 1) </w:t>
       </w:r>
     </w:p>
     <w:p>
@@ -3852,6 +5269,7 @@
         <w:rPr>
           <w:rFonts w:asciiTheme="majorBidi" w:hAnsiTheme="majorBidi" w:cstheme="majorBidi"/>
         </w:rPr>
+        <w:lastRenderedPageBreak/>
         <w:t xml:space="preserve">Single element </w:t>
       </w:r>
       <w:r>
@@ -3864,7 +5282,21 @@
         <w:rPr>
           <w:rFonts w:asciiTheme="majorBidi" w:hAnsiTheme="majorBidi" w:cstheme="majorBidi"/>
         </w:rPr>
-        <w:t xml:space="preserve"> "{a}" </w:t>
+        <w:t xml:space="preserve"> "{</w:t>
+      </w:r>
+      <w:proofErr w:type="gramStart"/>
+      <w:r>
+        <w:rPr>
+          <w:rFonts w:asciiTheme="majorBidi" w:hAnsiTheme="majorBidi" w:cstheme="majorBidi"/>
+        </w:rPr>
+        <w:t>a}"</w:t>
+      </w:r>
+      <w:proofErr w:type="gramEnd"/>
+      <w:r>
+        <w:rPr>
+          <w:rFonts w:asciiTheme="majorBidi" w:hAnsiTheme="majorBidi" w:cstheme="majorBidi"/>
+        </w:rPr>
+        <w:t xml:space="preserve"> </w:t>
       </w:r>
     </w:p>
     <w:p>
@@ -3893,7 +5325,35 @@
         <w:rPr>
           <w:rFonts w:asciiTheme="majorBidi" w:hAnsiTheme="majorBidi" w:cstheme="majorBidi"/>
         </w:rPr>
-        <w:t xml:space="preserve"> "{a^n}" </w:t>
+        <w:t xml:space="preserve"> "{</w:t>
+      </w:r>
+      <w:proofErr w:type="spellStart"/>
+      <w:r>
+        <w:rPr>
+          <w:rFonts w:asciiTheme="majorBidi" w:hAnsiTheme="majorBidi" w:cstheme="majorBidi"/>
+        </w:rPr>
+        <w:t>a^</w:t>
+      </w:r>
+      <w:proofErr w:type="gramStart"/>
+      <w:r>
+        <w:rPr>
+          <w:rFonts w:asciiTheme="majorBidi" w:hAnsiTheme="majorBidi" w:cstheme="majorBidi"/>
+        </w:rPr>
+        <w:t>n</w:t>
+      </w:r>
+      <w:proofErr w:type="spellEnd"/>
+      <w:r>
+        <w:rPr>
+          <w:rFonts w:asciiTheme="majorBidi" w:hAnsiTheme="majorBidi" w:cstheme="majorBidi"/>
+        </w:rPr>
+        <w:t>}"</w:t>
+      </w:r>
+      <w:proofErr w:type="gramEnd"/>
+      <w:r>
+        <w:rPr>
+          <w:rFonts w:asciiTheme="majorBidi" w:hAnsiTheme="majorBidi" w:cstheme="majorBidi"/>
+        </w:rPr>
+        <w:t xml:space="preserve"> </w:t>
       </w:r>
     </w:p>
     <w:p>
@@ -3958,8 +5418,25 @@
           <w:b/>
           <w:bCs/>
         </w:rPr>
-        <w:lastRenderedPageBreak/>
-        <w:t>11. Method: equals(Object o)</w:t>
+        <w:t xml:space="preserve">11. Method: </w:t>
+      </w:r>
+      <w:proofErr w:type="gramStart"/>
+      <w:r>
+        <w:rPr>
+          <w:rFonts w:asciiTheme="majorBidi" w:hAnsiTheme="majorBidi" w:cstheme="majorBidi"/>
+          <w:b/>
+          <w:bCs/>
+        </w:rPr>
+        <w:t>equals(</w:t>
+      </w:r>
+      <w:proofErr w:type="gramEnd"/>
+      <w:r>
+        <w:rPr>
+          <w:rFonts w:asciiTheme="majorBidi" w:hAnsiTheme="majorBidi" w:cstheme="majorBidi"/>
+          <w:b/>
+          <w:bCs/>
+        </w:rPr>
+        <w:t>Object o)</w:t>
       </w:r>
     </w:p>
     <w:p>
@@ -4010,7 +5487,21 @@
         <w:rPr>
           <w:rFonts w:asciiTheme="majorBidi" w:hAnsiTheme="majorBidi" w:cstheme="majorBidi"/>
         </w:rPr>
-        <w:t xml:space="preserve">Different type </w:t>
+        <w:t xml:space="preserve">Different </w:t>
+      </w:r>
+      <w:proofErr w:type="gramStart"/>
+      <w:r>
+        <w:rPr>
+          <w:rFonts w:asciiTheme="majorBidi" w:hAnsiTheme="majorBidi" w:cstheme="majorBidi"/>
+        </w:rPr>
+        <w:t>type</w:t>
+      </w:r>
+      <w:proofErr w:type="gramEnd"/>
+      <w:r>
+        <w:rPr>
+          <w:rFonts w:asciiTheme="majorBidi" w:hAnsiTheme="majorBidi" w:cstheme="majorBidi"/>
+        </w:rPr>
+        <w:t xml:space="preserve"> </w:t>
       </w:r>
     </w:p>
     <w:p>
@@ -12043,7 +13534,7 @@
   <w:style w:type="paragraph" w:default="1" w:styleId="Normal">
     <w:name w:val="Normal"/>
     <w:qFormat/>
-    <w:rsid w:val="001F074C"/>
+    <w:rsid w:val="000E6635"/>
   </w:style>
   <w:style w:type="paragraph" w:styleId="Heading1">
     <w:name w:val="heading 1"/>
@@ -12247,7 +13738,6 @@
   <w:style w:type="character" w:default="1" w:styleId="DefaultParagraphFont">
     <w:name w:val="Default Paragraph Font"/>
     <w:uiPriority w:val="1"/>
-    <w:semiHidden/>
     <w:unhideWhenUsed/>
   </w:style>
   <w:style w:type="table" w:default="1" w:styleId="TableNormal">

</xml_diff>

<commit_message>
documenation part 1 update
</commit_message>
<xml_diff>
--- a/Assignment-1-part 1-Report.docx
+++ b/Assignment-1-part 1-Report.docx
@@ -731,25 +731,7 @@
           <w:b/>
           <w:bCs/>
         </w:rPr>
-        <w:t xml:space="preserve">1. Method: </w:t>
-      </w:r>
-      <w:proofErr w:type="gramStart"/>
-      <w:r>
-        <w:rPr>
-          <w:rFonts w:asciiTheme="majorBidi" w:hAnsiTheme="majorBidi" w:cstheme="majorBidi"/>
-          <w:b/>
-          <w:bCs/>
-        </w:rPr>
-        <w:t>repeat(</w:t>
-      </w:r>
-      <w:proofErr w:type="gramEnd"/>
-      <w:r>
-        <w:rPr>
-          <w:rFonts w:asciiTheme="majorBidi" w:hAnsiTheme="majorBidi" w:cstheme="majorBidi"/>
-          <w:b/>
-          <w:bCs/>
-        </w:rPr>
-        <w:t>String s, int n)</w:t>
+        <w:t>1. Method: repeat(String s, int n)</w:t>
       </w:r>
     </w:p>
     <w:p>
@@ -885,43 +867,7 @@
           <w:b/>
           <w:bCs/>
         </w:rPr>
-        <w:t xml:space="preserve"> </w:t>
-      </w:r>
-      <w:proofErr w:type="gramStart"/>
-      <w:r>
-        <w:rPr>
-          <w:rFonts w:asciiTheme="majorBidi" w:hAnsiTheme="majorBidi" w:cstheme="majorBidi"/>
-          <w:b/>
-          <w:bCs/>
-        </w:rPr>
-        <w:t>( 4</w:t>
-      </w:r>
-      <w:proofErr w:type="gramEnd"/>
-      <w:r>
-        <w:rPr>
-          <w:rFonts w:asciiTheme="majorBidi" w:hAnsiTheme="majorBidi" w:cstheme="majorBidi"/>
-          <w:b/>
-          <w:bCs/>
-        </w:rPr>
-        <w:t xml:space="preserve"> test + 2 </w:t>
-      </w:r>
-      <w:proofErr w:type="gramStart"/>
-      <w:r>
-        <w:rPr>
-          <w:rFonts w:asciiTheme="majorBidi" w:hAnsiTheme="majorBidi" w:cstheme="majorBidi"/>
-          <w:b/>
-          <w:bCs/>
-        </w:rPr>
-        <w:t>boundary</w:t>
-      </w:r>
-      <w:proofErr w:type="gramEnd"/>
-      <w:r>
-        <w:rPr>
-          <w:rFonts w:asciiTheme="majorBidi" w:hAnsiTheme="majorBidi" w:cstheme="majorBidi"/>
-          <w:b/>
-          <w:bCs/>
-        </w:rPr>
-        <w:t>)</w:t>
+        <w:t xml:space="preserve"> ( 4 test + 2 boundary)</w:t>
       </w:r>
     </w:p>
     <w:p>
@@ -1226,7 +1172,6 @@
         <w:t xml:space="preserve">2. Method: </w:t>
       </w:r>
       <w:proofErr w:type="spellStart"/>
-      <w:proofErr w:type="gramStart"/>
       <w:r>
         <w:rPr>
           <w:rFonts w:asciiTheme="majorBidi" w:hAnsiTheme="majorBidi" w:cstheme="majorBidi"/>
@@ -1242,16 +1187,7 @@
           <w:b/>
           <w:bCs/>
         </w:rPr>
-        <w:t>(</w:t>
-      </w:r>
-      <w:proofErr w:type="gramEnd"/>
-      <w:r>
-        <w:rPr>
-          <w:rFonts w:asciiTheme="majorBidi" w:hAnsiTheme="majorBidi" w:cstheme="majorBidi"/>
-          <w:b/>
-          <w:bCs/>
-        </w:rPr>
-        <w:t>String s, String mask)</w:t>
+        <w:t>(String s, String mask)</w:t>
       </w:r>
     </w:p>
     <w:p>
@@ -1351,7 +1287,6 @@
         </w:rPr>
       </w:pPr>
       <w:proofErr w:type="spellStart"/>
-      <w:proofErr w:type="gramStart"/>
       <w:r>
         <w:rPr>
           <w:rFonts w:asciiTheme="majorBidi" w:hAnsiTheme="majorBidi" w:cstheme="majorBidi"/>
@@ -1359,7 +1294,6 @@
         <w:t>s.length</w:t>
       </w:r>
       <w:proofErr w:type="spellEnd"/>
-      <w:proofErr w:type="gramEnd"/>
       <w:r>
         <w:rPr>
           <w:rFonts w:asciiTheme="majorBidi" w:hAnsiTheme="majorBidi" w:cstheme="majorBidi"/>
@@ -1367,7 +1301,6 @@
         <w:t xml:space="preserve"> = </w:t>
       </w:r>
       <w:proofErr w:type="spellStart"/>
-      <w:proofErr w:type="gramStart"/>
       <w:r>
         <w:rPr>
           <w:rFonts w:asciiTheme="majorBidi" w:hAnsiTheme="majorBidi" w:cstheme="majorBidi"/>
@@ -1375,7 +1308,6 @@
         <w:t>mask.length</w:t>
       </w:r>
       <w:proofErr w:type="spellEnd"/>
-      <w:proofErr w:type="gramEnd"/>
     </w:p>
     <w:p>
       <w:pPr>
@@ -1388,7 +1320,6 @@
         </w:rPr>
       </w:pPr>
       <w:proofErr w:type="spellStart"/>
-      <w:proofErr w:type="gramStart"/>
       <w:r>
         <w:rPr>
           <w:rFonts w:asciiTheme="majorBidi" w:hAnsiTheme="majorBidi" w:cstheme="majorBidi"/>
@@ -1396,7 +1327,6 @@
         <w:t>s.length</w:t>
       </w:r>
       <w:proofErr w:type="spellEnd"/>
-      <w:proofErr w:type="gramEnd"/>
       <w:r>
         <w:rPr>
           <w:rFonts w:asciiTheme="majorBidi" w:hAnsiTheme="majorBidi" w:cstheme="majorBidi"/>
@@ -1404,7 +1334,6 @@
         <w:t xml:space="preserve"> = </w:t>
       </w:r>
       <w:proofErr w:type="spellStart"/>
-      <w:proofErr w:type="gramStart"/>
       <w:r>
         <w:rPr>
           <w:rFonts w:asciiTheme="majorBidi" w:hAnsiTheme="majorBidi" w:cstheme="majorBidi"/>
@@ -1412,7 +1341,6 @@
         <w:t>mask.length</w:t>
       </w:r>
       <w:proofErr w:type="spellEnd"/>
-      <w:proofErr w:type="gramEnd"/>
       <w:r>
         <w:rPr>
           <w:rFonts w:asciiTheme="majorBidi" w:hAnsiTheme="majorBidi" w:cstheme="majorBidi"/>
@@ -1434,16 +1362,7 @@
           <w:b/>
           <w:bCs/>
         </w:rPr>
-        <w:t xml:space="preserve">Each Choice: Test Cases </w:t>
-      </w:r>
-      <w:proofErr w:type="gramStart"/>
-      <w:r>
-        <w:rPr>
-          <w:rFonts w:asciiTheme="majorBidi" w:hAnsiTheme="majorBidi" w:cstheme="majorBidi"/>
-          <w:b/>
-          <w:bCs/>
-        </w:rPr>
-        <w:t xml:space="preserve">( </w:t>
+        <w:t xml:space="preserve">Each Choice: Test Cases ( </w:t>
       </w:r>
       <w:r>
         <w:rPr>
@@ -1453,7 +1372,6 @@
         </w:rPr>
         <w:t>5</w:t>
       </w:r>
-      <w:proofErr w:type="gramEnd"/>
       <w:r>
         <w:rPr>
           <w:rFonts w:asciiTheme="majorBidi" w:hAnsiTheme="majorBidi" w:cstheme="majorBidi"/>
@@ -1914,7 +1832,6 @@
         <w:t xml:space="preserve">3. Method: </w:t>
       </w:r>
       <w:proofErr w:type="spellStart"/>
-      <w:proofErr w:type="gramStart"/>
       <w:r>
         <w:rPr>
           <w:rFonts w:asciiTheme="majorBidi" w:hAnsiTheme="majorBidi" w:cstheme="majorBidi"/>
@@ -1930,16 +1847,7 @@
           <w:b/>
           <w:bCs/>
         </w:rPr>
-        <w:t>(</w:t>
-      </w:r>
-      <w:proofErr w:type="gramEnd"/>
-      <w:r>
-        <w:rPr>
-          <w:rFonts w:asciiTheme="majorBidi" w:hAnsiTheme="majorBidi" w:cstheme="majorBidi"/>
-          <w:b/>
-          <w:bCs/>
-        </w:rPr>
-        <w:t>String s, String mask)</w:t>
+        <w:t>(String s, String mask)</w:t>
       </w:r>
     </w:p>
     <w:p>
@@ -2242,19 +2150,7 @@
         <w:rPr>
           <w:rFonts w:asciiTheme="majorBidi" w:hAnsiTheme="majorBidi" w:cstheme="majorBidi"/>
         </w:rPr>
-        <w:t xml:space="preserve"> "</w:t>
-      </w:r>
-      <w:r>
-        <w:rPr>
-          <w:rFonts w:asciiTheme="majorBidi" w:hAnsiTheme="majorBidi" w:cstheme="majorBidi"/>
-        </w:rPr>
-        <w:t>1a</w:t>
-      </w:r>
-      <w:r>
-        <w:rPr>
-          <w:rFonts w:asciiTheme="majorBidi" w:hAnsiTheme="majorBidi" w:cstheme="majorBidi"/>
-        </w:rPr>
-        <w:t>"</w:t>
+        <w:t xml:space="preserve"> ""</w:t>
       </w:r>
       <w:r>
         <w:rPr>
@@ -2387,25 +2283,7 @@
           <w:b/>
           <w:bCs/>
         </w:rPr>
-        <w:t xml:space="preserve">1. Method: </w:t>
-      </w:r>
-      <w:proofErr w:type="gramStart"/>
-      <w:r>
-        <w:rPr>
-          <w:rFonts w:asciiTheme="majorBidi" w:hAnsiTheme="majorBidi" w:cstheme="majorBidi"/>
-          <w:b/>
-          <w:bCs/>
-        </w:rPr>
-        <w:t>add(</w:t>
-      </w:r>
-      <w:proofErr w:type="gramEnd"/>
-      <w:r>
-        <w:rPr>
-          <w:rFonts w:asciiTheme="majorBidi" w:hAnsiTheme="majorBidi" w:cstheme="majorBidi"/>
-          <w:b/>
-          <w:bCs/>
-        </w:rPr>
-        <w:t>T entry)</w:t>
+        <w:t>1. Method: add(T entry)</w:t>
       </w:r>
     </w:p>
     <w:p>
@@ -2427,9 +2305,10 @@
     </w:p>
     <w:p>
       <w:pPr>
+        <w:pStyle w:val="ListParagraph"/>
         <w:numPr>
           <w:ilvl w:val="0"/>
-          <w:numId w:val="24"/>
+          <w:numId w:val="9"/>
         </w:numPr>
         <w:rPr>
           <w:rFonts w:asciiTheme="majorBidi" w:hAnsiTheme="majorBidi" w:cstheme="majorBidi"/>
@@ -2439,26 +2318,15 @@
         <w:rPr>
           <w:rFonts w:asciiTheme="majorBidi" w:hAnsiTheme="majorBidi" w:cstheme="majorBidi"/>
         </w:rPr>
-        <w:t xml:space="preserve">Entry </w:t>
-      </w:r>
-      <w:r>
-        <w:rPr>
-          <w:rFonts w:asciiTheme="majorBidi" w:hAnsiTheme="majorBidi" w:cstheme="majorBidi"/>
-        </w:rPr>
-        <w:t xml:space="preserve">doesn’t exist </w:t>
-      </w:r>
-      <w:r>
-        <w:rPr>
-          <w:rFonts w:asciiTheme="majorBidi" w:hAnsiTheme="majorBidi" w:cstheme="majorBidi"/>
-        </w:rPr>
-        <w:t xml:space="preserve">(new element) </w:t>
-      </w:r>
-    </w:p>
-    <w:p>
-      <w:pPr>
+        <w:t xml:space="preserve">null </w:t>
+      </w:r>
+    </w:p>
+    <w:p>
+      <w:pPr>
+        <w:pStyle w:val="ListParagraph"/>
         <w:numPr>
           <w:ilvl w:val="0"/>
-          <w:numId w:val="24"/>
+          <w:numId w:val="9"/>
         </w:numPr>
         <w:rPr>
           <w:rFonts w:asciiTheme="majorBidi" w:hAnsiTheme="majorBidi" w:cstheme="majorBidi"/>
@@ -2468,13 +2336,25 @@
         <w:rPr>
           <w:rFonts w:asciiTheme="majorBidi" w:hAnsiTheme="majorBidi" w:cstheme="majorBidi"/>
         </w:rPr>
-        <w:t>Entry</w:t>
-      </w:r>
-      <w:r>
-        <w:rPr>
-          <w:rFonts w:asciiTheme="majorBidi" w:hAnsiTheme="majorBidi" w:cstheme="majorBidi"/>
-        </w:rPr>
-        <w:t xml:space="preserve"> exists</w:t>
+        <w:t xml:space="preserve">new element </w:t>
+      </w:r>
+    </w:p>
+    <w:p>
+      <w:pPr>
+        <w:pStyle w:val="ListParagraph"/>
+        <w:numPr>
+          <w:ilvl w:val="0"/>
+          <w:numId w:val="9"/>
+        </w:numPr>
+        <w:rPr>
+          <w:rFonts w:asciiTheme="majorBidi" w:hAnsiTheme="majorBidi" w:cstheme="majorBidi"/>
+        </w:rPr>
+      </w:pPr>
+      <w:r>
+        <w:rPr>
+          <w:rFonts w:asciiTheme="majorBidi" w:hAnsiTheme="majorBidi" w:cstheme="majorBidi"/>
+        </w:rPr>
+        <w:t>existing element</w:t>
       </w:r>
     </w:p>
     <w:p>
@@ -2508,7 +2388,7 @@
         <w:rPr>
           <w:rFonts w:asciiTheme="majorBidi" w:hAnsiTheme="majorBidi" w:cstheme="majorBidi"/>
         </w:rPr>
-        <w:t xml:space="preserve">Add new element → multiplicity becomes 1, return = 0 </w:t>
+        <w:t>initial: {}, add( “a”), return 0, result: a=1</w:t>
       </w:r>
     </w:p>
     <w:p>
@@ -2525,7 +2405,84 @@
         <w:rPr>
           <w:rFonts w:asciiTheme="majorBidi" w:hAnsiTheme="majorBidi" w:cstheme="majorBidi"/>
         </w:rPr>
-        <w:t xml:space="preserve">Add existing element → multiplicity increments, return = old multiplicity </w:t>
+        <w:t>initial: {</w:t>
+      </w:r>
+      <w:r>
+        <w:rPr>
+          <w:rFonts w:asciiTheme="majorBidi" w:hAnsiTheme="majorBidi" w:cstheme="majorBidi"/>
+        </w:rPr>
+        <w:t>a=1</w:t>
+      </w:r>
+      <w:r>
+        <w:rPr>
+          <w:rFonts w:asciiTheme="majorBidi" w:hAnsiTheme="majorBidi" w:cstheme="majorBidi"/>
+        </w:rPr>
+        <w:t xml:space="preserve">}, add( “a”), return </w:t>
+      </w:r>
+      <w:r>
+        <w:rPr>
+          <w:rFonts w:asciiTheme="majorBidi" w:hAnsiTheme="majorBidi" w:cstheme="majorBidi"/>
+        </w:rPr>
+        <w:t>1</w:t>
+      </w:r>
+      <w:r>
+        <w:rPr>
+          <w:rFonts w:asciiTheme="majorBidi" w:hAnsiTheme="majorBidi" w:cstheme="majorBidi"/>
+        </w:rPr>
+        <w:t>, result: a=</w:t>
+      </w:r>
+      <w:r>
+        <w:rPr>
+          <w:rFonts w:asciiTheme="majorBidi" w:hAnsiTheme="majorBidi" w:cstheme="majorBidi"/>
+        </w:rPr>
+        <w:t>2</w:t>
+      </w:r>
+    </w:p>
+    <w:p>
+      <w:pPr>
+        <w:numPr>
+          <w:ilvl w:val="0"/>
+          <w:numId w:val="25"/>
+        </w:numPr>
+        <w:rPr>
+          <w:rFonts w:asciiTheme="majorBidi" w:hAnsiTheme="majorBidi" w:cstheme="majorBidi"/>
+        </w:rPr>
+      </w:pPr>
+      <w:r>
+        <w:rPr>
+          <w:rFonts w:asciiTheme="majorBidi" w:hAnsiTheme="majorBidi" w:cstheme="majorBidi"/>
+        </w:rPr>
+        <w:t xml:space="preserve">initial: {}, add( </w:t>
+      </w:r>
+      <w:r>
+        <w:rPr>
+          <w:rFonts w:asciiTheme="majorBidi" w:hAnsiTheme="majorBidi" w:cstheme="majorBidi"/>
+        </w:rPr>
+        <w:t xml:space="preserve">null </w:t>
+      </w:r>
+      <w:r>
+        <w:rPr>
+          <w:rFonts w:asciiTheme="majorBidi" w:hAnsiTheme="majorBidi" w:cstheme="majorBidi"/>
+        </w:rPr>
+        <w:t xml:space="preserve">), return </w:t>
+      </w:r>
+      <w:r>
+        <w:rPr>
+          <w:rFonts w:asciiTheme="majorBidi" w:hAnsiTheme="majorBidi" w:cstheme="majorBidi"/>
+        </w:rPr>
+        <w:t>0</w:t>
+      </w:r>
+      <w:r>
+        <w:rPr>
+          <w:rFonts w:asciiTheme="majorBidi" w:hAnsiTheme="majorBidi" w:cstheme="majorBidi"/>
+        </w:rPr>
+        <w:t xml:space="preserve">, result: </w:t>
+      </w:r>
+      <w:r>
+        <w:rPr>
+          <w:rFonts w:asciiTheme="majorBidi" w:hAnsiTheme="majorBidi" w:cstheme="majorBidi"/>
+        </w:rPr>
+        <w:t>null =1</w:t>
       </w:r>
     </w:p>
     <w:p>
@@ -2561,25 +2518,8 @@
           <w:b/>
           <w:bCs/>
         </w:rPr>
-        <w:t xml:space="preserve">2. Method: </w:t>
-      </w:r>
-      <w:proofErr w:type="gramStart"/>
-      <w:r>
-        <w:rPr>
-          <w:rFonts w:asciiTheme="majorBidi" w:hAnsiTheme="majorBidi" w:cstheme="majorBidi"/>
-          <w:b/>
-          <w:bCs/>
-        </w:rPr>
-        <w:t>add(</w:t>
-      </w:r>
-      <w:proofErr w:type="gramEnd"/>
-      <w:r>
-        <w:rPr>
-          <w:rFonts w:asciiTheme="majorBidi" w:hAnsiTheme="majorBidi" w:cstheme="majorBidi"/>
-          <w:b/>
-          <w:bCs/>
-        </w:rPr>
-        <w:t xml:space="preserve">T entry, int </w:t>
+        <w:lastRenderedPageBreak/>
+        <w:t xml:space="preserve">2. Method: add(T entry, int </w:t>
       </w:r>
       <w:proofErr w:type="spellStart"/>
       <w:r>
@@ -2614,8 +2554,28 @@
           <w:b/>
           <w:bCs/>
         </w:rPr>
-        <w:lastRenderedPageBreak/>
         <w:t>Partitions (ISP)</w:t>
+      </w:r>
+    </w:p>
+    <w:p>
+      <w:pPr>
+        <w:rPr>
+          <w:rFonts w:asciiTheme="majorBidi" w:hAnsiTheme="majorBidi" w:cstheme="majorBidi"/>
+        </w:rPr>
+      </w:pPr>
+      <w:proofErr w:type="spellStart"/>
+      <w:r>
+        <w:rPr>
+          <w:rFonts w:asciiTheme="majorBidi" w:hAnsiTheme="majorBidi" w:cstheme="majorBidi"/>
+        </w:rPr>
+        <w:t>mult</w:t>
+      </w:r>
+      <w:proofErr w:type="spellEnd"/>
+      <w:r>
+        <w:rPr>
+          <w:rFonts w:asciiTheme="majorBidi" w:hAnsiTheme="majorBidi" w:cstheme="majorBidi"/>
+        </w:rPr>
+        <w:t>:</w:t>
       </w:r>
     </w:p>
     <w:p>
@@ -2628,19 +2588,11 @@
           <w:rFonts w:asciiTheme="majorBidi" w:hAnsiTheme="majorBidi" w:cstheme="majorBidi"/>
         </w:rPr>
       </w:pPr>
-      <w:proofErr w:type="spellStart"/>
-      <w:r>
-        <w:rPr>
-          <w:rFonts w:asciiTheme="majorBidi" w:hAnsiTheme="majorBidi" w:cstheme="majorBidi"/>
-        </w:rPr>
-        <w:t>mult</w:t>
-      </w:r>
-      <w:proofErr w:type="spellEnd"/>
-      <w:r>
-        <w:rPr>
-          <w:rFonts w:asciiTheme="majorBidi" w:hAnsiTheme="majorBidi" w:cstheme="majorBidi"/>
-        </w:rPr>
-        <w:t xml:space="preserve"> &gt; 0 </w:t>
+      <w:r>
+        <w:rPr>
+          <w:rFonts w:asciiTheme="majorBidi" w:hAnsiTheme="majorBidi" w:cstheme="majorBidi"/>
+        </w:rPr>
+        <w:t xml:space="preserve">negative </w:t>
       </w:r>
     </w:p>
     <w:p>
@@ -2653,19 +2605,11 @@
           <w:rFonts w:asciiTheme="majorBidi" w:hAnsiTheme="majorBidi" w:cstheme="majorBidi"/>
         </w:rPr>
       </w:pPr>
-      <w:proofErr w:type="spellStart"/>
-      <w:r>
-        <w:rPr>
-          <w:rFonts w:asciiTheme="majorBidi" w:hAnsiTheme="majorBidi" w:cstheme="majorBidi"/>
-        </w:rPr>
-        <w:t>mult</w:t>
-      </w:r>
-      <w:proofErr w:type="spellEnd"/>
-      <w:r>
-        <w:rPr>
-          <w:rFonts w:asciiTheme="majorBidi" w:hAnsiTheme="majorBidi" w:cstheme="majorBidi"/>
-        </w:rPr>
-        <w:t xml:space="preserve"> = 0 </w:t>
+      <w:r>
+        <w:rPr>
+          <w:rFonts w:asciiTheme="majorBidi" w:hAnsiTheme="majorBidi" w:cstheme="majorBidi"/>
+        </w:rPr>
+        <w:t xml:space="preserve">zero </w:t>
       </w:r>
     </w:p>
     <w:p>
@@ -2678,19 +2622,58 @@
           <w:rFonts w:asciiTheme="majorBidi" w:hAnsiTheme="majorBidi" w:cstheme="majorBidi"/>
         </w:rPr>
       </w:pPr>
-      <w:proofErr w:type="spellStart"/>
-      <w:r>
-        <w:rPr>
-          <w:rFonts w:asciiTheme="majorBidi" w:hAnsiTheme="majorBidi" w:cstheme="majorBidi"/>
-        </w:rPr>
-        <w:t>mult</w:t>
-      </w:r>
-      <w:proofErr w:type="spellEnd"/>
-      <w:r>
-        <w:rPr>
-          <w:rFonts w:asciiTheme="majorBidi" w:hAnsiTheme="majorBidi" w:cstheme="majorBidi"/>
-        </w:rPr>
-        <w:t xml:space="preserve"> &lt; 0 </w:t>
+      <w:r>
+        <w:rPr>
+          <w:rFonts w:asciiTheme="majorBidi" w:hAnsiTheme="majorBidi" w:cstheme="majorBidi"/>
+        </w:rPr>
+        <w:t>positive</w:t>
+      </w:r>
+    </w:p>
+    <w:p>
+      <w:pPr>
+        <w:rPr>
+          <w:rFonts w:asciiTheme="majorBidi" w:hAnsiTheme="majorBidi" w:cstheme="majorBidi"/>
+        </w:rPr>
+      </w:pPr>
+      <w:r>
+        <w:rPr>
+          <w:rFonts w:asciiTheme="majorBidi" w:hAnsiTheme="majorBidi" w:cstheme="majorBidi"/>
+        </w:rPr>
+        <w:t>entry:</w:t>
+      </w:r>
+    </w:p>
+    <w:p>
+      <w:pPr>
+        <w:numPr>
+          <w:ilvl w:val="0"/>
+          <w:numId w:val="26"/>
+        </w:numPr>
+        <w:rPr>
+          <w:rFonts w:asciiTheme="majorBidi" w:hAnsiTheme="majorBidi" w:cstheme="majorBidi"/>
+        </w:rPr>
+      </w:pPr>
+      <w:r>
+        <w:rPr>
+          <w:rFonts w:asciiTheme="majorBidi" w:hAnsiTheme="majorBidi" w:cstheme="majorBidi"/>
+        </w:rPr>
+        <w:t xml:space="preserve">new </w:t>
+      </w:r>
+    </w:p>
+    <w:p>
+      <w:pPr>
+        <w:numPr>
+          <w:ilvl w:val="0"/>
+          <w:numId w:val="26"/>
+        </w:numPr>
+        <w:rPr>
+          <w:rFonts w:asciiTheme="majorBidi" w:hAnsiTheme="majorBidi" w:cstheme="majorBidi"/>
+        </w:rPr>
+      </w:pPr>
+      <w:r>
+        <w:rPr>
+          <w:rFonts w:asciiTheme="majorBidi" w:hAnsiTheme="majorBidi" w:cstheme="majorBidi"/>
+        </w:rPr>
+        <w:t>existing</w:t>
       </w:r>
     </w:p>
     <w:p>
@@ -2945,7 +2928,6 @@
         </w:rPr>
       </w:pPr>
       <w:proofErr w:type="spellStart"/>
-      <w:proofErr w:type="gramStart"/>
       <w:r>
         <w:rPr>
           <w:rFonts w:asciiTheme="majorBidi" w:hAnsiTheme="majorBidi" w:cstheme="majorBidi"/>
@@ -2957,14 +2939,7 @@
         <w:rPr>
           <w:rFonts w:asciiTheme="majorBidi" w:hAnsiTheme="majorBidi" w:cstheme="majorBidi"/>
         </w:rPr>
-        <w:t>(</w:t>
-      </w:r>
-      <w:proofErr w:type="gramEnd"/>
-      <w:r>
-        <w:rPr>
-          <w:rFonts w:asciiTheme="majorBidi" w:hAnsiTheme="majorBidi" w:cstheme="majorBidi"/>
-        </w:rPr>
-        <w:t>Multiset&lt;T&gt; other)</w:t>
+        <w:t>(Multiset&lt;T&gt; other)</w:t>
       </w:r>
     </w:p>
     <w:p>
@@ -2974,7 +2949,6 @@
         </w:rPr>
       </w:pPr>
       <w:proofErr w:type="spellStart"/>
-      <w:proofErr w:type="gramStart"/>
       <w:r>
         <w:rPr>
           <w:rFonts w:asciiTheme="majorBidi" w:hAnsiTheme="majorBidi" w:cstheme="majorBidi"/>
@@ -2986,14 +2960,7 @@
         <w:rPr>
           <w:rFonts w:asciiTheme="majorBidi" w:hAnsiTheme="majorBidi" w:cstheme="majorBidi"/>
         </w:rPr>
-        <w:t>(</w:t>
-      </w:r>
-      <w:proofErr w:type="gramEnd"/>
-      <w:r>
-        <w:rPr>
-          <w:rFonts w:asciiTheme="majorBidi" w:hAnsiTheme="majorBidi" w:cstheme="majorBidi"/>
-        </w:rPr>
-        <w:t>Collection&lt;T&gt; values)</w:t>
+        <w:t>(Collection&lt;T&gt; values)</w:t>
       </w:r>
     </w:p>
     <w:p>
@@ -3014,21 +2981,7 @@
         <w:rPr>
           <w:rFonts w:asciiTheme="majorBidi" w:hAnsiTheme="majorBidi" w:cstheme="majorBidi"/>
         </w:rPr>
-        <w:t>(</w:t>
-      </w:r>
-      <w:proofErr w:type="gramStart"/>
-      <w:r>
-        <w:rPr>
-          <w:rFonts w:asciiTheme="majorBidi" w:hAnsiTheme="majorBidi" w:cstheme="majorBidi"/>
-        </w:rPr>
-        <w:t>T[</w:t>
-      </w:r>
-      <w:proofErr w:type="gramEnd"/>
-      <w:r>
-        <w:rPr>
-          <w:rFonts w:asciiTheme="majorBidi" w:hAnsiTheme="majorBidi" w:cstheme="majorBidi"/>
-        </w:rPr>
-        <w:t>] values)</w:t>
+        <w:t>(T[] values)</w:t>
       </w:r>
     </w:p>
     <w:p>
@@ -3147,6 +3100,7 @@
           <w:b/>
           <w:bCs/>
         </w:rPr>
+        <w:lastRenderedPageBreak/>
         <w:t>Test Cases</w:t>
       </w:r>
     </w:p>
@@ -3267,7 +3221,6 @@
         <w:rPr>
           <w:rFonts w:asciiTheme="majorBidi" w:hAnsiTheme="majorBidi" w:cstheme="majorBidi"/>
         </w:rPr>
-        <w:lastRenderedPageBreak/>
         <w:t>AddAll</w:t>
       </w:r>
       <w:proofErr w:type="spellEnd"/>
@@ -3302,25 +3255,7 @@
           <w:b/>
           <w:bCs/>
         </w:rPr>
-        <w:t xml:space="preserve">4. Method: </w:t>
-      </w:r>
-      <w:proofErr w:type="gramStart"/>
-      <w:r>
-        <w:rPr>
-          <w:rFonts w:asciiTheme="majorBidi" w:hAnsiTheme="majorBidi" w:cstheme="majorBidi"/>
-          <w:b/>
-          <w:bCs/>
-        </w:rPr>
-        <w:t>remove(</w:t>
-      </w:r>
-      <w:proofErr w:type="gramEnd"/>
-      <w:r>
-        <w:rPr>
-          <w:rFonts w:asciiTheme="majorBidi" w:hAnsiTheme="majorBidi" w:cstheme="majorBidi"/>
-          <w:b/>
-          <w:bCs/>
-        </w:rPr>
-        <w:t>Object key)</w:t>
+        <w:t>4. Method: remove(Object key)</w:t>
       </w:r>
     </w:p>
     <w:p>
@@ -3534,25 +3469,7 @@
           <w:b/>
           <w:bCs/>
         </w:rPr>
-        <w:t xml:space="preserve">5. Method: </w:t>
-      </w:r>
-      <w:proofErr w:type="gramStart"/>
-      <w:r>
-        <w:rPr>
-          <w:rFonts w:asciiTheme="majorBidi" w:hAnsiTheme="majorBidi" w:cstheme="majorBidi"/>
-          <w:b/>
-          <w:bCs/>
-        </w:rPr>
-        <w:t>remove(</w:t>
-      </w:r>
-      <w:proofErr w:type="gramEnd"/>
-      <w:r>
-        <w:rPr>
-          <w:rFonts w:asciiTheme="majorBidi" w:hAnsiTheme="majorBidi" w:cstheme="majorBidi"/>
-          <w:b/>
-          <w:bCs/>
-        </w:rPr>
-        <w:t xml:space="preserve">T key, int </w:t>
+        <w:t xml:space="preserve">5. Method: remove(T key, int </w:t>
       </w:r>
       <w:proofErr w:type="spellStart"/>
       <w:r>
@@ -3767,21 +3684,7 @@
         <w:rPr>
           <w:rFonts w:asciiTheme="majorBidi" w:hAnsiTheme="majorBidi" w:cstheme="majorBidi"/>
         </w:rPr>
-        <w:t xml:space="preserve">Key </w:t>
-      </w:r>
-      <w:proofErr w:type="gramStart"/>
-      <w:r>
-        <w:rPr>
-          <w:rFonts w:asciiTheme="majorBidi" w:hAnsiTheme="majorBidi" w:cstheme="majorBidi"/>
-        </w:rPr>
-        <w:t>not exist</w:t>
-      </w:r>
-      <w:proofErr w:type="gramEnd"/>
-      <w:r>
-        <w:rPr>
-          <w:rFonts w:asciiTheme="majorBidi" w:hAnsiTheme="majorBidi" w:cstheme="majorBidi"/>
-        </w:rPr>
-        <w:t xml:space="preserve"> </w:t>
+        <w:t xml:space="preserve">Key not exist </w:t>
       </w:r>
       <w:r>
         <w:rPr>
@@ -3811,6 +3714,7 @@
         <w:rPr>
           <w:rFonts w:asciiTheme="majorBidi" w:hAnsiTheme="majorBidi" w:cstheme="majorBidi"/>
         </w:rPr>
+        <w:lastRenderedPageBreak/>
         <w:t>mult</w:t>
       </w:r>
       <w:proofErr w:type="spellEnd"/>
@@ -3983,11 +3887,9 @@
           <w:b/>
           <w:bCs/>
         </w:rPr>
-        <w:lastRenderedPageBreak/>
         <w:t xml:space="preserve">6. Method: </w:t>
       </w:r>
       <w:proofErr w:type="spellStart"/>
-      <w:proofErr w:type="gramStart"/>
       <w:r>
         <w:rPr>
           <w:rFonts w:asciiTheme="majorBidi" w:hAnsiTheme="majorBidi" w:cstheme="majorBidi"/>
@@ -4003,16 +3905,7 @@
           <w:b/>
           <w:bCs/>
         </w:rPr>
-        <w:t>(</w:t>
-      </w:r>
-      <w:proofErr w:type="gramEnd"/>
-      <w:r>
-        <w:rPr>
-          <w:rFonts w:asciiTheme="majorBidi" w:hAnsiTheme="majorBidi" w:cstheme="majorBidi"/>
-          <w:b/>
-          <w:bCs/>
-        </w:rPr>
-        <w:t>T key)</w:t>
+        <w:t>(T key)</w:t>
       </w:r>
     </w:p>
     <w:p>
@@ -4114,21 +4007,7 @@
         <w:rPr>
           <w:rFonts w:asciiTheme="majorBidi" w:hAnsiTheme="majorBidi" w:cstheme="majorBidi"/>
         </w:rPr>
-        <w:t xml:space="preserve">Key </w:t>
-      </w:r>
-      <w:proofErr w:type="gramStart"/>
-      <w:r>
-        <w:rPr>
-          <w:rFonts w:asciiTheme="majorBidi" w:hAnsiTheme="majorBidi" w:cstheme="majorBidi"/>
-        </w:rPr>
-        <w:t>not exist</w:t>
-      </w:r>
-      <w:proofErr w:type="gramEnd"/>
-      <w:r>
-        <w:rPr>
-          <w:rFonts w:asciiTheme="majorBidi" w:hAnsiTheme="majorBidi" w:cstheme="majorBidi"/>
-        </w:rPr>
-        <w:t xml:space="preserve"> → returns 0 </w:t>
+        <w:t xml:space="preserve">Key not exist → returns 0 </w:t>
       </w:r>
     </w:p>
     <w:p>
@@ -4164,25 +4043,7 @@
           <w:b/>
           <w:bCs/>
         </w:rPr>
-        <w:t xml:space="preserve">7. Method: </w:t>
-      </w:r>
-      <w:proofErr w:type="gramStart"/>
-      <w:r>
-        <w:rPr>
-          <w:rFonts w:asciiTheme="majorBidi" w:hAnsiTheme="majorBidi" w:cstheme="majorBidi"/>
-          <w:b/>
-          <w:bCs/>
-        </w:rPr>
-        <w:t>intersect(</w:t>
-      </w:r>
-      <w:proofErr w:type="gramEnd"/>
-      <w:r>
-        <w:rPr>
-          <w:rFonts w:asciiTheme="majorBidi" w:hAnsiTheme="majorBidi" w:cstheme="majorBidi"/>
-          <w:b/>
-          <w:bCs/>
-        </w:rPr>
-        <w:t>Multiset&lt;T&gt; other)</w:t>
+        <w:t>7. Method: intersect(Multiset&lt;T&gt; other)</w:t>
       </w:r>
     </w:p>
     <w:p>
@@ -4371,21 +4232,7 @@
         <w:rPr>
           <w:rFonts w:asciiTheme="majorBidi" w:hAnsiTheme="majorBidi" w:cstheme="majorBidi"/>
         </w:rPr>
-        <w:t xml:space="preserve"> multiplicity = </w:t>
-      </w:r>
-      <w:proofErr w:type="gramStart"/>
-      <w:r>
-        <w:rPr>
-          <w:rFonts w:asciiTheme="majorBidi" w:hAnsiTheme="majorBidi" w:cstheme="majorBidi"/>
-        </w:rPr>
-        <w:t>min(</w:t>
-      </w:r>
-      <w:proofErr w:type="gramEnd"/>
-      <w:r>
-        <w:rPr>
-          <w:rFonts w:asciiTheme="majorBidi" w:hAnsiTheme="majorBidi" w:cstheme="majorBidi"/>
-        </w:rPr>
-        <w:t xml:space="preserve">count1, count2) </w:t>
+        <w:t xml:space="preserve"> multiplicity = min(count1, count2) </w:t>
       </w:r>
     </w:p>
     <w:p>
@@ -4453,7 +4300,6 @@
         <w:t xml:space="preserve">8. Method: </w:t>
       </w:r>
       <w:proofErr w:type="spellStart"/>
-      <w:proofErr w:type="gramStart"/>
       <w:r>
         <w:rPr>
           <w:rFonts w:asciiTheme="majorBidi" w:hAnsiTheme="majorBidi" w:cstheme="majorBidi"/>
@@ -4469,16 +4315,7 @@
           <w:b/>
           <w:bCs/>
         </w:rPr>
-        <w:t>(</w:t>
-      </w:r>
-      <w:proofErr w:type="gramEnd"/>
-      <w:r>
-        <w:rPr>
-          <w:rFonts w:asciiTheme="majorBidi" w:hAnsiTheme="majorBidi" w:cstheme="majorBidi"/>
-          <w:b/>
-          <w:bCs/>
-        </w:rPr>
-        <w:t>)</w:t>
+        <w:t>()</w:t>
       </w:r>
     </w:p>
     <w:p>
@@ -4512,6 +4349,7 @@
         <w:rPr>
           <w:rFonts w:asciiTheme="majorBidi" w:hAnsiTheme="majorBidi" w:cstheme="majorBidi"/>
         </w:rPr>
+        <w:lastRenderedPageBreak/>
         <w:t xml:space="preserve">Empty multiset </w:t>
       </w:r>
     </w:p>
@@ -4609,7 +4447,6 @@
         <w:rPr>
           <w:rFonts w:asciiTheme="majorBidi" w:hAnsiTheme="majorBidi" w:cstheme="majorBidi"/>
         </w:rPr>
-        <w:lastRenderedPageBreak/>
         <w:t xml:space="preserve">One element </w:t>
       </w:r>
       <w:r>
@@ -4690,7 +4527,6 @@
         <w:t xml:space="preserve">9. Method: </w:t>
       </w:r>
       <w:proofErr w:type="spellStart"/>
-      <w:proofErr w:type="gramStart"/>
       <w:r>
         <w:rPr>
           <w:rFonts w:asciiTheme="majorBidi" w:hAnsiTheme="majorBidi" w:cstheme="majorBidi"/>
@@ -4706,16 +4542,7 @@
           <w:b/>
           <w:bCs/>
         </w:rPr>
-        <w:t>(</w:t>
-      </w:r>
-      <w:proofErr w:type="gramEnd"/>
-      <w:r>
-        <w:rPr>
-          <w:rFonts w:asciiTheme="majorBidi" w:hAnsiTheme="majorBidi" w:cstheme="majorBidi"/>
-          <w:b/>
-          <w:bCs/>
-        </w:rPr>
-        <w:t>)</w:t>
+        <w:t>()</w:t>
       </w:r>
     </w:p>
     <w:p>
@@ -5034,7 +4861,6 @@
         <w:t xml:space="preserve">10. Method: </w:t>
       </w:r>
       <w:proofErr w:type="spellStart"/>
-      <w:proofErr w:type="gramStart"/>
       <w:r>
         <w:rPr>
           <w:rFonts w:asciiTheme="majorBidi" w:hAnsiTheme="majorBidi" w:cstheme="majorBidi"/>
@@ -5050,16 +4876,7 @@
           <w:b/>
           <w:bCs/>
         </w:rPr>
-        <w:t>(</w:t>
-      </w:r>
-      <w:proofErr w:type="gramEnd"/>
-      <w:r>
-        <w:rPr>
-          <w:rFonts w:asciiTheme="majorBidi" w:hAnsiTheme="majorBidi" w:cstheme="majorBidi"/>
-          <w:b/>
-          <w:bCs/>
-        </w:rPr>
-        <w:t>)</w:t>
+        <w:t>()</w:t>
       </w:r>
     </w:p>
     <w:p>
@@ -5172,6 +4989,7 @@
         <w:rPr>
           <w:rFonts w:asciiTheme="majorBidi" w:hAnsiTheme="majorBidi" w:cstheme="majorBidi"/>
         </w:rPr>
+        <w:lastRenderedPageBreak/>
         <w:t xml:space="preserve">Multiple elements </w:t>
       </w:r>
     </w:p>
@@ -5269,7 +5087,6 @@
         <w:rPr>
           <w:rFonts w:asciiTheme="majorBidi" w:hAnsiTheme="majorBidi" w:cstheme="majorBidi"/>
         </w:rPr>
-        <w:lastRenderedPageBreak/>
         <w:t xml:space="preserve">Single element </w:t>
       </w:r>
       <w:r>
@@ -5282,21 +5099,7 @@
         <w:rPr>
           <w:rFonts w:asciiTheme="majorBidi" w:hAnsiTheme="majorBidi" w:cstheme="majorBidi"/>
         </w:rPr>
-        <w:t xml:space="preserve"> "{</w:t>
-      </w:r>
-      <w:proofErr w:type="gramStart"/>
-      <w:r>
-        <w:rPr>
-          <w:rFonts w:asciiTheme="majorBidi" w:hAnsiTheme="majorBidi" w:cstheme="majorBidi"/>
-        </w:rPr>
-        <w:t>a}"</w:t>
-      </w:r>
-      <w:proofErr w:type="gramEnd"/>
-      <w:r>
-        <w:rPr>
-          <w:rFonts w:asciiTheme="majorBidi" w:hAnsiTheme="majorBidi" w:cstheme="majorBidi"/>
-        </w:rPr>
-        <w:t xml:space="preserve"> </w:t>
+        <w:t xml:space="preserve"> "{a}" </w:t>
       </w:r>
     </w:p>
     <w:p>
@@ -5332,28 +5135,14 @@
         <w:rPr>
           <w:rFonts w:asciiTheme="majorBidi" w:hAnsiTheme="majorBidi" w:cstheme="majorBidi"/>
         </w:rPr>
-        <w:t>a^</w:t>
-      </w:r>
-      <w:proofErr w:type="gramStart"/>
-      <w:r>
-        <w:rPr>
-          <w:rFonts w:asciiTheme="majorBidi" w:hAnsiTheme="majorBidi" w:cstheme="majorBidi"/>
-        </w:rPr>
-        <w:t>n</w:t>
+        <w:t>a^n</w:t>
       </w:r>
       <w:proofErr w:type="spellEnd"/>
       <w:r>
         <w:rPr>
           <w:rFonts w:asciiTheme="majorBidi" w:hAnsiTheme="majorBidi" w:cstheme="majorBidi"/>
         </w:rPr>
-        <w:t>}"</w:t>
-      </w:r>
-      <w:proofErr w:type="gramEnd"/>
-      <w:r>
-        <w:rPr>
-          <w:rFonts w:asciiTheme="majorBidi" w:hAnsiTheme="majorBidi" w:cstheme="majorBidi"/>
-        </w:rPr>
-        <w:t xml:space="preserve"> </w:t>
+        <w:t xml:space="preserve">}" </w:t>
       </w:r>
     </w:p>
     <w:p>
@@ -5418,25 +5207,7 @@
           <w:b/>
           <w:bCs/>
         </w:rPr>
-        <w:t xml:space="preserve">11. Method: </w:t>
-      </w:r>
-      <w:proofErr w:type="gramStart"/>
-      <w:r>
-        <w:rPr>
-          <w:rFonts w:asciiTheme="majorBidi" w:hAnsiTheme="majorBidi" w:cstheme="majorBidi"/>
-          <w:b/>
-          <w:bCs/>
-        </w:rPr>
-        <w:t>equals(</w:t>
-      </w:r>
-      <w:proofErr w:type="gramEnd"/>
-      <w:r>
-        <w:rPr>
-          <w:rFonts w:asciiTheme="majorBidi" w:hAnsiTheme="majorBidi" w:cstheme="majorBidi"/>
-          <w:b/>
-          <w:bCs/>
-        </w:rPr>
-        <w:t>Object o)</w:t>
+        <w:t>11. Method: equals(Object o)</w:t>
       </w:r>
     </w:p>
     <w:p>
@@ -5487,21 +5258,7 @@
         <w:rPr>
           <w:rFonts w:asciiTheme="majorBidi" w:hAnsiTheme="majorBidi" w:cstheme="majorBidi"/>
         </w:rPr>
-        <w:t xml:space="preserve">Different </w:t>
-      </w:r>
-      <w:proofErr w:type="gramStart"/>
-      <w:r>
-        <w:rPr>
-          <w:rFonts w:asciiTheme="majorBidi" w:hAnsiTheme="majorBidi" w:cstheme="majorBidi"/>
-        </w:rPr>
-        <w:t>type</w:t>
-      </w:r>
-      <w:proofErr w:type="gramEnd"/>
-      <w:r>
-        <w:rPr>
-          <w:rFonts w:asciiTheme="majorBidi" w:hAnsiTheme="majorBidi" w:cstheme="majorBidi"/>
-        </w:rPr>
-        <w:t xml:space="preserve"> </w:t>
+        <w:t xml:space="preserve">Different type </w:t>
       </w:r>
     </w:p>
     <w:p>
@@ -6537,6 +6294,119 @@
     </w:lvl>
   </w:abstractNum>
   <w:abstractNum w:abstractNumId="5" w15:restartNumberingAfterBreak="0">
+    <w:nsid w:val="0B794205"/>
+    <w:multiLevelType w:val="hybridMultilevel"/>
+    <w:tmpl w:val="1ACC4E5C"/>
+    <w:lvl w:ilvl="0" w:tplc="04090001">
+      <w:start w:val="1"/>
+      <w:numFmt w:val="bullet"/>
+      <w:lvlText w:val=""/>
+      <w:lvlJc w:val="left"/>
+      <w:pPr>
+        <w:ind w:left="720" w:hanging="360"/>
+      </w:pPr>
+      <w:rPr>
+        <w:rFonts w:ascii="Symbol" w:hAnsi="Symbol" w:hint="default"/>
+      </w:rPr>
+    </w:lvl>
+    <w:lvl w:ilvl="1" w:tplc="04090003" w:tentative="1">
+      <w:start w:val="1"/>
+      <w:numFmt w:val="bullet"/>
+      <w:lvlText w:val="o"/>
+      <w:lvlJc w:val="left"/>
+      <w:pPr>
+        <w:ind w:left="1440" w:hanging="360"/>
+      </w:pPr>
+      <w:rPr>
+        <w:rFonts w:ascii="Courier New" w:hAnsi="Courier New" w:cs="Courier New" w:hint="default"/>
+      </w:rPr>
+    </w:lvl>
+    <w:lvl w:ilvl="2" w:tplc="04090005" w:tentative="1">
+      <w:start w:val="1"/>
+      <w:numFmt w:val="bullet"/>
+      <w:lvlText w:val=""/>
+      <w:lvlJc w:val="left"/>
+      <w:pPr>
+        <w:ind w:left="2160" w:hanging="360"/>
+      </w:pPr>
+      <w:rPr>
+        <w:rFonts w:ascii="Wingdings" w:hAnsi="Wingdings" w:hint="default"/>
+      </w:rPr>
+    </w:lvl>
+    <w:lvl w:ilvl="3" w:tplc="04090001" w:tentative="1">
+      <w:start w:val="1"/>
+      <w:numFmt w:val="bullet"/>
+      <w:lvlText w:val=""/>
+      <w:lvlJc w:val="left"/>
+      <w:pPr>
+        <w:ind w:left="2880" w:hanging="360"/>
+      </w:pPr>
+      <w:rPr>
+        <w:rFonts w:ascii="Symbol" w:hAnsi="Symbol" w:hint="default"/>
+      </w:rPr>
+    </w:lvl>
+    <w:lvl w:ilvl="4" w:tplc="04090003" w:tentative="1">
+      <w:start w:val="1"/>
+      <w:numFmt w:val="bullet"/>
+      <w:lvlText w:val="o"/>
+      <w:lvlJc w:val="left"/>
+      <w:pPr>
+        <w:ind w:left="3600" w:hanging="360"/>
+      </w:pPr>
+      <w:rPr>
+        <w:rFonts w:ascii="Courier New" w:hAnsi="Courier New" w:cs="Courier New" w:hint="default"/>
+      </w:rPr>
+    </w:lvl>
+    <w:lvl w:ilvl="5" w:tplc="04090005" w:tentative="1">
+      <w:start w:val="1"/>
+      <w:numFmt w:val="bullet"/>
+      <w:lvlText w:val=""/>
+      <w:lvlJc w:val="left"/>
+      <w:pPr>
+        <w:ind w:left="4320" w:hanging="360"/>
+      </w:pPr>
+      <w:rPr>
+        <w:rFonts w:ascii="Wingdings" w:hAnsi="Wingdings" w:hint="default"/>
+      </w:rPr>
+    </w:lvl>
+    <w:lvl w:ilvl="6" w:tplc="04090001" w:tentative="1">
+      <w:start w:val="1"/>
+      <w:numFmt w:val="bullet"/>
+      <w:lvlText w:val=""/>
+      <w:lvlJc w:val="left"/>
+      <w:pPr>
+        <w:ind w:left="5040" w:hanging="360"/>
+      </w:pPr>
+      <w:rPr>
+        <w:rFonts w:ascii="Symbol" w:hAnsi="Symbol" w:hint="default"/>
+      </w:rPr>
+    </w:lvl>
+    <w:lvl w:ilvl="7" w:tplc="04090003" w:tentative="1">
+      <w:start w:val="1"/>
+      <w:numFmt w:val="bullet"/>
+      <w:lvlText w:val="o"/>
+      <w:lvlJc w:val="left"/>
+      <w:pPr>
+        <w:ind w:left="5760" w:hanging="360"/>
+      </w:pPr>
+      <w:rPr>
+        <w:rFonts w:ascii="Courier New" w:hAnsi="Courier New" w:cs="Courier New" w:hint="default"/>
+      </w:rPr>
+    </w:lvl>
+    <w:lvl w:ilvl="8" w:tplc="04090005" w:tentative="1">
+      <w:start w:val="1"/>
+      <w:numFmt w:val="bullet"/>
+      <w:lvlText w:val=""/>
+      <w:lvlJc w:val="left"/>
+      <w:pPr>
+        <w:ind w:left="6480" w:hanging="360"/>
+      </w:pPr>
+      <w:rPr>
+        <w:rFonts w:ascii="Wingdings" w:hAnsi="Wingdings" w:hint="default"/>
+      </w:rPr>
+    </w:lvl>
+  </w:abstractNum>
+  <w:abstractNum w:abstractNumId="6" w15:restartNumberingAfterBreak="0">
     <w:nsid w:val="0BCF4639"/>
     <w:multiLevelType w:val="multilevel"/>
     <w:tmpl w:val="77C0613E"/>
@@ -6685,7 +6555,7 @@
       </w:rPr>
     </w:lvl>
   </w:abstractNum>
-  <w:abstractNum w:abstractNumId="6" w15:restartNumberingAfterBreak="0">
+  <w:abstractNum w:abstractNumId="7" w15:restartNumberingAfterBreak="0">
     <w:nsid w:val="107E716E"/>
     <w:multiLevelType w:val="multilevel"/>
     <w:tmpl w:val="BA62D6AE"/>
@@ -6834,7 +6704,7 @@
       </w:rPr>
     </w:lvl>
   </w:abstractNum>
-  <w:abstractNum w:abstractNumId="7" w15:restartNumberingAfterBreak="0">
+  <w:abstractNum w:abstractNumId="8" w15:restartNumberingAfterBreak="0">
     <w:nsid w:val="10BF2D5F"/>
     <w:multiLevelType w:val="multilevel"/>
     <w:tmpl w:val="87F09B24"/>
@@ -6983,7 +6853,7 @@
       </w:rPr>
     </w:lvl>
   </w:abstractNum>
-  <w:abstractNum w:abstractNumId="8" w15:restartNumberingAfterBreak="0">
+  <w:abstractNum w:abstractNumId="9" w15:restartNumberingAfterBreak="0">
     <w:nsid w:val="1134379E"/>
     <w:multiLevelType w:val="multilevel"/>
     <w:tmpl w:val="CA3257C6"/>
@@ -7132,7 +7002,7 @@
       </w:rPr>
     </w:lvl>
   </w:abstractNum>
-  <w:abstractNum w:abstractNumId="9" w15:restartNumberingAfterBreak="0">
+  <w:abstractNum w:abstractNumId="10" w15:restartNumberingAfterBreak="0">
     <w:nsid w:val="15744733"/>
     <w:multiLevelType w:val="multilevel"/>
     <w:tmpl w:val="57FCE9D8"/>
@@ -7281,7 +7151,7 @@
       </w:rPr>
     </w:lvl>
   </w:abstractNum>
-  <w:abstractNum w:abstractNumId="10" w15:restartNumberingAfterBreak="0">
+  <w:abstractNum w:abstractNumId="11" w15:restartNumberingAfterBreak="0">
     <w:nsid w:val="171D776B"/>
     <w:multiLevelType w:val="multilevel"/>
     <w:tmpl w:val="18D27896"/>
@@ -7430,7 +7300,7 @@
       </w:rPr>
     </w:lvl>
   </w:abstractNum>
-  <w:abstractNum w:abstractNumId="11" w15:restartNumberingAfterBreak="0">
+  <w:abstractNum w:abstractNumId="12" w15:restartNumberingAfterBreak="0">
     <w:nsid w:val="1B442B48"/>
     <w:multiLevelType w:val="multilevel"/>
     <w:tmpl w:val="494C727C"/>
@@ -7579,7 +7449,7 @@
       </w:rPr>
     </w:lvl>
   </w:abstractNum>
-  <w:abstractNum w:abstractNumId="12" w15:restartNumberingAfterBreak="0">
+  <w:abstractNum w:abstractNumId="13" w15:restartNumberingAfterBreak="0">
     <w:nsid w:val="1EAB319B"/>
     <w:multiLevelType w:val="multilevel"/>
     <w:tmpl w:val="A12A5FDA"/>
@@ -7728,7 +7598,7 @@
       </w:rPr>
     </w:lvl>
   </w:abstractNum>
-  <w:abstractNum w:abstractNumId="13" w15:restartNumberingAfterBreak="0">
+  <w:abstractNum w:abstractNumId="14" w15:restartNumberingAfterBreak="0">
     <w:nsid w:val="22DF77DB"/>
     <w:multiLevelType w:val="multilevel"/>
     <w:tmpl w:val="BEBA93E0"/>
@@ -7877,7 +7747,7 @@
       </w:rPr>
     </w:lvl>
   </w:abstractNum>
-  <w:abstractNum w:abstractNumId="14" w15:restartNumberingAfterBreak="0">
+  <w:abstractNum w:abstractNumId="15" w15:restartNumberingAfterBreak="0">
     <w:nsid w:val="24D37A4D"/>
     <w:multiLevelType w:val="multilevel"/>
     <w:tmpl w:val="4E36F146"/>
@@ -8026,7 +7896,7 @@
       </w:rPr>
     </w:lvl>
   </w:abstractNum>
-  <w:abstractNum w:abstractNumId="15" w15:restartNumberingAfterBreak="0">
+  <w:abstractNum w:abstractNumId="16" w15:restartNumberingAfterBreak="0">
     <w:nsid w:val="272E3904"/>
     <w:multiLevelType w:val="multilevel"/>
     <w:tmpl w:val="1A3CE760"/>
@@ -8175,7 +8045,7 @@
       </w:rPr>
     </w:lvl>
   </w:abstractNum>
-  <w:abstractNum w:abstractNumId="16" w15:restartNumberingAfterBreak="0">
+  <w:abstractNum w:abstractNumId="17" w15:restartNumberingAfterBreak="0">
     <w:nsid w:val="2D165860"/>
     <w:multiLevelType w:val="multilevel"/>
     <w:tmpl w:val="62E44496"/>
@@ -8324,7 +8194,156 @@
       </w:rPr>
     </w:lvl>
   </w:abstractNum>
-  <w:abstractNum w:abstractNumId="17" w15:restartNumberingAfterBreak="0">
+  <w:abstractNum w:abstractNumId="18" w15:restartNumberingAfterBreak="0">
+    <w:nsid w:val="31CA3E31"/>
+    <w:multiLevelType w:val="multilevel"/>
+    <w:tmpl w:val="19344C06"/>
+    <w:lvl w:ilvl="0">
+      <w:start w:val="1"/>
+      <w:numFmt w:val="bullet"/>
+      <w:lvlText w:val=""/>
+      <w:lvlJc w:val="left"/>
+      <w:pPr>
+        <w:tabs>
+          <w:tab w:val="num" w:pos="720"/>
+        </w:tabs>
+        <w:ind w:left="720" w:hanging="360"/>
+      </w:pPr>
+      <w:rPr>
+        <w:rFonts w:ascii="Symbol" w:hAnsi="Symbol" w:hint="default"/>
+        <w:sz w:val="20"/>
+      </w:rPr>
+    </w:lvl>
+    <w:lvl w:ilvl="1" w:tentative="1">
+      <w:start w:val="1"/>
+      <w:numFmt w:val="bullet"/>
+      <w:lvlText w:val="o"/>
+      <w:lvlJc w:val="left"/>
+      <w:pPr>
+        <w:tabs>
+          <w:tab w:val="num" w:pos="1440"/>
+        </w:tabs>
+        <w:ind w:left="1440" w:hanging="360"/>
+      </w:pPr>
+      <w:rPr>
+        <w:rFonts w:ascii="Courier New" w:hAnsi="Courier New" w:hint="default"/>
+        <w:sz w:val="20"/>
+      </w:rPr>
+    </w:lvl>
+    <w:lvl w:ilvl="2" w:tentative="1">
+      <w:start w:val="1"/>
+      <w:numFmt w:val="bullet"/>
+      <w:lvlText w:val=""/>
+      <w:lvlJc w:val="left"/>
+      <w:pPr>
+        <w:tabs>
+          <w:tab w:val="num" w:pos="2160"/>
+        </w:tabs>
+        <w:ind w:left="2160" w:hanging="360"/>
+      </w:pPr>
+      <w:rPr>
+        <w:rFonts w:ascii="Wingdings" w:hAnsi="Wingdings" w:hint="default"/>
+        <w:sz w:val="20"/>
+      </w:rPr>
+    </w:lvl>
+    <w:lvl w:ilvl="3" w:tentative="1">
+      <w:start w:val="1"/>
+      <w:numFmt w:val="bullet"/>
+      <w:lvlText w:val=""/>
+      <w:lvlJc w:val="left"/>
+      <w:pPr>
+        <w:tabs>
+          <w:tab w:val="num" w:pos="2880"/>
+        </w:tabs>
+        <w:ind w:left="2880" w:hanging="360"/>
+      </w:pPr>
+      <w:rPr>
+        <w:rFonts w:ascii="Wingdings" w:hAnsi="Wingdings" w:hint="default"/>
+        <w:sz w:val="20"/>
+      </w:rPr>
+    </w:lvl>
+    <w:lvl w:ilvl="4" w:tentative="1">
+      <w:start w:val="1"/>
+      <w:numFmt w:val="bullet"/>
+      <w:lvlText w:val=""/>
+      <w:lvlJc w:val="left"/>
+      <w:pPr>
+        <w:tabs>
+          <w:tab w:val="num" w:pos="3600"/>
+        </w:tabs>
+        <w:ind w:left="3600" w:hanging="360"/>
+      </w:pPr>
+      <w:rPr>
+        <w:rFonts w:ascii="Wingdings" w:hAnsi="Wingdings" w:hint="default"/>
+        <w:sz w:val="20"/>
+      </w:rPr>
+    </w:lvl>
+    <w:lvl w:ilvl="5" w:tentative="1">
+      <w:start w:val="1"/>
+      <w:numFmt w:val="bullet"/>
+      <w:lvlText w:val=""/>
+      <w:lvlJc w:val="left"/>
+      <w:pPr>
+        <w:tabs>
+          <w:tab w:val="num" w:pos="4320"/>
+        </w:tabs>
+        <w:ind w:left="4320" w:hanging="360"/>
+      </w:pPr>
+      <w:rPr>
+        <w:rFonts w:ascii="Wingdings" w:hAnsi="Wingdings" w:hint="default"/>
+        <w:sz w:val="20"/>
+      </w:rPr>
+    </w:lvl>
+    <w:lvl w:ilvl="6" w:tentative="1">
+      <w:start w:val="1"/>
+      <w:numFmt w:val="bullet"/>
+      <w:lvlText w:val=""/>
+      <w:lvlJc w:val="left"/>
+      <w:pPr>
+        <w:tabs>
+          <w:tab w:val="num" w:pos="5040"/>
+        </w:tabs>
+        <w:ind w:left="5040" w:hanging="360"/>
+      </w:pPr>
+      <w:rPr>
+        <w:rFonts w:ascii="Wingdings" w:hAnsi="Wingdings" w:hint="default"/>
+        <w:sz w:val="20"/>
+      </w:rPr>
+    </w:lvl>
+    <w:lvl w:ilvl="7" w:tentative="1">
+      <w:start w:val="1"/>
+      <w:numFmt w:val="bullet"/>
+      <w:lvlText w:val=""/>
+      <w:lvlJc w:val="left"/>
+      <w:pPr>
+        <w:tabs>
+          <w:tab w:val="num" w:pos="5760"/>
+        </w:tabs>
+        <w:ind w:left="5760" w:hanging="360"/>
+      </w:pPr>
+      <w:rPr>
+        <w:rFonts w:ascii="Wingdings" w:hAnsi="Wingdings" w:hint="default"/>
+        <w:sz w:val="20"/>
+      </w:rPr>
+    </w:lvl>
+    <w:lvl w:ilvl="8" w:tentative="1">
+      <w:start w:val="1"/>
+      <w:numFmt w:val="bullet"/>
+      <w:lvlText w:val=""/>
+      <w:lvlJc w:val="left"/>
+      <w:pPr>
+        <w:tabs>
+          <w:tab w:val="num" w:pos="6480"/>
+        </w:tabs>
+        <w:ind w:left="6480" w:hanging="360"/>
+      </w:pPr>
+      <w:rPr>
+        <w:rFonts w:ascii="Wingdings" w:hAnsi="Wingdings" w:hint="default"/>
+        <w:sz w:val="20"/>
+      </w:rPr>
+    </w:lvl>
+  </w:abstractNum>
+  <w:abstractNum w:abstractNumId="19" w15:restartNumberingAfterBreak="0">
     <w:nsid w:val="32C97DF4"/>
     <w:multiLevelType w:val="multilevel"/>
     <w:tmpl w:val="A8FE9EB6"/>
@@ -8473,7 +8492,7 @@
       </w:rPr>
     </w:lvl>
   </w:abstractNum>
-  <w:abstractNum w:abstractNumId="18" w15:restartNumberingAfterBreak="0">
+  <w:abstractNum w:abstractNumId="20" w15:restartNumberingAfterBreak="0">
     <w:nsid w:val="3D716A43"/>
     <w:multiLevelType w:val="multilevel"/>
     <w:tmpl w:val="CDF853B2"/>
@@ -8622,7 +8641,7 @@
       </w:rPr>
     </w:lvl>
   </w:abstractNum>
-  <w:abstractNum w:abstractNumId="19" w15:restartNumberingAfterBreak="0">
+  <w:abstractNum w:abstractNumId="21" w15:restartNumberingAfterBreak="0">
     <w:nsid w:val="454F2027"/>
     <w:multiLevelType w:val="multilevel"/>
     <w:tmpl w:val="53125F94"/>
@@ -8771,7 +8790,7 @@
       </w:rPr>
     </w:lvl>
   </w:abstractNum>
-  <w:abstractNum w:abstractNumId="20" w15:restartNumberingAfterBreak="0">
+  <w:abstractNum w:abstractNumId="22" w15:restartNumberingAfterBreak="0">
     <w:nsid w:val="461B38E8"/>
     <w:multiLevelType w:val="multilevel"/>
     <w:tmpl w:val="920A1C5A"/>
@@ -8884,7 +8903,7 @@
       </w:pPr>
     </w:lvl>
   </w:abstractNum>
-  <w:abstractNum w:abstractNumId="21" w15:restartNumberingAfterBreak="0">
+  <w:abstractNum w:abstractNumId="23" w15:restartNumberingAfterBreak="0">
     <w:nsid w:val="472E6545"/>
     <w:multiLevelType w:val="multilevel"/>
     <w:tmpl w:val="A6E63BA4"/>
@@ -9033,7 +9052,7 @@
       </w:rPr>
     </w:lvl>
   </w:abstractNum>
-  <w:abstractNum w:abstractNumId="22" w15:restartNumberingAfterBreak="0">
+  <w:abstractNum w:abstractNumId="24" w15:restartNumberingAfterBreak="0">
     <w:nsid w:val="49E7718D"/>
     <w:multiLevelType w:val="multilevel"/>
     <w:tmpl w:val="EA9E3154"/>
@@ -9182,7 +9201,156 @@
       </w:rPr>
     </w:lvl>
   </w:abstractNum>
-  <w:abstractNum w:abstractNumId="23" w15:restartNumberingAfterBreak="0">
+  <w:abstractNum w:abstractNumId="25" w15:restartNumberingAfterBreak="0">
+    <w:nsid w:val="4A473FCC"/>
+    <w:multiLevelType w:val="multilevel"/>
+    <w:tmpl w:val="5148AE6C"/>
+    <w:lvl w:ilvl="0">
+      <w:start w:val="1"/>
+      <w:numFmt w:val="bullet"/>
+      <w:lvlText w:val=""/>
+      <w:lvlJc w:val="left"/>
+      <w:pPr>
+        <w:tabs>
+          <w:tab w:val="num" w:pos="720"/>
+        </w:tabs>
+        <w:ind w:left="720" w:hanging="360"/>
+      </w:pPr>
+      <w:rPr>
+        <w:rFonts w:ascii="Symbol" w:hAnsi="Symbol" w:hint="default"/>
+        <w:sz w:val="20"/>
+      </w:rPr>
+    </w:lvl>
+    <w:lvl w:ilvl="1" w:tentative="1">
+      <w:start w:val="1"/>
+      <w:numFmt w:val="bullet"/>
+      <w:lvlText w:val="o"/>
+      <w:lvlJc w:val="left"/>
+      <w:pPr>
+        <w:tabs>
+          <w:tab w:val="num" w:pos="1440"/>
+        </w:tabs>
+        <w:ind w:left="1440" w:hanging="360"/>
+      </w:pPr>
+      <w:rPr>
+        <w:rFonts w:ascii="Courier New" w:hAnsi="Courier New" w:hint="default"/>
+        <w:sz w:val="20"/>
+      </w:rPr>
+    </w:lvl>
+    <w:lvl w:ilvl="2" w:tentative="1">
+      <w:start w:val="1"/>
+      <w:numFmt w:val="bullet"/>
+      <w:lvlText w:val=""/>
+      <w:lvlJc w:val="left"/>
+      <w:pPr>
+        <w:tabs>
+          <w:tab w:val="num" w:pos="2160"/>
+        </w:tabs>
+        <w:ind w:left="2160" w:hanging="360"/>
+      </w:pPr>
+      <w:rPr>
+        <w:rFonts w:ascii="Wingdings" w:hAnsi="Wingdings" w:hint="default"/>
+        <w:sz w:val="20"/>
+      </w:rPr>
+    </w:lvl>
+    <w:lvl w:ilvl="3" w:tentative="1">
+      <w:start w:val="1"/>
+      <w:numFmt w:val="bullet"/>
+      <w:lvlText w:val=""/>
+      <w:lvlJc w:val="left"/>
+      <w:pPr>
+        <w:tabs>
+          <w:tab w:val="num" w:pos="2880"/>
+        </w:tabs>
+        <w:ind w:left="2880" w:hanging="360"/>
+      </w:pPr>
+      <w:rPr>
+        <w:rFonts w:ascii="Wingdings" w:hAnsi="Wingdings" w:hint="default"/>
+        <w:sz w:val="20"/>
+      </w:rPr>
+    </w:lvl>
+    <w:lvl w:ilvl="4" w:tentative="1">
+      <w:start w:val="1"/>
+      <w:numFmt w:val="bullet"/>
+      <w:lvlText w:val=""/>
+      <w:lvlJc w:val="left"/>
+      <w:pPr>
+        <w:tabs>
+          <w:tab w:val="num" w:pos="3600"/>
+        </w:tabs>
+        <w:ind w:left="3600" w:hanging="360"/>
+      </w:pPr>
+      <w:rPr>
+        <w:rFonts w:ascii="Wingdings" w:hAnsi="Wingdings" w:hint="default"/>
+        <w:sz w:val="20"/>
+      </w:rPr>
+    </w:lvl>
+    <w:lvl w:ilvl="5" w:tentative="1">
+      <w:start w:val="1"/>
+      <w:numFmt w:val="bullet"/>
+      <w:lvlText w:val=""/>
+      <w:lvlJc w:val="left"/>
+      <w:pPr>
+        <w:tabs>
+          <w:tab w:val="num" w:pos="4320"/>
+        </w:tabs>
+        <w:ind w:left="4320" w:hanging="360"/>
+      </w:pPr>
+      <w:rPr>
+        <w:rFonts w:ascii="Wingdings" w:hAnsi="Wingdings" w:hint="default"/>
+        <w:sz w:val="20"/>
+      </w:rPr>
+    </w:lvl>
+    <w:lvl w:ilvl="6" w:tentative="1">
+      <w:start w:val="1"/>
+      <w:numFmt w:val="bullet"/>
+      <w:lvlText w:val=""/>
+      <w:lvlJc w:val="left"/>
+      <w:pPr>
+        <w:tabs>
+          <w:tab w:val="num" w:pos="5040"/>
+        </w:tabs>
+        <w:ind w:left="5040" w:hanging="360"/>
+      </w:pPr>
+      <w:rPr>
+        <w:rFonts w:ascii="Wingdings" w:hAnsi="Wingdings" w:hint="default"/>
+        <w:sz w:val="20"/>
+      </w:rPr>
+    </w:lvl>
+    <w:lvl w:ilvl="7" w:tentative="1">
+      <w:start w:val="1"/>
+      <w:numFmt w:val="bullet"/>
+      <w:lvlText w:val=""/>
+      <w:lvlJc w:val="left"/>
+      <w:pPr>
+        <w:tabs>
+          <w:tab w:val="num" w:pos="5760"/>
+        </w:tabs>
+        <w:ind w:left="5760" w:hanging="360"/>
+      </w:pPr>
+      <w:rPr>
+        <w:rFonts w:ascii="Wingdings" w:hAnsi="Wingdings" w:hint="default"/>
+        <w:sz w:val="20"/>
+      </w:rPr>
+    </w:lvl>
+    <w:lvl w:ilvl="8" w:tentative="1">
+      <w:start w:val="1"/>
+      <w:numFmt w:val="bullet"/>
+      <w:lvlText w:val=""/>
+      <w:lvlJc w:val="left"/>
+      <w:pPr>
+        <w:tabs>
+          <w:tab w:val="num" w:pos="6480"/>
+        </w:tabs>
+        <w:ind w:left="6480" w:hanging="360"/>
+      </w:pPr>
+      <w:rPr>
+        <w:rFonts w:ascii="Wingdings" w:hAnsi="Wingdings" w:hint="default"/>
+        <w:sz w:val="20"/>
+      </w:rPr>
+    </w:lvl>
+  </w:abstractNum>
+  <w:abstractNum w:abstractNumId="26" w15:restartNumberingAfterBreak="0">
     <w:nsid w:val="4C8E2661"/>
     <w:multiLevelType w:val="multilevel"/>
     <w:tmpl w:val="3844E19E"/>
@@ -9331,7 +9499,7 @@
       </w:rPr>
     </w:lvl>
   </w:abstractNum>
-  <w:abstractNum w:abstractNumId="24" w15:restartNumberingAfterBreak="0">
+  <w:abstractNum w:abstractNumId="27" w15:restartNumberingAfterBreak="0">
     <w:nsid w:val="4CEC5226"/>
     <w:multiLevelType w:val="multilevel"/>
     <w:tmpl w:val="62A8245C"/>
@@ -9480,7 +9648,7 @@
       </w:rPr>
     </w:lvl>
   </w:abstractNum>
-  <w:abstractNum w:abstractNumId="25" w15:restartNumberingAfterBreak="0">
+  <w:abstractNum w:abstractNumId="28" w15:restartNumberingAfterBreak="0">
     <w:nsid w:val="4D77077D"/>
     <w:multiLevelType w:val="multilevel"/>
     <w:tmpl w:val="0E66C868"/>
@@ -9629,7 +9797,7 @@
       </w:rPr>
     </w:lvl>
   </w:abstractNum>
-  <w:abstractNum w:abstractNumId="26" w15:restartNumberingAfterBreak="0">
+  <w:abstractNum w:abstractNumId="29" w15:restartNumberingAfterBreak="0">
     <w:nsid w:val="4FBB0331"/>
     <w:multiLevelType w:val="multilevel"/>
     <w:tmpl w:val="187EFE06"/>
@@ -9778,7 +9946,7 @@
       </w:rPr>
     </w:lvl>
   </w:abstractNum>
-  <w:abstractNum w:abstractNumId="27" w15:restartNumberingAfterBreak="0">
+  <w:abstractNum w:abstractNumId="30" w15:restartNumberingAfterBreak="0">
     <w:nsid w:val="51637B06"/>
     <w:multiLevelType w:val="multilevel"/>
     <w:tmpl w:val="E140050E"/>
@@ -9891,7 +10059,7 @@
       </w:pPr>
     </w:lvl>
   </w:abstractNum>
-  <w:abstractNum w:abstractNumId="28" w15:restartNumberingAfterBreak="0">
+  <w:abstractNum w:abstractNumId="31" w15:restartNumberingAfterBreak="0">
     <w:nsid w:val="53650BA7"/>
     <w:multiLevelType w:val="multilevel"/>
     <w:tmpl w:val="7D62883C"/>
@@ -10040,7 +10208,7 @@
       </w:rPr>
     </w:lvl>
   </w:abstractNum>
-  <w:abstractNum w:abstractNumId="29" w15:restartNumberingAfterBreak="0">
+  <w:abstractNum w:abstractNumId="32" w15:restartNumberingAfterBreak="0">
     <w:nsid w:val="57565078"/>
     <w:multiLevelType w:val="multilevel"/>
     <w:tmpl w:val="9E8CEB6C"/>
@@ -10189,7 +10357,7 @@
       </w:rPr>
     </w:lvl>
   </w:abstractNum>
-  <w:abstractNum w:abstractNumId="30" w15:restartNumberingAfterBreak="0">
+  <w:abstractNum w:abstractNumId="33" w15:restartNumberingAfterBreak="0">
     <w:nsid w:val="59026175"/>
     <w:multiLevelType w:val="multilevel"/>
     <w:tmpl w:val="011E34AC"/>
@@ -10338,7 +10506,7 @@
       </w:rPr>
     </w:lvl>
   </w:abstractNum>
-  <w:abstractNum w:abstractNumId="31" w15:restartNumberingAfterBreak="0">
+  <w:abstractNum w:abstractNumId="34" w15:restartNumberingAfterBreak="0">
     <w:nsid w:val="5BFC0A13"/>
     <w:multiLevelType w:val="multilevel"/>
     <w:tmpl w:val="5F941290"/>
@@ -10487,7 +10655,7 @@
       </w:rPr>
     </w:lvl>
   </w:abstractNum>
-  <w:abstractNum w:abstractNumId="32" w15:restartNumberingAfterBreak="0">
+  <w:abstractNum w:abstractNumId="35" w15:restartNumberingAfterBreak="0">
     <w:nsid w:val="5D2511B7"/>
     <w:multiLevelType w:val="multilevel"/>
     <w:tmpl w:val="A91AD51A"/>
@@ -10636,7 +10804,7 @@
       </w:rPr>
     </w:lvl>
   </w:abstractNum>
-  <w:abstractNum w:abstractNumId="33" w15:restartNumberingAfterBreak="0">
+  <w:abstractNum w:abstractNumId="36" w15:restartNumberingAfterBreak="0">
     <w:nsid w:val="5E05387A"/>
     <w:multiLevelType w:val="multilevel"/>
     <w:tmpl w:val="A8A2F5CE"/>
@@ -10785,7 +10953,7 @@
       </w:rPr>
     </w:lvl>
   </w:abstractNum>
-  <w:abstractNum w:abstractNumId="34" w15:restartNumberingAfterBreak="0">
+  <w:abstractNum w:abstractNumId="37" w15:restartNumberingAfterBreak="0">
     <w:nsid w:val="5ED310AD"/>
     <w:multiLevelType w:val="multilevel"/>
     <w:tmpl w:val="DC08A6AA"/>
@@ -10934,7 +11102,7 @@
       </w:rPr>
     </w:lvl>
   </w:abstractNum>
-  <w:abstractNum w:abstractNumId="35" w15:restartNumberingAfterBreak="0">
+  <w:abstractNum w:abstractNumId="38" w15:restartNumberingAfterBreak="0">
     <w:nsid w:val="60AF5EEE"/>
     <w:multiLevelType w:val="multilevel"/>
     <w:tmpl w:val="18DC1DD6"/>
@@ -11083,7 +11251,7 @@
       </w:rPr>
     </w:lvl>
   </w:abstractNum>
-  <w:abstractNum w:abstractNumId="36" w15:restartNumberingAfterBreak="0">
+  <w:abstractNum w:abstractNumId="39" w15:restartNumberingAfterBreak="0">
     <w:nsid w:val="651F1419"/>
     <w:multiLevelType w:val="multilevel"/>
     <w:tmpl w:val="9202FBBA"/>
@@ -11232,7 +11400,7 @@
       </w:rPr>
     </w:lvl>
   </w:abstractNum>
-  <w:abstractNum w:abstractNumId="37" w15:restartNumberingAfterBreak="0">
+  <w:abstractNum w:abstractNumId="40" w15:restartNumberingAfterBreak="0">
     <w:nsid w:val="6CB828EA"/>
     <w:multiLevelType w:val="multilevel"/>
     <w:tmpl w:val="8F5EA894"/>
@@ -11345,7 +11513,7 @@
       </w:pPr>
     </w:lvl>
   </w:abstractNum>
-  <w:abstractNum w:abstractNumId="38" w15:restartNumberingAfterBreak="0">
+  <w:abstractNum w:abstractNumId="41" w15:restartNumberingAfterBreak="0">
     <w:nsid w:val="6CC47878"/>
     <w:multiLevelType w:val="multilevel"/>
     <w:tmpl w:val="D24EA430"/>
@@ -11494,7 +11662,7 @@
       </w:rPr>
     </w:lvl>
   </w:abstractNum>
-  <w:abstractNum w:abstractNumId="39" w15:restartNumberingAfterBreak="0">
+  <w:abstractNum w:abstractNumId="42" w15:restartNumberingAfterBreak="0">
     <w:nsid w:val="6DE77D10"/>
     <w:multiLevelType w:val="multilevel"/>
     <w:tmpl w:val="5EAC86DC"/>
@@ -11643,7 +11811,7 @@
       </w:rPr>
     </w:lvl>
   </w:abstractNum>
-  <w:abstractNum w:abstractNumId="40" w15:restartNumberingAfterBreak="0">
+  <w:abstractNum w:abstractNumId="43" w15:restartNumberingAfterBreak="0">
     <w:nsid w:val="6E4806A9"/>
     <w:multiLevelType w:val="multilevel"/>
     <w:tmpl w:val="6E52A132"/>
@@ -11792,7 +11960,7 @@
       </w:rPr>
     </w:lvl>
   </w:abstractNum>
-  <w:abstractNum w:abstractNumId="41" w15:restartNumberingAfterBreak="0">
+  <w:abstractNum w:abstractNumId="44" w15:restartNumberingAfterBreak="0">
     <w:nsid w:val="6EEF073D"/>
     <w:multiLevelType w:val="multilevel"/>
     <w:tmpl w:val="CD98E428"/>
@@ -11941,7 +12109,7 @@
       </w:rPr>
     </w:lvl>
   </w:abstractNum>
-  <w:abstractNum w:abstractNumId="42" w15:restartNumberingAfterBreak="0">
+  <w:abstractNum w:abstractNumId="45" w15:restartNumberingAfterBreak="0">
     <w:nsid w:val="703E4984"/>
     <w:multiLevelType w:val="multilevel"/>
     <w:tmpl w:val="2DD462EA"/>
@@ -12090,7 +12258,7 @@
       </w:rPr>
     </w:lvl>
   </w:abstractNum>
-  <w:abstractNum w:abstractNumId="43" w15:restartNumberingAfterBreak="0">
+  <w:abstractNum w:abstractNumId="46" w15:restartNumberingAfterBreak="0">
     <w:nsid w:val="75A3500F"/>
     <w:multiLevelType w:val="multilevel"/>
     <w:tmpl w:val="22266B46"/>
@@ -12239,7 +12407,7 @@
       </w:rPr>
     </w:lvl>
   </w:abstractNum>
-  <w:abstractNum w:abstractNumId="44" w15:restartNumberingAfterBreak="0">
+  <w:abstractNum w:abstractNumId="47" w15:restartNumberingAfterBreak="0">
     <w:nsid w:val="780A5C20"/>
     <w:multiLevelType w:val="multilevel"/>
     <w:tmpl w:val="0A5A687E"/>
@@ -12388,7 +12556,7 @@
       </w:rPr>
     </w:lvl>
   </w:abstractNum>
-  <w:abstractNum w:abstractNumId="45" w15:restartNumberingAfterBreak="0">
+  <w:abstractNum w:abstractNumId="48" w15:restartNumberingAfterBreak="0">
     <w:nsid w:val="78A640EF"/>
     <w:multiLevelType w:val="multilevel"/>
     <w:tmpl w:val="8520906E"/>
@@ -12537,7 +12705,7 @@
       </w:rPr>
     </w:lvl>
   </w:abstractNum>
-  <w:abstractNum w:abstractNumId="46" w15:restartNumberingAfterBreak="0">
+  <w:abstractNum w:abstractNumId="49" w15:restartNumberingAfterBreak="0">
     <w:nsid w:val="794C2DF2"/>
     <w:multiLevelType w:val="multilevel"/>
     <w:tmpl w:val="C3A4DC72"/>
@@ -12686,14 +12854,14 @@
       </w:rPr>
     </w:lvl>
   </w:abstractNum>
-  <w:abstractNum w:abstractNumId="47" w15:restartNumberingAfterBreak="0">
+  <w:abstractNum w:abstractNumId="50" w15:restartNumberingAfterBreak="0">
     <w:nsid w:val="7AE32F65"/>
     <w:multiLevelType w:val="multilevel"/>
-    <w:tmpl w:val="CABE630C"/>
+    <w:tmpl w:val="3518569E"/>
     <w:lvl w:ilvl="0">
       <w:start w:val="1"/>
-      <w:numFmt w:val="bullet"/>
-      <w:lvlText w:val=""/>
+      <w:numFmt w:val="decimal"/>
+      <w:lvlText w:val="%1."/>
       <w:lvlJc w:val="left"/>
       <w:pPr>
         <w:tabs>
@@ -12702,7 +12870,7 @@
         <w:ind w:left="720" w:hanging="360"/>
       </w:pPr>
       <w:rPr>
-        <w:rFonts w:ascii="Symbol" w:hAnsi="Symbol" w:hint="default"/>
+        <w:rFonts w:hint="default"/>
         <w:sz w:val="20"/>
       </w:rPr>
     </w:lvl>
@@ -12835,7 +13003,7 @@
       </w:rPr>
     </w:lvl>
   </w:abstractNum>
-  <w:abstractNum w:abstractNumId="48" w15:restartNumberingAfterBreak="0">
+  <w:abstractNum w:abstractNumId="51" w15:restartNumberingAfterBreak="0">
     <w:nsid w:val="7B6C3658"/>
     <w:multiLevelType w:val="multilevel"/>
     <w:tmpl w:val="1E2263E8"/>
@@ -12985,85 +13153,85 @@
     </w:lvl>
   </w:abstractNum>
   <w:num w:numId="1" w16cid:durableId="1325621674">
+    <w:abstractNumId w:val="11"/>
+  </w:num>
+  <w:num w:numId="2" w16cid:durableId="322242655">
+    <w:abstractNumId w:val="21"/>
+  </w:num>
+  <w:num w:numId="3" w16cid:durableId="1305702444">
+    <w:abstractNumId w:val="36"/>
+  </w:num>
+  <w:num w:numId="4" w16cid:durableId="287709790">
+    <w:abstractNumId w:val="6"/>
+  </w:num>
+  <w:num w:numId="5" w16cid:durableId="667709929">
+    <w:abstractNumId w:val="37"/>
+  </w:num>
+  <w:num w:numId="6" w16cid:durableId="2056465372">
+    <w:abstractNumId w:val="29"/>
+  </w:num>
+  <w:num w:numId="7" w16cid:durableId="2012173340">
+    <w:abstractNumId w:val="22"/>
+  </w:num>
+  <w:num w:numId="8" w16cid:durableId="431776924">
+    <w:abstractNumId w:val="48"/>
+  </w:num>
+  <w:num w:numId="9" w16cid:durableId="1415011533">
+    <w:abstractNumId w:val="43"/>
+  </w:num>
+  <w:num w:numId="10" w16cid:durableId="1447308499">
+    <w:abstractNumId w:val="40"/>
+  </w:num>
+  <w:num w:numId="11" w16cid:durableId="315112153">
+    <w:abstractNumId w:val="30"/>
+  </w:num>
+  <w:num w:numId="12" w16cid:durableId="1578050218">
+    <w:abstractNumId w:val="49"/>
+  </w:num>
+  <w:num w:numId="13" w16cid:durableId="1549488481">
     <w:abstractNumId w:val="10"/>
   </w:num>
-  <w:num w:numId="2" w16cid:durableId="322242655">
+  <w:num w:numId="14" w16cid:durableId="247733862">
     <w:abstractNumId w:val="19"/>
   </w:num>
-  <w:num w:numId="3" w16cid:durableId="1305702444">
-    <w:abstractNumId w:val="33"/>
-  </w:num>
-  <w:num w:numId="4" w16cid:durableId="287709790">
-    <w:abstractNumId w:val="5"/>
-  </w:num>
-  <w:num w:numId="5" w16cid:durableId="667709929">
-    <w:abstractNumId w:val="34"/>
-  </w:num>
-  <w:num w:numId="6" w16cid:durableId="2056465372">
-    <w:abstractNumId w:val="26"/>
-  </w:num>
-  <w:num w:numId="7" w16cid:durableId="2012173340">
-    <w:abstractNumId w:val="20"/>
-  </w:num>
-  <w:num w:numId="8" w16cid:durableId="431776924">
-    <w:abstractNumId w:val="45"/>
-  </w:num>
-  <w:num w:numId="9" w16cid:durableId="1415011533">
-    <w:abstractNumId w:val="40"/>
-  </w:num>
-  <w:num w:numId="10" w16cid:durableId="1447308499">
-    <w:abstractNumId w:val="37"/>
-  </w:num>
-  <w:num w:numId="11" w16cid:durableId="315112153">
-    <w:abstractNumId w:val="27"/>
-  </w:num>
-  <w:num w:numId="12" w16cid:durableId="1578050218">
-    <w:abstractNumId w:val="46"/>
-  </w:num>
-  <w:num w:numId="13" w16cid:durableId="1549488481">
-    <w:abstractNumId w:val="9"/>
-  </w:num>
-  <w:num w:numId="14" w16cid:durableId="247733862">
-    <w:abstractNumId w:val="17"/>
-  </w:num>
   <w:num w:numId="15" w16cid:durableId="310715573">
-    <w:abstractNumId w:val="29"/>
+    <w:abstractNumId w:val="32"/>
   </w:num>
   <w:num w:numId="16" w16cid:durableId="753471688">
-    <w:abstractNumId w:val="41"/>
+    <w:abstractNumId w:val="44"/>
   </w:num>
   <w:num w:numId="17" w16cid:durableId="1603492957">
     <w:abstractNumId w:val="1"/>
   </w:num>
   <w:num w:numId="18" w16cid:durableId="160198918">
-    <w:abstractNumId w:val="15"/>
+    <w:abstractNumId w:val="16"/>
   </w:num>
   <w:num w:numId="19" w16cid:durableId="1156603540">
-    <w:abstractNumId w:val="21"/>
+    <w:abstractNumId w:val="23"/>
   </w:num>
   <w:num w:numId="20" w16cid:durableId="1384526454">
-    <w:abstractNumId w:val="16"/>
+    <w:abstractNumId w:val="17"/>
   </w:num>
   <w:num w:numId="21" w16cid:durableId="971133004">
-    <w:abstractNumId w:val="13"/>
+    <w:abstractNumId w:val="14"/>
   </w:num>
   <w:num w:numId="22" w16cid:durableId="1666476340">
-    <w:abstractNumId w:val="36"/>
+    <w:abstractNumId w:val="39"/>
   </w:num>
   <w:num w:numId="23" w16cid:durableId="829908897">
-    <w:abstractNumId w:val="24"/>
+    <w:abstractNumId w:val="27"/>
   </w:num>
   <w:num w:numId="24" w16cid:durableId="1124352110">
+    <w:abstractNumId w:val="34"/>
+  </w:num>
+  <w:num w:numId="25" w16cid:durableId="452678666">
+    <w:abstractNumId w:val="50"/>
+  </w:num>
+  <w:num w:numId="26" w16cid:durableId="1955479806">
     <w:abstractNumId w:val="31"/>
   </w:num>
-  <w:num w:numId="25" w16cid:durableId="452678666">
-    <w:abstractNumId w:val="47"/>
-  </w:num>
-  <w:num w:numId="26" w16cid:durableId="1955479806">
-    <w:abstractNumId w:val="28"/>
-  </w:num>
   <w:num w:numId="27" w16cid:durableId="392510527">
-    <w:abstractNumId w:val="7"/>
+    <w:abstractNumId w:val="8"/>
   </w:num>
   <w:num w:numId="28" w16cid:durableId="1766534850">
     <w:abstractNumId w:val="4"/>
@@ -13072,64 +13240,73 @@
     <w:abstractNumId w:val="0"/>
   </w:num>
   <w:num w:numId="30" w16cid:durableId="264119306">
-    <w:abstractNumId w:val="48"/>
+    <w:abstractNumId w:val="51"/>
   </w:num>
   <w:num w:numId="31" w16cid:durableId="1834445477">
-    <w:abstractNumId w:val="32"/>
+    <w:abstractNumId w:val="35"/>
   </w:num>
   <w:num w:numId="32" w16cid:durableId="1187329423">
     <w:abstractNumId w:val="3"/>
   </w:num>
   <w:num w:numId="33" w16cid:durableId="639192228">
+    <w:abstractNumId w:val="41"/>
+  </w:num>
+  <w:num w:numId="34" w16cid:durableId="361517351">
+    <w:abstractNumId w:val="42"/>
+  </w:num>
+  <w:num w:numId="35" w16cid:durableId="1015306836">
+    <w:abstractNumId w:val="7"/>
+  </w:num>
+  <w:num w:numId="36" w16cid:durableId="1485273416">
+    <w:abstractNumId w:val="15"/>
+  </w:num>
+  <w:num w:numId="37" w16cid:durableId="1705015809">
+    <w:abstractNumId w:val="13"/>
+  </w:num>
+  <w:num w:numId="38" w16cid:durableId="223953046">
+    <w:abstractNumId w:val="26"/>
+  </w:num>
+  <w:num w:numId="39" w16cid:durableId="96222898">
+    <w:abstractNumId w:val="45"/>
+  </w:num>
+  <w:num w:numId="40" w16cid:durableId="1537083404">
+    <w:abstractNumId w:val="46"/>
+  </w:num>
+  <w:num w:numId="41" w16cid:durableId="19362145">
     <w:abstractNumId w:val="38"/>
   </w:num>
-  <w:num w:numId="34" w16cid:durableId="361517351">
-    <w:abstractNumId w:val="39"/>
-  </w:num>
-  <w:num w:numId="35" w16cid:durableId="1015306836">
-    <w:abstractNumId w:val="6"/>
-  </w:num>
-  <w:num w:numId="36" w16cid:durableId="1485273416">
-    <w:abstractNumId w:val="14"/>
-  </w:num>
-  <w:num w:numId="37" w16cid:durableId="1705015809">
-    <w:abstractNumId w:val="12"/>
-  </w:num>
-  <w:num w:numId="38" w16cid:durableId="223953046">
-    <w:abstractNumId w:val="23"/>
-  </w:num>
-  <w:num w:numId="39" w16cid:durableId="96222898">
-    <w:abstractNumId w:val="42"/>
-  </w:num>
-  <w:num w:numId="40" w16cid:durableId="1537083404">
-    <w:abstractNumId w:val="43"/>
-  </w:num>
-  <w:num w:numId="41" w16cid:durableId="19362145">
-    <w:abstractNumId w:val="35"/>
-  </w:num>
   <w:num w:numId="42" w16cid:durableId="375547478">
-    <w:abstractNumId w:val="44"/>
+    <w:abstractNumId w:val="47"/>
   </w:num>
   <w:num w:numId="43" w16cid:durableId="341515364">
-    <w:abstractNumId w:val="18"/>
+    <w:abstractNumId w:val="20"/>
   </w:num>
   <w:num w:numId="44" w16cid:durableId="2013995643">
-    <w:abstractNumId w:val="25"/>
+    <w:abstractNumId w:val="28"/>
   </w:num>
   <w:num w:numId="45" w16cid:durableId="1477139037">
-    <w:abstractNumId w:val="8"/>
+    <w:abstractNumId w:val="9"/>
   </w:num>
   <w:num w:numId="46" w16cid:durableId="2046903954">
-    <w:abstractNumId w:val="30"/>
+    <w:abstractNumId w:val="33"/>
   </w:num>
   <w:num w:numId="47" w16cid:durableId="1840659551">
     <w:abstractNumId w:val="2"/>
   </w:num>
   <w:num w:numId="48" w16cid:durableId="1939942646">
-    <w:abstractNumId w:val="22"/>
+    <w:abstractNumId w:val="24"/>
   </w:num>
   <w:num w:numId="49" w16cid:durableId="1145470197">
-    <w:abstractNumId w:val="11"/>
+    <w:abstractNumId w:val="12"/>
+  </w:num>
+  <w:num w:numId="50" w16cid:durableId="1017463475">
+    <w:abstractNumId w:val="5"/>
+  </w:num>
+  <w:num w:numId="51" w16cid:durableId="2118596703">
+    <w:abstractNumId w:val="18"/>
+  </w:num>
+  <w:num w:numId="52" w16cid:durableId="175115888">
+    <w:abstractNumId w:val="25"/>
   </w:num>
 </w:numbering>
 </file>

</xml_diff>